<commit_message>
docs(history): graphics pass 3 merged; v1.3 under way
The graphics pass 3 chapter now covers both look rounds, the code review
fixes (lighter gun shed, visible spare wheel) and the merge at 17:58 UTC,
with the in-game Karoo before|after and the new Skiet-Skuur cards on an
iPhone 14. The look-over-time series and the title page gain the frame
after graphics pass 3. Numbers, requests and what's next are updated
(v1.3 started at 18:00 UTC).

Co-Authored-By: Claude Opus 5.5 <noreply@anthropic.com>
Claude-Session: https://claude.ai/code/session_01X9BKcABj5FscZbGJZnCiA3
</commit_message>
<xml_diff>
--- a/docs/history/Tarantal-Development-History.docx
+++ b/docs/history/Tarantal-Development-History.docx
@@ -113,7 +113,7 @@
           <w:sz w:val="18"/>
           <w:szCs w:val="18"/>
         </w:rPr>
-        <w:t xml:space="preserve">The game on 23 October 2026: a Karoo hunt on a weekday map.</w:t>
+        <w:t xml:space="preserve">The game on 23 October 2026, after graphics pass 3: a Karoo hunt.</w:t>
       </w:r>
     </w:p>
     <w:p>
@@ -141,7 +141,7 @@
           <w:sz w:val="20"/>
           <w:szCs w:val="20"/>
         </w:rPr>
-        <w:t xml:space="preserve">Last updated 23 October 2026, 16:00 UTC</w:t>
+        <w:t xml:space="preserve">Last updated 23 October 2026, 18:10 UTC</w:t>
       </w:r>
     </w:p>
     <w:p>
@@ -470,7 +470,7 @@
                 <w:sz w:val="19"/>
                 <w:szCs w:val="19"/>
               </w:rPr>
-              <w:t xml:space="preserve">497</w:t>
+              <w:t xml:space="preserve">524</w:t>
             </w:r>
           </w:p>
         </w:tc>
@@ -537,7 +537,7 @@
                 <w:sz w:val="19"/>
                 <w:szCs w:val="19"/>
               </w:rPr>
-              <w:t xml:space="preserve">50 opened, 49 merged, 1 in progress</w:t>
+              <w:t xml:space="preserve">51 opened, all merged</w:t>
             </w:r>
           </w:p>
         </w:tc>
@@ -671,7 +671,7 @@
                 <w:sz w:val="19"/>
                 <w:szCs w:val="19"/>
               </w:rPr>
-              <w:t xml:space="preserve">848 unit tests in 93 files, 35 browser test suites on 3 device profiles</w:t>
+              <w:t xml:space="preserve">851 unit tests in 94 files, 35 browser test suites on 3 device profiles</w:t>
             </w:r>
           </w:p>
         </w:tc>
@@ -1681,6 +1681,69 @@
                     </pic:cNvPicPr>
                   </pic:nvPicPr>
                   <pic:blipFill>
+                    <a:blip r:embed="rId16" cstate="none"/>
+                    <a:srcRect/>
+                    <a:stretch>
+                      <a:fillRect/>
+                    </a:stretch>
+                  </pic:blipFill>
+                  <pic:spPr bwMode="auto">
+                    <a:xfrm>
+                      <a:off x="0" y="0"/>
+                      <a:ext cx="6115050" cy="3438525"/>
+                    </a:xfrm>
+                    <a:prstGeom prst="rect">
+                      <a:avLst/>
+                    </a:prstGeom>
+                  </pic:spPr>
+                </pic:pic>
+              </a:graphicData>
+            </a:graphic>
+          </wp:inline>
+        </w:drawing>
+      </w:r>
+    </w:p>
+    <w:p>
+      <w:pPr>
+        <w:spacing w:after="240"/>
+        <w:jc w:val="center"/>
+      </w:pPr>
+      <w:r>
+        <w:rPr>
+          <w:i/>
+          <w:iCs/>
+          <w:color w:val="6B6B6B"/>
+          <w:sz w:val="18"/>
+          <w:szCs w:val="18"/>
+        </w:rPr>
+        <w:t xml:space="preserve">v1.2 (23 Oct): a weekday map (overcast light, the bakkie moved).</w:t>
+      </w:r>
+    </w:p>
+    <w:p>
+      <w:pPr>
+        <w:keepNext/>
+        <w:spacing w:after="60" w:before="160"/>
+        <w:jc w:val="center"/>
+      </w:pPr>
+      <w:r>
+        <w:drawing>
+          <wp:inline distT="0" distB="0" distL="0" distR="0">
+            <wp:extent cx="6115050" cy="3438525"/>
+            <wp:effectExtent t="0" r="0" b="0" l="0"/>
+            <wp:docPr id="1" name="" descr="" title=""/>
+            <wp:cNvGraphicFramePr>
+              <a:graphicFrameLocks xmlns:a="http://schemas.openxmlformats.org/drawingml/2006/main" noChangeAspect="1"/>
+            </wp:cNvGraphicFramePr>
+            <a:graphic xmlns:a="http://schemas.openxmlformats.org/drawingml/2006/main">
+              <a:graphicData uri="http://schemas.openxmlformats.org/drawingml/2006/picture">
+                <pic:pic xmlns:pic="http://schemas.openxmlformats.org/drawingml/2006/picture">
+                  <pic:nvPicPr>
+                    <pic:cNvPr id="0" name="" descr=""/>
+                    <pic:cNvPicPr>
+                      <a:picLocks noChangeAspect="1" noChangeArrowheads="1"/>
+                    </pic:cNvPicPr>
+                  </pic:nvPicPr>
+                  <pic:blipFill>
                     <a:blip r:embed="rId11" cstate="none"/>
                     <a:srcRect/>
                     <a:stretch>
@@ -1716,7 +1779,7 @@
           <w:sz w:val="18"/>
           <w:szCs w:val="18"/>
         </w:rPr>
-        <w:t xml:space="preserve">v1.2 (23 Oct): a weekday map (overcast light, the bakkie moved).</w:t>
+        <w:t xml:space="preserve">Graphics pass 3 (23 Oct): rounded hills, the farmstead whole, semi-realistic guineafowl and gun.</w:t>
       </w:r>
     </w:p>
     <w:p>
@@ -3845,7 +3908,7 @@
                 <w:sz w:val="19"/>
                 <w:szCs w:val="19"/>
               </w:rPr>
-              <w:t xml:space="preserve">started 23 Oct 2026, 11:59</w:t>
+              <w:t xml:space="preserve">23 Oct 2026, 17:58 (started 11:59)</w:t>
             </w:r>
           </w:p>
         </w:tc>
@@ -3907,7 +3970,7 @@
                 <w:sz w:val="19"/>
                 <w:szCs w:val="19"/>
               </w:rPr>
-              <w:t xml:space="preserve">#49 (open)</w:t>
+              <w:t xml:space="preserve">#49</w:t>
             </w:r>
           </w:p>
         </w:tc>
@@ -4190,69 +4253,6 @@
       </w:pPr>
       <w:r>
         <w:t xml:space="preserve">Desktop and phone (Pointer Events, no browser zoom or scrolling).</w:t>
-      </w:r>
-    </w:p>
-    <w:p>
-      <w:pPr>
-        <w:keepNext/>
-        <w:spacing w:after="60" w:before="160"/>
-        <w:jc w:val="center"/>
-      </w:pPr>
-      <w:r>
-        <w:drawing>
-          <wp:inline distT="0" distB="0" distL="0" distR="0">
-            <wp:extent cx="6115050" cy="3438525"/>
-            <wp:effectExtent t="0" r="0" b="0" l="0"/>
-            <wp:docPr id="1" name="" descr="" title=""/>
-            <wp:cNvGraphicFramePr>
-              <a:graphicFrameLocks xmlns:a="http://schemas.openxmlformats.org/drawingml/2006/main" noChangeAspect="1"/>
-            </wp:cNvGraphicFramePr>
-            <a:graphic xmlns:a="http://schemas.openxmlformats.org/drawingml/2006/main">
-              <a:graphicData uri="http://schemas.openxmlformats.org/drawingml/2006/picture">
-                <pic:pic xmlns:pic="http://schemas.openxmlformats.org/drawingml/2006/picture">
-                  <pic:nvPicPr>
-                    <pic:cNvPr id="0" name="" descr=""/>
-                    <pic:cNvPicPr>
-                      <a:picLocks noChangeAspect="1" noChangeArrowheads="1"/>
-                    </pic:cNvPicPr>
-                  </pic:nvPicPr>
-                  <pic:blipFill>
-                    <a:blip r:embed="rId16" cstate="none"/>
-                    <a:srcRect/>
-                    <a:stretch>
-                      <a:fillRect/>
-                    </a:stretch>
-                  </pic:blipFill>
-                  <pic:spPr bwMode="auto">
-                    <a:xfrm>
-                      <a:off x="0" y="0"/>
-                      <a:ext cx="6115050" cy="3438525"/>
-                    </a:xfrm>
-                    <a:prstGeom prst="rect">
-                      <a:avLst/>
-                    </a:prstGeom>
-                  </pic:spPr>
-                </pic:pic>
-              </a:graphicData>
-            </a:graphic>
-          </wp:inline>
-        </w:drawing>
-      </w:r>
-    </w:p>
-    <w:p>
-      <w:pPr>
-        <w:spacing w:after="240"/>
-        <w:jc w:val="center"/>
-      </w:pPr>
-      <w:r>
-        <w:rPr>
-          <w:i/>
-          <w:iCs/>
-          <w:color w:val="6B6B6B"/>
-          <w:sz w:val="18"/>
-          <w:szCs w:val="18"/>
-        </w:rPr>
-        <w:t xml:space="preserve">M2: the start card.</w:t>
       </w:r>
     </w:p>
     <w:p>
@@ -4315,84 +4315,7 @@
           <w:sz w:val="18"/>
           <w:szCs w:val="18"/>
         </w:rPr>
-        <w:t xml:space="preserve">M2: the first playable hunt.</w:t>
-      </w:r>
-    </w:p>
-    <w:p>
-      <w:pPr>
-        <w:pStyle w:val="Heading2"/>
-        <w:keepNext/>
-      </w:pPr>
-      <w:r>
-        <w:t xml:space="preserve">M3 — The Flock</w:t>
-      </w:r>
-    </w:p>
-    <w:p>
-      <w:pPr>
-        <w:spacing w:after="120"/>
-        <w:rPr>
-          <w:color w:val="6B6B6B"/>
-          <w:sz w:val="18"/>
-          <w:szCs w:val="18"/>
-        </w:rPr>
-      </w:pPr>
-      <w:r>
-        <w:rPr>
-          <w:color w:val="6B6B6B"/>
-          <w:sz w:val="18"/>
-          <w:szCs w:val="18"/>
-        </w:rPr>
-        <w:t xml:space="preserve">When: 20 Oct 2026, 13:17   ·   Pull requests: #4   ·   Decision: D-020</w:t>
-      </w:r>
-    </w:p>
-    <w:p>
-      <w:pPr>
-        <w:spacing w:after="120" w:line="276"/>
-      </w:pPr>
-      <w:r>
-        <w:t xml:space="preserve">The signature mechanic: guineafowl behave like a real flock.</w:t>
-      </w:r>
-    </w:p>
-    <w:p>
-      <w:pPr>
-        <w:keepNext/>
-        <w:spacing w:after="80" w:before="160"/>
-      </w:pPr>
-      <w:r>
-        <w:rPr>
-          <w:b/>
-          <w:bCs/>
-          <w:color w:val="B7791F"/>
-          <w:sz w:val="20"/>
-          <w:szCs w:val="20"/>
-        </w:rPr>
-        <w:t xml:space="preserve">What it added</w:t>
-      </w:r>
-    </w:p>
-    <w:p>
-      <w:pPr>
-        <w:pStyle w:val="ListParagraph"/>
-        <w:numPr>
-          <w:ilvl w:val="0"/>
-          <w:numId w:val="2"/>
-        </w:numPr>
-        <w:spacing w:after="60" w:line="264"/>
-      </w:pPr>
-      <w:r>
-        <w:t xml:space="preserve">Forage, then alert, then run, then flush into the air; the flock reacts to shots and misses.</w:t>
-      </w:r>
-    </w:p>
-    <w:p>
-      <w:pPr>
-        <w:pStyle w:val="ListParagraph"/>
-        <w:numPr>
-          <w:ilvl w:val="0"/>
-          <w:numId w:val="2"/>
-        </w:numPr>
-        <w:spacing w:after="60" w:line="264"/>
-      </w:pPr>
-      <w:r>
-        <w:t xml:space="preserve">Juice pass 2: hit feedback, feathers, score pops.</w:t>
+        <w:t xml:space="preserve">M2: the start card.</w:t>
       </w:r>
     </w:p>
     <w:p>
@@ -4455,7 +4378,7 @@
           <w:sz w:val="18"/>
           <w:szCs w:val="18"/>
         </w:rPr>
-        <w:t xml:space="preserve">M3: the first foraging flock, a moment after a shot: "POOF!" and score pops.</w:t>
+        <w:t xml:space="preserve">M2: the first playable hunt.</w:t>
       </w:r>
     </w:p>
     <w:p>
@@ -4464,7 +4387,7 @@
         <w:keepNext/>
       </w:pPr>
       <w:r>
-        <w:t xml:space="preserve">M4 — The Karoo</w:t>
+        <w:t xml:space="preserve">M3 — The Flock</w:t>
       </w:r>
     </w:p>
     <w:p>
@@ -4482,7 +4405,7 @@
           <w:sz w:val="18"/>
           <w:szCs w:val="18"/>
         </w:rPr>
-        <w:t xml:space="preserve">When: 20 Oct 2026, 16:19   ·   Pull requests: #5   ·   Decision: D-021</w:t>
+        <w:t xml:space="preserve">When: 20 Oct 2026, 13:17   ·   Pull requests: #4   ·   Decision: D-020</w:t>
       </w:r>
     </w:p>
     <w:p>
@@ -4490,7 +4413,7 @@
         <w:spacing w:after="120" w:line="276"/>
       </w:pPr>
       <w:r>
-        <w:t xml:space="preserve">The home level, built entirely from content files.</w:t>
+        <w:t xml:space="preserve">The signature mechanic: guineafowl behave like a real flock.</w:t>
       </w:r>
     </w:p>
     <w:p>
@@ -4519,7 +4442,7 @@
         <w:spacing w:after="60" w:line="264"/>
       </w:pPr>
       <w:r>
-        <w:t xml:space="preserve">Secrets to shoot: the windpomp, the spare wheel, the potjie, the fence bell.</w:t>
+        <w:t xml:space="preserve">Forage, then alert, then run, then flush into the air; the flock reacts to shots and misses.</w:t>
       </w:r>
     </w:p>
     <w:p>
@@ -4532,7 +4455,7 @@
         <w:spacing w:after="60" w:line="264"/>
       </w:pPr>
       <w:r>
-        <w:t xml:space="preserve">Events (a hadeda, a crop sprayer you must not hit) and the area’s omen.</w:t>
+        <w:t xml:space="preserve">Juice pass 2: hit feedback, feathers, score pops.</w:t>
       </w:r>
     </w:p>
     <w:p>
@@ -4595,7 +4518,7 @@
           <w:sz w:val="18"/>
           <w:szCs w:val="18"/>
         </w:rPr>
-        <w:t xml:space="preserve">M4: panning right along the Karoo level shows the bakkie, an agave and a bottle to shoot.</w:t>
+        <w:t xml:space="preserve">M3: the first foraging flock, a moment after a shot: "POOF!" and score pops.</w:t>
       </w:r>
     </w:p>
     <w:p>
@@ -4604,7 +4527,7 @@
         <w:keepNext/>
       </w:pPr>
       <w:r>
-        <w:t xml:space="preserve">M5 — Menus, saves and the tutorial</w:t>
+        <w:t xml:space="preserve">M4 — The Karoo</w:t>
       </w:r>
     </w:p>
     <w:p>
@@ -4622,7 +4545,15 @@
           <w:sz w:val="18"/>
           <w:szCs w:val="18"/>
         </w:rPr>
-        <w:t xml:space="preserve">When: 20 Oct 2026, 18:41   ·   Pull requests: #6   ·   Decision: D-022</w:t>
+        <w:t xml:space="preserve">When: 20 Oct 2026, 16:19   ·   Pull requests: #5   ·   Decision: D-021</w:t>
+      </w:r>
+    </w:p>
+    <w:p>
+      <w:pPr>
+        <w:spacing w:after="120" w:line="276"/>
+      </w:pPr>
+      <w:r>
+        <w:t xml:space="preserve">The home level, built entirely from content files.</w:t>
       </w:r>
     </w:p>
     <w:p>
@@ -4651,7 +4582,7 @@
         <w:spacing w:after="60" w:line="264"/>
       </w:pPr>
       <w:r>
-        <w:t xml:space="preserve">Safe saving (works even when the browser blocks storage), the title screen, the Skiet-Skuur (gun shed), settings and pause.</w:t>
+        <w:t xml:space="preserve">Secrets to shoot: the windpomp, the spare wheel, the potjie, the fence bell.</w:t>
       </w:r>
     </w:p>
     <w:p>
@@ -4664,7 +4595,7 @@
         <w:spacing w:after="60" w:line="264"/>
       </w:pPr>
       <w:r>
-        <w:t xml:space="preserve">A first-time tutorial for new players.</w:t>
+        <w:t xml:space="preserve">Events (a hadeda, a crop sprayer you must not hit) and the area’s omen.</w:t>
       </w:r>
     </w:p>
     <w:p>
@@ -4727,16 +4658,7 @@
           <w:sz w:val="18"/>
           <w:szCs w:val="18"/>
         </w:rPr>
-        <w:t xml:space="preserve">M5: the first real title screen, with the Skiet-Skuur and Settings.</w:t>
-      </w:r>
-    </w:p>
-    <w:p>
-      <w:pPr>
-        <w:pStyle w:val="Heading1"/>
-        <w:pageBreakBefore/>
-      </w:pPr>
-      <w:r>
-        <w:t xml:space="preserve">Game modes</w:t>
+        <w:t xml:space="preserve">M4: panning right along the Karoo level shows the bakkie, an agave and a bottle to shoot.</w:t>
       </w:r>
     </w:p>
     <w:p>
@@ -4745,7 +4667,7 @@
         <w:keepNext/>
       </w:pPr>
       <w:r>
-        <w:t xml:space="preserve">M6 — Season Run</w:t>
+        <w:t xml:space="preserve">M5 — Menus, saves and the tutorial</w:t>
       </w:r>
     </w:p>
     <w:p>
@@ -4763,15 +4685,7 @@
           <w:sz w:val="18"/>
           <w:szCs w:val="18"/>
         </w:rPr>
-        <w:t xml:space="preserve">When: 21 Oct 2026, 05:14 and 06:58   ·   Pull requests: #7, #8 (and #9: the playable test build on GitHub Pages)   ·   Decision: D-023</w:t>
-      </w:r>
-    </w:p>
-    <w:p>
-      <w:pPr>
-        <w:spacing w:after="120" w:line="276"/>
-      </w:pPr>
-      <w:r>
-        <w:t xml:space="preserve">A roguelite run through four seasons.</w:t>
+        <w:t xml:space="preserve">When: 20 Oct 2026, 18:41   ·   Pull requests: #6   ·   Decision: D-022</w:t>
       </w:r>
     </w:p>
     <w:p>
@@ -4800,7 +4714,7 @@
         <w:spacing w:after="60" w:line="264"/>
       </w:pPr>
       <w:r>
-        <w:t xml:space="preserve">Quotas per hunt, charms that change the rules, boss hunts and omen hunts.</w:t>
+        <w:t xml:space="preserve">Safe saving (works even when the browser blocks storage), the title screen, the Skiet-Skuur (gun shed), settings and pause.</w:t>
       </w:r>
     </w:p>
     <w:p>
@@ -4813,20 +4727,7 @@
         <w:spacing w:after="60" w:line="264"/>
       </w:pPr>
       <w:r>
-        <w:t xml:space="preserve">The Padstal (farm stall) between hunts to buy charms; save and resume a run.</w:t>
-      </w:r>
-    </w:p>
-    <w:p>
-      <w:pPr>
-        <w:pStyle w:val="ListParagraph"/>
-        <w:numPr>
-          <w:ilvl w:val="0"/>
-          <w:numId w:val="2"/>
-        </w:numPr>
-        <w:spacing w:after="60" w:line="264"/>
-      </w:pPr>
-      <w:r>
-        <w:t xml:space="preserve">From 21 Oct every merge is playable on the GitHub Pages test build.</w:t>
+        <w:t xml:space="preserve">A first-time tutorial for new players.</w:t>
       </w:r>
     </w:p>
     <w:p>
@@ -4889,7 +4790,106 @@
           <w:sz w:val="18"/>
           <w:szCs w:val="18"/>
         </w:rPr>
-        <w:t xml:space="preserve">M6: the card before a Season Run hunt: autumn, hunt 1 of 3, the bag quota.</w:t>
+        <w:t xml:space="preserve">M5: the first real title screen, with the Skiet-Skuur and Settings.</w:t>
+      </w:r>
+    </w:p>
+    <w:p>
+      <w:pPr>
+        <w:pStyle w:val="Heading1"/>
+        <w:pageBreakBefore/>
+      </w:pPr>
+      <w:r>
+        <w:t xml:space="preserve">Game modes</w:t>
+      </w:r>
+    </w:p>
+    <w:p>
+      <w:pPr>
+        <w:pStyle w:val="Heading2"/>
+        <w:keepNext/>
+      </w:pPr>
+      <w:r>
+        <w:t xml:space="preserve">M6 — Season Run</w:t>
+      </w:r>
+    </w:p>
+    <w:p>
+      <w:pPr>
+        <w:spacing w:after="120"/>
+        <w:rPr>
+          <w:color w:val="6B6B6B"/>
+          <w:sz w:val="18"/>
+          <w:szCs w:val="18"/>
+        </w:rPr>
+      </w:pPr>
+      <w:r>
+        <w:rPr>
+          <w:color w:val="6B6B6B"/>
+          <w:sz w:val="18"/>
+          <w:szCs w:val="18"/>
+        </w:rPr>
+        <w:t xml:space="preserve">When: 21 Oct 2026, 05:14 and 06:58   ·   Pull requests: #7, #8 (and #9: the playable test build on GitHub Pages)   ·   Decision: D-023</w:t>
+      </w:r>
+    </w:p>
+    <w:p>
+      <w:pPr>
+        <w:spacing w:after="120" w:line="276"/>
+      </w:pPr>
+      <w:r>
+        <w:t xml:space="preserve">A roguelite run through four seasons.</w:t>
+      </w:r>
+    </w:p>
+    <w:p>
+      <w:pPr>
+        <w:keepNext/>
+        <w:spacing w:after="80" w:before="160"/>
+      </w:pPr>
+      <w:r>
+        <w:rPr>
+          <w:b/>
+          <w:bCs/>
+          <w:color w:val="B7791F"/>
+          <w:sz w:val="20"/>
+          <w:szCs w:val="20"/>
+        </w:rPr>
+        <w:t xml:space="preserve">What it added</w:t>
+      </w:r>
+    </w:p>
+    <w:p>
+      <w:pPr>
+        <w:pStyle w:val="ListParagraph"/>
+        <w:numPr>
+          <w:ilvl w:val="0"/>
+          <w:numId w:val="2"/>
+        </w:numPr>
+        <w:spacing w:after="60" w:line="264"/>
+      </w:pPr>
+      <w:r>
+        <w:t xml:space="preserve">Quotas per hunt, charms that change the rules, boss hunts and omen hunts.</w:t>
+      </w:r>
+    </w:p>
+    <w:p>
+      <w:pPr>
+        <w:pStyle w:val="ListParagraph"/>
+        <w:numPr>
+          <w:ilvl w:val="0"/>
+          <w:numId w:val="2"/>
+        </w:numPr>
+        <w:spacing w:after="60" w:line="264"/>
+      </w:pPr>
+      <w:r>
+        <w:t xml:space="preserve">The Padstal (farm stall) between hunts to buy charms; save and resume a run.</w:t>
+      </w:r>
+    </w:p>
+    <w:p>
+      <w:pPr>
+        <w:pStyle w:val="ListParagraph"/>
+        <w:numPr>
+          <w:ilvl w:val="0"/>
+          <w:numId w:val="2"/>
+        </w:numPr>
+        <w:spacing w:after="60" w:line="264"/>
+      </w:pPr>
+      <w:r>
+        <w:t xml:space="preserve">From 21 Oct every merge is playable on the GitHub Pages test build.</w:t>
       </w:r>
     </w:p>
     <w:p>
@@ -4952,76 +4952,7 @@
           <w:sz w:val="18"/>
           <w:szCs w:val="18"/>
         </w:rPr>
-        <w:t xml:space="preserve">M6: the Padstal between hunts, with four charms on offer.</w:t>
-      </w:r>
-    </w:p>
-    <w:p>
-      <w:pPr>
-        <w:pStyle w:val="Heading2"/>
-        <w:keepNext/>
-      </w:pPr>
-      <w:r>
-        <w:t xml:space="preserve">M7 — Daily Hunt</w:t>
-      </w:r>
-    </w:p>
-    <w:p>
-      <w:pPr>
-        <w:spacing w:after="120"/>
-        <w:rPr>
-          <w:color w:val="6B6B6B"/>
-          <w:sz w:val="18"/>
-          <w:szCs w:val="18"/>
-        </w:rPr>
-      </w:pPr>
-      <w:r>
-        <w:rPr>
-          <w:color w:val="6B6B6B"/>
-          <w:sz w:val="18"/>
-          <w:szCs w:val="18"/>
-        </w:rPr>
-        <w:t xml:space="preserve">When: 21 Oct 2026, 10:27 and 11:08   ·   Pull requests: #10, #11   ·   Decision: D-024</w:t>
-      </w:r>
-    </w:p>
-    <w:p>
-      <w:pPr>
-        <w:keepNext/>
-        <w:spacing w:after="80" w:before="160"/>
-      </w:pPr>
-      <w:r>
-        <w:rPr>
-          <w:b/>
-          <w:bCs/>
-          <w:color w:val="B7791F"/>
-          <w:sz w:val="20"/>
-          <w:szCs w:val="20"/>
-        </w:rPr>
-        <w:t xml:space="preserve">What it added</w:t>
-      </w:r>
-    </w:p>
-    <w:p>
-      <w:pPr>
-        <w:pStyle w:val="ListParagraph"/>
-        <w:numPr>
-          <w:ilvl w:val="0"/>
-          <w:numId w:val="2"/>
-        </w:numPr>
-        <w:spacing w:after="60" w:line="264"/>
-      </w:pPr>
-      <w:r>
-        <w:t xml:space="preserve">The same seeded hunt for everyone each day, with a streak (and a streak freeze).</w:t>
-      </w:r>
-    </w:p>
-    <w:p>
-      <w:pPr>
-        <w:pStyle w:val="ListParagraph"/>
-        <w:numPr>
-          <w:ilvl w:val="0"/>
-          <w:numId w:val="2"/>
-        </w:numPr>
-        <w:spacing w:after="60" w:line="264"/>
-      </w:pPr>
-      <w:r>
-        <w:t xml:space="preserve">A share card and challenge links ("beat this score").</w:t>
+        <w:t xml:space="preserve">M6: the card before a Season Run hunt: autumn, hunt 1 of 3, the bag quota.</w:t>
       </w:r>
     </w:p>
     <w:p>
@@ -5084,7 +5015,76 @@
           <w:sz w:val="18"/>
           <w:szCs w:val="18"/>
         </w:rPr>
-        <w:t xml:space="preserve">M7: the title gains the Daily button and Season Run.</w:t>
+        <w:t xml:space="preserve">M6: the Padstal between hunts, with four charms on offer.</w:t>
+      </w:r>
+    </w:p>
+    <w:p>
+      <w:pPr>
+        <w:pStyle w:val="Heading2"/>
+        <w:keepNext/>
+      </w:pPr>
+      <w:r>
+        <w:t xml:space="preserve">M7 — Daily Hunt</w:t>
+      </w:r>
+    </w:p>
+    <w:p>
+      <w:pPr>
+        <w:spacing w:after="120"/>
+        <w:rPr>
+          <w:color w:val="6B6B6B"/>
+          <w:sz w:val="18"/>
+          <w:szCs w:val="18"/>
+        </w:rPr>
+      </w:pPr>
+      <w:r>
+        <w:rPr>
+          <w:color w:val="6B6B6B"/>
+          <w:sz w:val="18"/>
+          <w:szCs w:val="18"/>
+        </w:rPr>
+        <w:t xml:space="preserve">When: 21 Oct 2026, 10:27 and 11:08   ·   Pull requests: #10, #11   ·   Decision: D-024</w:t>
+      </w:r>
+    </w:p>
+    <w:p>
+      <w:pPr>
+        <w:keepNext/>
+        <w:spacing w:after="80" w:before="160"/>
+      </w:pPr>
+      <w:r>
+        <w:rPr>
+          <w:b/>
+          <w:bCs/>
+          <w:color w:val="B7791F"/>
+          <w:sz w:val="20"/>
+          <w:szCs w:val="20"/>
+        </w:rPr>
+        <w:t xml:space="preserve">What it added</w:t>
+      </w:r>
+    </w:p>
+    <w:p>
+      <w:pPr>
+        <w:pStyle w:val="ListParagraph"/>
+        <w:numPr>
+          <w:ilvl w:val="0"/>
+          <w:numId w:val="2"/>
+        </w:numPr>
+        <w:spacing w:after="60" w:line="264"/>
+      </w:pPr>
+      <w:r>
+        <w:t xml:space="preserve">The same seeded hunt for everyone each day, with a streak (and a streak freeze).</w:t>
+      </w:r>
+    </w:p>
+    <w:p>
+      <w:pPr>
+        <w:pStyle w:val="ListParagraph"/>
+        <w:numPr>
+          <w:ilvl w:val="0"/>
+          <w:numId w:val="2"/>
+        </w:numPr>
+        <w:spacing w:after="60" w:line="264"/>
+      </w:pPr>
+      <w:r>
+        <w:t xml:space="preserve">A share card and challenge links ("beat this score").</w:t>
       </w:r>
     </w:p>
     <w:p>
@@ -5147,124 +5147,7 @@
           <w:sz w:val="18"/>
           <w:szCs w:val="18"/>
         </w:rPr>
-        <w:t xml:space="preserve">M7: a Daily Hunt, with its tag and the wind sock.</w:t>
-      </w:r>
-    </w:p>
-    <w:p>
-      <w:pPr>
-        <w:pStyle w:val="Heading1"/>
-        <w:pageBreakBefore/>
-      </w:pPr>
-      <w:r>
-        <w:t xml:space="preserve">Content and platform</w:t>
-      </w:r>
-    </w:p>
-    <w:p>
-      <w:pPr>
-        <w:pStyle w:val="Heading2"/>
-        <w:keepNext/>
-      </w:pPr>
-      <w:r>
-        <w:t xml:space="preserve">M8 — Three more areas and the arsenal</w:t>
-      </w:r>
-    </w:p>
-    <w:p>
-      <w:pPr>
-        <w:spacing w:after="120"/>
-        <w:rPr>
-          <w:color w:val="6B6B6B"/>
-          <w:sz w:val="18"/>
-          <w:szCs w:val="18"/>
-        </w:rPr>
-      </w:pPr>
-      <w:r>
-        <w:rPr>
-          <w:color w:val="6B6B6B"/>
-          <w:sz w:val="18"/>
-          <w:szCs w:val="18"/>
-        </w:rPr>
-        <w:t xml:space="preserve">When: 21 Oct 2026, 14:05–17:04   ·   Pull requests: #12–#16   ·   Decision: D-025</w:t>
-      </w:r>
-    </w:p>
-    <w:p>
-      <w:pPr>
-        <w:keepNext/>
-        <w:spacing w:after="80" w:before="160"/>
-      </w:pPr>
-      <w:r>
-        <w:rPr>
-          <w:b/>
-          <w:bCs/>
-          <w:color w:val="B7791F"/>
-          <w:sz w:val="20"/>
-          <w:szCs w:val="20"/>
-        </w:rPr>
-        <w:t xml:space="preserve">What it added</w:t>
-      </w:r>
-    </w:p>
-    <w:p>
-      <w:pPr>
-        <w:pStyle w:val="ListParagraph"/>
-        <w:numPr>
-          <w:ilvl w:val="0"/>
-          <w:numId w:val="2"/>
-        </w:numPr>
-        <w:spacing w:after="60" w:line="264"/>
-      </w:pPr>
-      <w:r>
-        <w:t xml:space="preserve">New guns: the Kettie (catapult, stones fly a moment before they land), the Plaas-Pomp and the Windbuks.</w:t>
-      </w:r>
-    </w:p>
-    <w:p>
-      <w:pPr>
-        <w:pStyle w:val="ListParagraph"/>
-        <w:numPr>
-          <w:ilvl w:val="0"/>
-          <w:numId w:val="2"/>
-        </w:numPr>
-        <w:spacing w:after="60" w:line="264"/>
-      </w:pPr>
-      <w:r>
-        <w:t xml:space="preserve">Winter in the Bushveld: running flocks, dassie and boulder secrets, the boss Ou Grys, winter glare.</w:t>
-      </w:r>
-    </w:p>
-    <w:p>
-      <w:pPr>
-        <w:pStyle w:val="ListParagraph"/>
-        <w:numPr>
-          <w:ilvl w:val="0"/>
-          <w:numId w:val="2"/>
-        </w:numPr>
-        <w:spacing w:after="60" w:line="264"/>
-      </w:pPr>
-      <w:r>
-        <w:t xml:space="preserve">Spring in the Okavango: splashing water, sun-showers, crested guineafowl hopping out of the reeds, the boss Kuifkop Koning.</w:t>
-      </w:r>
-    </w:p>
-    <w:p>
-      <w:pPr>
-        <w:pStyle w:val="ListParagraph"/>
-        <w:numPr>
-          <w:ilvl w:val="0"/>
-          <w:numId w:val="2"/>
-        </w:numPr>
-        <w:spacing w:after="60" w:line="264"/>
-      </w:pPr>
-      <w:r>
-        <w:t xml:space="preserve">Summer in the Kalahari: heat haze turning into a storm, lightning, Die Stormvoël, a weaver nest.</w:t>
-      </w:r>
-    </w:p>
-    <w:p>
-      <w:pPr>
-        <w:pStyle w:val="ListParagraph"/>
-        <w:numPr>
-          <w:ilvl w:val="0"/>
-          <w:numId w:val="2"/>
-        </w:numPr>
-        <w:spacing w:after="60" w:line="264"/>
-      </w:pPr>
-      <w:r>
-        <w:t xml:space="preserve">The Season Run now travels through all four real seasons.</w:t>
+        <w:t xml:space="preserve">M7: the title gains the Daily button and Season Run.</w:t>
       </w:r>
     </w:p>
     <w:p>
@@ -5327,7 +5210,124 @@
           <w:sz w:val="18"/>
           <w:szCs w:val="18"/>
         </w:rPr>
-        <w:t xml:space="preserve">M8: winter in the Bushveld (placeholder art).</w:t>
+        <w:t xml:space="preserve">M7: a Daily Hunt, with its tag and the wind sock.</w:t>
+      </w:r>
+    </w:p>
+    <w:p>
+      <w:pPr>
+        <w:pStyle w:val="Heading1"/>
+        <w:pageBreakBefore/>
+      </w:pPr>
+      <w:r>
+        <w:t xml:space="preserve">Content and platform</w:t>
+      </w:r>
+    </w:p>
+    <w:p>
+      <w:pPr>
+        <w:pStyle w:val="Heading2"/>
+        <w:keepNext/>
+      </w:pPr>
+      <w:r>
+        <w:t xml:space="preserve">M8 — Three more areas and the arsenal</w:t>
+      </w:r>
+    </w:p>
+    <w:p>
+      <w:pPr>
+        <w:spacing w:after="120"/>
+        <w:rPr>
+          <w:color w:val="6B6B6B"/>
+          <w:sz w:val="18"/>
+          <w:szCs w:val="18"/>
+        </w:rPr>
+      </w:pPr>
+      <w:r>
+        <w:rPr>
+          <w:color w:val="6B6B6B"/>
+          <w:sz w:val="18"/>
+          <w:szCs w:val="18"/>
+        </w:rPr>
+        <w:t xml:space="preserve">When: 21 Oct 2026, 14:05–17:04   ·   Pull requests: #12–#16   ·   Decision: D-025</w:t>
+      </w:r>
+    </w:p>
+    <w:p>
+      <w:pPr>
+        <w:keepNext/>
+        <w:spacing w:after="80" w:before="160"/>
+      </w:pPr>
+      <w:r>
+        <w:rPr>
+          <w:b/>
+          <w:bCs/>
+          <w:color w:val="B7791F"/>
+          <w:sz w:val="20"/>
+          <w:szCs w:val="20"/>
+        </w:rPr>
+        <w:t xml:space="preserve">What it added</w:t>
+      </w:r>
+    </w:p>
+    <w:p>
+      <w:pPr>
+        <w:pStyle w:val="ListParagraph"/>
+        <w:numPr>
+          <w:ilvl w:val="0"/>
+          <w:numId w:val="2"/>
+        </w:numPr>
+        <w:spacing w:after="60" w:line="264"/>
+      </w:pPr>
+      <w:r>
+        <w:t xml:space="preserve">New guns: the Kettie (catapult, stones fly a moment before they land), the Plaas-Pomp and the Windbuks.</w:t>
+      </w:r>
+    </w:p>
+    <w:p>
+      <w:pPr>
+        <w:pStyle w:val="ListParagraph"/>
+        <w:numPr>
+          <w:ilvl w:val="0"/>
+          <w:numId w:val="2"/>
+        </w:numPr>
+        <w:spacing w:after="60" w:line="264"/>
+      </w:pPr>
+      <w:r>
+        <w:t xml:space="preserve">Winter in the Bushveld: running flocks, dassie and boulder secrets, the boss Ou Grys, winter glare.</w:t>
+      </w:r>
+    </w:p>
+    <w:p>
+      <w:pPr>
+        <w:pStyle w:val="ListParagraph"/>
+        <w:numPr>
+          <w:ilvl w:val="0"/>
+          <w:numId w:val="2"/>
+        </w:numPr>
+        <w:spacing w:after="60" w:line="264"/>
+      </w:pPr>
+      <w:r>
+        <w:t xml:space="preserve">Spring in the Okavango: splashing water, sun-showers, crested guineafowl hopping out of the reeds, the boss Kuifkop Koning.</w:t>
+      </w:r>
+    </w:p>
+    <w:p>
+      <w:pPr>
+        <w:pStyle w:val="ListParagraph"/>
+        <w:numPr>
+          <w:ilvl w:val="0"/>
+          <w:numId w:val="2"/>
+        </w:numPr>
+        <w:spacing w:after="60" w:line="264"/>
+      </w:pPr>
+      <w:r>
+        <w:t xml:space="preserve">Summer in the Kalahari: heat haze turning into a storm, lightning, Die Stormvoël, a weaver nest.</w:t>
+      </w:r>
+    </w:p>
+    <w:p>
+      <w:pPr>
+        <w:pStyle w:val="ListParagraph"/>
+        <w:numPr>
+          <w:ilvl w:val="0"/>
+          <w:numId w:val="2"/>
+        </w:numPr>
+        <w:spacing w:after="60" w:line="264"/>
+      </w:pPr>
+      <w:r>
+        <w:t xml:space="preserve">The Season Run now travels through all four real seasons.</w:t>
       </w:r>
     </w:p>
     <w:p>
@@ -5390,7 +5390,7 @@
           <w:sz w:val="18"/>
           <w:szCs w:val="18"/>
         </w:rPr>
-        <w:t xml:space="preserve">M8: spring in the Okavango (placeholder art).</w:t>
+        <w:t xml:space="preserve">M8: winter in the Bushveld (placeholder art).</w:t>
       </w:r>
     </w:p>
     <w:p>
@@ -5453,102 +5453,7 @@
           <w:sz w:val="18"/>
           <w:szCs w:val="18"/>
         </w:rPr>
-        <w:t xml:space="preserve">M8: summer in the Kalahari (placeholder art).</w:t>
-      </w:r>
-    </w:p>
-    <w:p>
-      <w:pPr>
-        <w:pStyle w:val="Heading2"/>
-        <w:keepNext/>
-      </w:pPr>
-      <w:r>
-        <w:t xml:space="preserve">M9 — Platform, speed, accessibility, languages</w:t>
-      </w:r>
-    </w:p>
-    <w:p>
-      <w:pPr>
-        <w:spacing w:after="120"/>
-        <w:rPr>
-          <w:color w:val="6B6B6B"/>
-          <w:sz w:val="18"/>
-          <w:szCs w:val="18"/>
-        </w:rPr>
-      </w:pPr>
-      <w:r>
-        <w:rPr>
-          <w:color w:val="6B6B6B"/>
-          <w:sz w:val="18"/>
-          <w:szCs w:val="18"/>
-        </w:rPr>
-        <w:t xml:space="preserve">When: 21 Oct 2026, 20:30–21:31   ·   Pull requests: #17–#21   ·   Decision: D-026</w:t>
-      </w:r>
-    </w:p>
-    <w:p>
-      <w:pPr>
-        <w:keepNext/>
-        <w:spacing w:after="80" w:before="160"/>
-      </w:pPr>
-      <w:r>
-        <w:rPr>
-          <w:b/>
-          <w:bCs/>
-          <w:color w:val="B7791F"/>
-          <w:sz w:val="20"/>
-          <w:szCs w:val="20"/>
-        </w:rPr>
-        <w:t xml:space="preserve">What it added</w:t>
-      </w:r>
-    </w:p>
-    <w:p>
-      <w:pPr>
-        <w:pStyle w:val="ListParagraph"/>
-        <w:numPr>
-          <w:ilvl w:val="0"/>
-          <w:numId w:val="2"/>
-        </w:numPr>
-        <w:spacing w:after="60" w:line="264"/>
-      </w:pPr>
-      <w:r>
-        <w:t xml:space="preserve">Builds for the web, Poki and CrazyGames; ads only between hunts, a rewarded retry, a privacy screen.</w:t>
-      </w:r>
-    </w:p>
-    <w:p>
-      <w:pPr>
-        <w:pStyle w:val="ListParagraph"/>
-        <w:numPr>
-          <w:ilvl w:val="0"/>
-          <w:numId w:val="2"/>
-        </w:numPr>
-        <w:spacing w:after="60" w:line="264"/>
-      </w:pPr>
-      <w:r>
-        <w:t xml:space="preserve">Quality tiers for slower phones, areas downloaded only when needed, a size budget enforced by the tests.</w:t>
-      </w:r>
-    </w:p>
-    <w:p>
-      <w:pPr>
-        <w:pStyle w:val="ListParagraph"/>
-        <w:numPr>
-          <w:ilvl w:val="0"/>
-          <w:numId w:val="2"/>
-        </w:numPr>
-        <w:spacing w:after="60" w:line="264"/>
-      </w:pPr>
-      <w:r>
-        <w:t xml:space="preserve">Accessibility checklist; German and Dutch translations; Afrikaans complete.</w:t>
-      </w:r>
-    </w:p>
-    <w:p>
-      <w:pPr>
-        <w:pStyle w:val="ListParagraph"/>
-        <w:numPr>
-          <w:ilvl w:val="0"/>
-          <w:numId w:val="2"/>
-        </w:numPr>
-        <w:spacing w:after="60" w:line="264"/>
-      </w:pPr>
-      <w:r>
-        <w:t xml:space="preserve">Touch aim assist that rescues a near miss instead of widening every shot.</w:t>
+        <w:t xml:space="preserve">M8: spring in the Okavango (placeholder art).</w:t>
       </w:r>
     </w:p>
     <w:p>
@@ -5611,16 +5516,7 @@
           <w:sz w:val="18"/>
           <w:szCs w:val="18"/>
         </w:rPr>
-        <w:t xml:space="preserve">M9: the quality tiers add a vignette and colour grade.</w:t>
-      </w:r>
-    </w:p>
-    <w:p>
-      <w:pPr>
-        <w:pStyle w:val="Heading1"/>
-        <w:pageBreakBefore/>
-      </w:pPr>
-      <w:r>
-        <w:t xml:space="preserve">Version 1.0</w:t>
+        <w:t xml:space="preserve">M8: summer in the Kalahari (placeholder art).</w:t>
       </w:r>
     </w:p>
     <w:p>
@@ -5629,7 +5525,7 @@
         <w:keepNext/>
       </w:pPr>
       <w:r>
-        <w:t xml:space="preserve">M10 — v1.0.0, ready for a soft launch</w:t>
+        <w:t xml:space="preserve">M9 — Platform, speed, accessibility, languages</w:t>
       </w:r>
     </w:p>
     <w:p>
@@ -5647,7 +5543,7 @@
           <w:sz w:val="18"/>
           <w:szCs w:val="18"/>
         </w:rPr>
-        <w:t xml:space="preserve">When: 22 Oct 2026, 01:25   ·   Pull requests: #22–#29   ·   Decision: D-027</w:t>
+        <w:t xml:space="preserve">When: 21 Oct 2026, 20:30–21:31   ·   Pull requests: #17–#21   ·   Decision: D-026</w:t>
       </w:r>
     </w:p>
     <w:p>
@@ -5676,7 +5572,7 @@
         <w:spacing w:after="60" w:line="264"/>
       </w:pPr>
       <w:r>
-        <w:t xml:space="preserve">An asset pipeline with one switch between final and placeholder art; an audit of every asset.</w:t>
+        <w:t xml:space="preserve">Builds for the web, Poki and CrazyGames; ads only between hunts, a rewarded retry, a privacy screen.</w:t>
       </w:r>
     </w:p>
     <w:p>
@@ -5689,7 +5585,7 @@
         <w:spacing w:after="60" w:line="264"/>
       </w:pPr>
       <w:r>
-        <w:t xml:space="preserve">Recorded audio with a fallback, music and ambience per area; a juice pass on the tally and the Stampede.</w:t>
+        <w:t xml:space="preserve">Quality tiers for slower phones, areas downloaded only when needed, a size budget enforced by the tests.</w:t>
       </w:r>
     </w:p>
     <w:p>
@@ -5702,7 +5598,20 @@
         <w:spacing w:after="60" w:line="264"/>
       </w:pPr>
       <w:r>
-        <w:t xml:space="preserve">A capture mode for trailers, self-hosted fonts, visual regression tests, and the portal submission kit.</w:t>
+        <w:t xml:space="preserve">Accessibility checklist; German and Dutch translations; Afrikaans complete.</w:t>
+      </w:r>
+    </w:p>
+    <w:p>
+      <w:pPr>
+        <w:pStyle w:val="ListParagraph"/>
+        <w:numPr>
+          <w:ilvl w:val="0"/>
+          <w:numId w:val="2"/>
+        </w:numPr>
+        <w:spacing w:after="60" w:line="264"/>
+      </w:pPr>
+      <w:r>
+        <w:t xml:space="preserve">Touch aim assist that rescues a near miss instead of widening every shot.</w:t>
       </w:r>
     </w:p>
     <w:p>
@@ -5765,7 +5674,98 @@
           <w:sz w:val="18"/>
           <w:szCs w:val="18"/>
         </w:rPr>
-        <w:t xml:space="preserve">v1.0.0: the title screen (visual test baseline).</w:t>
+        <w:t xml:space="preserve">M9: the quality tiers add a vignette and colour grade.</w:t>
+      </w:r>
+    </w:p>
+    <w:p>
+      <w:pPr>
+        <w:pStyle w:val="Heading1"/>
+        <w:pageBreakBefore/>
+      </w:pPr>
+      <w:r>
+        <w:t xml:space="preserve">Version 1.0</w:t>
+      </w:r>
+    </w:p>
+    <w:p>
+      <w:pPr>
+        <w:pStyle w:val="Heading2"/>
+        <w:keepNext/>
+      </w:pPr>
+      <w:r>
+        <w:t xml:space="preserve">M10 — v1.0.0, ready for a soft launch</w:t>
+      </w:r>
+    </w:p>
+    <w:p>
+      <w:pPr>
+        <w:spacing w:after="120"/>
+        <w:rPr>
+          <w:color w:val="6B6B6B"/>
+          <w:sz w:val="18"/>
+          <w:szCs w:val="18"/>
+        </w:rPr>
+      </w:pPr>
+      <w:r>
+        <w:rPr>
+          <w:color w:val="6B6B6B"/>
+          <w:sz w:val="18"/>
+          <w:szCs w:val="18"/>
+        </w:rPr>
+        <w:t xml:space="preserve">When: 22 Oct 2026, 01:25   ·   Pull requests: #22–#29   ·   Decision: D-027</w:t>
+      </w:r>
+    </w:p>
+    <w:p>
+      <w:pPr>
+        <w:keepNext/>
+        <w:spacing w:after="80" w:before="160"/>
+      </w:pPr>
+      <w:r>
+        <w:rPr>
+          <w:b/>
+          <w:bCs/>
+          <w:color w:val="B7791F"/>
+          <w:sz w:val="20"/>
+          <w:szCs w:val="20"/>
+        </w:rPr>
+        <w:t xml:space="preserve">What it added</w:t>
+      </w:r>
+    </w:p>
+    <w:p>
+      <w:pPr>
+        <w:pStyle w:val="ListParagraph"/>
+        <w:numPr>
+          <w:ilvl w:val="0"/>
+          <w:numId w:val="2"/>
+        </w:numPr>
+        <w:spacing w:after="60" w:line="264"/>
+      </w:pPr>
+      <w:r>
+        <w:t xml:space="preserve">An asset pipeline with one switch between final and placeholder art; an audit of every asset.</w:t>
+      </w:r>
+    </w:p>
+    <w:p>
+      <w:pPr>
+        <w:pStyle w:val="ListParagraph"/>
+        <w:numPr>
+          <w:ilvl w:val="0"/>
+          <w:numId w:val="2"/>
+        </w:numPr>
+        <w:spacing w:after="60" w:line="264"/>
+      </w:pPr>
+      <w:r>
+        <w:t xml:space="preserve">Recorded audio with a fallback, music and ambience per area; a juice pass on the tally and the Stampede.</w:t>
+      </w:r>
+    </w:p>
+    <w:p>
+      <w:pPr>
+        <w:pStyle w:val="ListParagraph"/>
+        <w:numPr>
+          <w:ilvl w:val="0"/>
+          <w:numId w:val="2"/>
+        </w:numPr>
+        <w:spacing w:after="60" w:line="264"/>
+      </w:pPr>
+      <w:r>
+        <w:t xml:space="preserve">A capture mode for trailers, self-hosted fonts, visual regression tests, and the portal submission kit.</w:t>
       </w:r>
     </w:p>
     <w:p>
@@ -5777,7 +5777,7 @@
       <w:r>
         <w:drawing>
           <wp:inline distT="0" distB="0" distL="0" distR="0">
-            <wp:extent cx="6115050" cy="2819400"/>
+            <wp:extent cx="6115050" cy="3438525"/>
             <wp:effectExtent t="0" r="0" b="0" l="0"/>
             <wp:docPr id="1" name="" descr="" title=""/>
             <wp:cNvGraphicFramePr>
@@ -5802,7 +5802,7 @@
                   <pic:spPr bwMode="auto">
                     <a:xfrm>
                       <a:off x="0" y="0"/>
-                      <a:ext cx="6115050" cy="2819400"/>
+                      <a:ext cx="6115050" cy="3438525"/>
                     </a:xfrm>
                     <a:prstGeom prst="rect">
                       <a:avLst/>
@@ -5828,303 +5828,7 @@
           <w:sz w:val="18"/>
           <w:szCs w:val="18"/>
         </w:rPr>
-        <w:t xml:space="preserve">v1.0.0 on an iPhone-sized screen.</w:t>
-      </w:r>
-    </w:p>
-    <w:p>
-      <w:pPr>
-        <w:pStyle w:val="Heading2"/>
-        <w:keepNext/>
-      </w:pPr>
-      <w:r>
-        <w:t xml:space="preserve">v1.0.1 — Clean-up</w:t>
-      </w:r>
-    </w:p>
-    <w:p>
-      <w:pPr>
-        <w:spacing w:after="120"/>
-        <w:rPr>
-          <w:color w:val="6B6B6B"/>
-          <w:sz w:val="18"/>
-          <w:szCs w:val="18"/>
-        </w:rPr>
-      </w:pPr>
-      <w:r>
-        <w:rPr>
-          <w:color w:val="6B6B6B"/>
-          <w:sz w:val="18"/>
-          <w:szCs w:val="18"/>
-        </w:rPr>
-        <w:t xml:space="preserve">When: 22 Oct 2026, 08:34–14:19   ·   Pull requests: #30, #31, #33, #34, #37, #38   ·   Decision: D-028</w:t>
-      </w:r>
-    </w:p>
-    <w:p>
-      <w:pPr>
-        <w:keepNext/>
-        <w:spacing w:after="80" w:before="160"/>
-      </w:pPr>
-      <w:r>
-        <w:rPr>
-          <w:b/>
-          <w:bCs/>
-          <w:color w:val="B7791F"/>
-          <w:sz w:val="20"/>
-          <w:szCs w:val="20"/>
-        </w:rPr>
-        <w:t xml:space="preserve">What it added</w:t>
-      </w:r>
-    </w:p>
-    <w:p>
-      <w:pPr>
-        <w:pStyle w:val="ListParagraph"/>
-        <w:numPr>
-          <w:ilvl w:val="0"/>
-          <w:numId w:val="2"/>
-        </w:numPr>
-        <w:spacing w:after="60" w:line="264"/>
-      </w:pPr>
-      <w:r>
-        <w:t xml:space="preserve">The public build keeps the Daily unranked until launch; the Daily start date is one content value.</w:t>
-      </w:r>
-    </w:p>
-    <w:p>
-      <w:pPr>
-        <w:pStyle w:val="ListParagraph"/>
-        <w:numPr>
-          <w:ilvl w:val="0"/>
-          <w:numId w:val="2"/>
-        </w:numPr>
-        <w:spacing w:after="60" w:line="264"/>
-      </w:pPr>
-      <w:r>
-        <w:t xml:space="preserve">Faster score pops; a key hint in capture mode.</w:t>
-      </w:r>
-    </w:p>
-    <w:p>
-      <w:pPr>
-        <w:pStyle w:val="ListParagraph"/>
-        <w:numPr>
-          <w:ilvl w:val="0"/>
-          <w:numId w:val="2"/>
-        </w:numPr>
-        <w:spacing w:after="60" w:line="264"/>
-      </w:pPr>
-      <w:r>
-        <w:t xml:space="preserve">Oupa’s barks: 43 lines as text now, voice later.</w:t>
-      </w:r>
-    </w:p>
-    <w:p>
-      <w:pPr>
-        <w:pStyle w:val="ListParagraph"/>
-        <w:numPr>
-          <w:ilvl w:val="0"/>
-          <w:numId w:val="2"/>
-        </w:numPr>
-        <w:spacing w:after="60" w:line="264"/>
-      </w:pPr>
-      <w:r>
-        <w:t xml:space="preserve">A balance check across all modes (no changes needed).</w:t>
-      </w:r>
-    </w:p>
-    <w:p>
-      <w:pPr>
-        <w:pStyle w:val="Heading2"/>
-        <w:keepNext/>
-      </w:pPr>
-      <w:r>
-        <w:t xml:space="preserve">Faster delivery</w:t>
-      </w:r>
-    </w:p>
-    <w:p>
-      <w:pPr>
-        <w:spacing w:after="120"/>
-        <w:rPr>
-          <w:color w:val="6B6B6B"/>
-          <w:sz w:val="18"/>
-          <w:szCs w:val="18"/>
-        </w:rPr>
-      </w:pPr>
-      <w:r>
-        <w:rPr>
-          <w:color w:val="6B6B6B"/>
-          <w:sz w:val="18"/>
-          <w:szCs w:val="18"/>
-        </w:rPr>
-        <w:t xml:space="preserve">When: 22 Oct 2026, 16:04   ·   Pull requests: #39   ·   Decision: D-030</w:t>
-      </w:r>
-    </w:p>
-    <w:p>
-      <w:pPr>
-        <w:spacing w:after="120" w:line="276"/>
-      </w:pPr>
-      <w:r>
-        <w:t xml:space="preserve">The product owner found the build loop too slow. Tests on a pull request went from about 48 minutes to about 15.</w:t>
-      </w:r>
-    </w:p>
-    <w:p>
-      <w:pPr>
-        <w:keepNext/>
-        <w:spacing w:after="80" w:before="160"/>
-      </w:pPr>
-      <w:r>
-        <w:rPr>
-          <w:b/>
-          <w:bCs/>
-          <w:color w:val="B7791F"/>
-          <w:sz w:val="20"/>
-          <w:szCs w:val="20"/>
-        </w:rPr>
-        <w:t xml:space="preserve">What it added</w:t>
-      </w:r>
-    </w:p>
-    <w:p>
-      <w:pPr>
-        <w:pStyle w:val="ListParagraph"/>
-        <w:numPr>
-          <w:ilvl w:val="0"/>
-          <w:numId w:val="2"/>
-        </w:numPr>
-        <w:spacing w:after="60" w:line="264"/>
-      </w:pPr>
-      <w:r>
-        <w:t xml:space="preserve">A quick test lane on pull requests and the full suite on every merge to main.</w:t>
-      </w:r>
-    </w:p>
-    <w:p>
-      <w:pPr>
-        <w:pStyle w:val="ListParagraph"/>
-        <w:numPr>
-          <w:ilvl w:val="0"/>
-          <w:numId w:val="2"/>
-        </w:numPr>
-        <w:spacing w:after="60" w:line="264"/>
-      </w:pPr>
-      <w:r>
-        <w:t xml:space="preserve">Tests run inside the official Playwright image (installing browsers had cost up to 22 minutes per job).</w:t>
-      </w:r>
-    </w:p>
-    <w:p>
-      <w:pPr>
-        <w:pStyle w:val="ListParagraph"/>
-        <w:numPr>
-          <w:ilvl w:val="0"/>
-          <w:numId w:val="2"/>
-        </w:numPr>
-        <w:spacing w:after="60" w:line="264"/>
-      </w:pPr>
-      <w:r>
-        <w:t xml:space="preserve">Working rules: one or two pull requests per job, check-ins every 20 minutes, and a stalled agent turn is restarted at once.</w:t>
-      </w:r>
-    </w:p>
-    <w:p>
-      <w:pPr>
-        <w:pStyle w:val="Heading1"/>
-        <w:pageBreakBefore/>
-      </w:pPr>
-      <w:r>
-        <w:t xml:space="preserve">The look</w:t>
-      </w:r>
-    </w:p>
-    <w:p>
-      <w:pPr>
-        <w:pStyle w:val="Heading2"/>
-        <w:keepNext/>
-      </w:pPr>
-      <w:r>
-        <w:t xml:space="preserve">Graphics pass 1 — detailed guns and guineafowl</w:t>
-      </w:r>
-    </w:p>
-    <w:p>
-      <w:pPr>
-        <w:spacing w:after="120"/>
-        <w:rPr>
-          <w:color w:val="6B6B6B"/>
-          <w:sz w:val="18"/>
-          <w:szCs w:val="18"/>
-        </w:rPr>
-      </w:pPr>
-      <w:r>
-        <w:rPr>
-          <w:color w:val="6B6B6B"/>
-          <w:sz w:val="18"/>
-          <w:szCs w:val="18"/>
-        </w:rPr>
-        <w:t xml:space="preserve">When: 22 Oct 2026, 16:45–17:19   ·   Pull requests: #32, #35, #36   ·   Decision: D-029</w:t>
-      </w:r>
-    </w:p>
-    <w:p>
-      <w:pPr>
-        <w:spacing w:after="120" w:line="276"/>
-      </w:pPr>
-      <w:r>
-        <w:t xml:space="preserve">An art generator and atlas pipeline, six first-person guns with recoil and reload, and detailed guineafowl. Human art can replace it later.</w:t>
-      </w:r>
-    </w:p>
-    <w:p>
-      <w:pPr>
-        <w:keepNext/>
-        <w:spacing w:after="80" w:before="160"/>
-      </w:pPr>
-      <w:r>
-        <w:rPr>
-          <w:b/>
-          <w:bCs/>
-          <w:color w:val="B7791F"/>
-          <w:sz w:val="20"/>
-          <w:szCs w:val="20"/>
-        </w:rPr>
-        <w:t xml:space="preserve">What the product owner asked for</w:t>
-      </w:r>
-    </w:p>
-    <w:p>
-      <w:pPr>
-        <w:pBdr>
-          <w:left w:val="single" w:color="B7791F" w:sz="18" w:space="8"/>
-        </w:pBdr>
-        <w:shd w:fill="F3ECDD" w:color="auto" w:val="clear"/>
-        <w:spacing w:after="0" w:before="60" w:line="264"/>
-        <w:ind w:left="240" w:right="120"/>
-      </w:pPr>
-      <w:r>
-        <w:rPr>
-          <w:sz w:val="20"/>
-          <w:szCs w:val="20"/>
-        </w:rPr>
-        <w:t xml:space="preserve">Birds looked grey and washed out → back to dark slate with bright cobalt faces so they pop against the veld.</w:t>
-      </w:r>
-    </w:p>
-    <w:p>
-      <w:pPr>
-        <w:pBdr>
-          <w:left w:val="single" w:color="B7791F" w:sz="18" w:space="8"/>
-        </w:pBdr>
-        <w:shd w:fill="F3ECDD" w:color="auto" w:val="clear"/>
-        <w:spacing w:after="0" w:before="0" w:line="264"/>
-        <w:ind w:left="240" w:right="120"/>
-      </w:pPr>
-      <w:r>
-        <w:rPr>
-          <w:sz w:val="20"/>
-          <w:szCs w:val="20"/>
-        </w:rPr>
-        <w:t xml:space="preserve">The shotgun read as a stubby revolver from behind → redrawn as a long double-barrel pointing into the scene.</w:t>
-      </w:r>
-    </w:p>
-    <w:p>
-      <w:pPr>
-        <w:pBdr>
-          <w:left w:val="single" w:color="B7791F" w:sz="18" w:space="8"/>
-        </w:pBdr>
-        <w:shd w:fill="F3ECDD" w:color="auto" w:val="clear"/>
-        <w:spacing w:after="160" w:before="0" w:line="264"/>
-        <w:ind w:left="240" w:right="120"/>
-      </w:pPr>
-      <w:r>
-        <w:rPr>
-          <w:sz w:val="20"/>
-          <w:szCs w:val="20"/>
-        </w:rPr>
-        <w:t xml:space="preserve">Download size and memory rose sharply → trimmed for low-end phones.</w:t>
+        <w:t xml:space="preserve">v1.0.0: the title screen (visual test baseline).</w:t>
       </w:r>
     </w:p>
     <w:p>
@@ -6136,7 +5840,7 @@
       <w:r>
         <w:drawing>
           <wp:inline distT="0" distB="0" distL="0" distR="0">
-            <wp:extent cx="6115050" cy="1714500"/>
+            <wp:extent cx="6115050" cy="2819400"/>
             <wp:effectExtent t="0" r="0" b="0" l="0"/>
             <wp:docPr id="1" name="" descr="" title=""/>
             <wp:cNvGraphicFramePr>
@@ -6161,7 +5865,7 @@
                   <pic:spPr bwMode="auto">
                     <a:xfrm>
                       <a:off x="0" y="0"/>
-                      <a:ext cx="6115050" cy="1714500"/>
+                      <a:ext cx="6115050" cy="2819400"/>
                     </a:xfrm>
                     <a:prstGeom prst="rect">
                       <a:avLst/>
@@ -6187,7 +5891,303 @@
           <w:sz w:val="18"/>
           <w:szCs w:val="18"/>
         </w:rPr>
-        <w:t xml:space="preserve">Before | after: the Dubbelloop.</w:t>
+        <w:t xml:space="preserve">v1.0.0 on an iPhone-sized screen.</w:t>
+      </w:r>
+    </w:p>
+    <w:p>
+      <w:pPr>
+        <w:pStyle w:val="Heading2"/>
+        <w:keepNext/>
+      </w:pPr>
+      <w:r>
+        <w:t xml:space="preserve">v1.0.1 — Clean-up</w:t>
+      </w:r>
+    </w:p>
+    <w:p>
+      <w:pPr>
+        <w:spacing w:after="120"/>
+        <w:rPr>
+          <w:color w:val="6B6B6B"/>
+          <w:sz w:val="18"/>
+          <w:szCs w:val="18"/>
+        </w:rPr>
+      </w:pPr>
+      <w:r>
+        <w:rPr>
+          <w:color w:val="6B6B6B"/>
+          <w:sz w:val="18"/>
+          <w:szCs w:val="18"/>
+        </w:rPr>
+        <w:t xml:space="preserve">When: 22 Oct 2026, 08:34–14:19   ·   Pull requests: #30, #31, #33, #34, #37, #38   ·   Decision: D-028</w:t>
+      </w:r>
+    </w:p>
+    <w:p>
+      <w:pPr>
+        <w:keepNext/>
+        <w:spacing w:after="80" w:before="160"/>
+      </w:pPr>
+      <w:r>
+        <w:rPr>
+          <w:b/>
+          <w:bCs/>
+          <w:color w:val="B7791F"/>
+          <w:sz w:val="20"/>
+          <w:szCs w:val="20"/>
+        </w:rPr>
+        <w:t xml:space="preserve">What it added</w:t>
+      </w:r>
+    </w:p>
+    <w:p>
+      <w:pPr>
+        <w:pStyle w:val="ListParagraph"/>
+        <w:numPr>
+          <w:ilvl w:val="0"/>
+          <w:numId w:val="2"/>
+        </w:numPr>
+        <w:spacing w:after="60" w:line="264"/>
+      </w:pPr>
+      <w:r>
+        <w:t xml:space="preserve">The public build keeps the Daily unranked until launch; the Daily start date is one content value.</w:t>
+      </w:r>
+    </w:p>
+    <w:p>
+      <w:pPr>
+        <w:pStyle w:val="ListParagraph"/>
+        <w:numPr>
+          <w:ilvl w:val="0"/>
+          <w:numId w:val="2"/>
+        </w:numPr>
+        <w:spacing w:after="60" w:line="264"/>
+      </w:pPr>
+      <w:r>
+        <w:t xml:space="preserve">Faster score pops; a key hint in capture mode.</w:t>
+      </w:r>
+    </w:p>
+    <w:p>
+      <w:pPr>
+        <w:pStyle w:val="ListParagraph"/>
+        <w:numPr>
+          <w:ilvl w:val="0"/>
+          <w:numId w:val="2"/>
+        </w:numPr>
+        <w:spacing w:after="60" w:line="264"/>
+      </w:pPr>
+      <w:r>
+        <w:t xml:space="preserve">Oupa’s barks: 43 lines as text now, voice later.</w:t>
+      </w:r>
+    </w:p>
+    <w:p>
+      <w:pPr>
+        <w:pStyle w:val="ListParagraph"/>
+        <w:numPr>
+          <w:ilvl w:val="0"/>
+          <w:numId w:val="2"/>
+        </w:numPr>
+        <w:spacing w:after="60" w:line="264"/>
+      </w:pPr>
+      <w:r>
+        <w:t xml:space="preserve">A balance check across all modes (no changes needed).</w:t>
+      </w:r>
+    </w:p>
+    <w:p>
+      <w:pPr>
+        <w:pStyle w:val="Heading2"/>
+        <w:keepNext/>
+      </w:pPr>
+      <w:r>
+        <w:t xml:space="preserve">Faster delivery</w:t>
+      </w:r>
+    </w:p>
+    <w:p>
+      <w:pPr>
+        <w:spacing w:after="120"/>
+        <w:rPr>
+          <w:color w:val="6B6B6B"/>
+          <w:sz w:val="18"/>
+          <w:szCs w:val="18"/>
+        </w:rPr>
+      </w:pPr>
+      <w:r>
+        <w:rPr>
+          <w:color w:val="6B6B6B"/>
+          <w:sz w:val="18"/>
+          <w:szCs w:val="18"/>
+        </w:rPr>
+        <w:t xml:space="preserve">When: 22 Oct 2026, 16:04   ·   Pull requests: #39   ·   Decision: D-030</w:t>
+      </w:r>
+    </w:p>
+    <w:p>
+      <w:pPr>
+        <w:spacing w:after="120" w:line="276"/>
+      </w:pPr>
+      <w:r>
+        <w:t xml:space="preserve">The product owner found the build loop too slow. Tests on a pull request went from about 48 minutes to about 15.</w:t>
+      </w:r>
+    </w:p>
+    <w:p>
+      <w:pPr>
+        <w:keepNext/>
+        <w:spacing w:after="80" w:before="160"/>
+      </w:pPr>
+      <w:r>
+        <w:rPr>
+          <w:b/>
+          <w:bCs/>
+          <w:color w:val="B7791F"/>
+          <w:sz w:val="20"/>
+          <w:szCs w:val="20"/>
+        </w:rPr>
+        <w:t xml:space="preserve">What it added</w:t>
+      </w:r>
+    </w:p>
+    <w:p>
+      <w:pPr>
+        <w:pStyle w:val="ListParagraph"/>
+        <w:numPr>
+          <w:ilvl w:val="0"/>
+          <w:numId w:val="2"/>
+        </w:numPr>
+        <w:spacing w:after="60" w:line="264"/>
+      </w:pPr>
+      <w:r>
+        <w:t xml:space="preserve">A quick test lane on pull requests and the full suite on every merge to main.</w:t>
+      </w:r>
+    </w:p>
+    <w:p>
+      <w:pPr>
+        <w:pStyle w:val="ListParagraph"/>
+        <w:numPr>
+          <w:ilvl w:val="0"/>
+          <w:numId w:val="2"/>
+        </w:numPr>
+        <w:spacing w:after="60" w:line="264"/>
+      </w:pPr>
+      <w:r>
+        <w:t xml:space="preserve">Tests run inside the official Playwright image (installing browsers had cost up to 22 minutes per job).</w:t>
+      </w:r>
+    </w:p>
+    <w:p>
+      <w:pPr>
+        <w:pStyle w:val="ListParagraph"/>
+        <w:numPr>
+          <w:ilvl w:val="0"/>
+          <w:numId w:val="2"/>
+        </w:numPr>
+        <w:spacing w:after="60" w:line="264"/>
+      </w:pPr>
+      <w:r>
+        <w:t xml:space="preserve">Working rules: one or two pull requests per job, check-ins every 20 minutes, and a stalled agent turn is restarted at once.</w:t>
+      </w:r>
+    </w:p>
+    <w:p>
+      <w:pPr>
+        <w:pStyle w:val="Heading1"/>
+        <w:pageBreakBefore/>
+      </w:pPr>
+      <w:r>
+        <w:t xml:space="preserve">The look</w:t>
+      </w:r>
+    </w:p>
+    <w:p>
+      <w:pPr>
+        <w:pStyle w:val="Heading2"/>
+        <w:keepNext/>
+      </w:pPr>
+      <w:r>
+        <w:t xml:space="preserve">Graphics pass 1 — detailed guns and guineafowl</w:t>
+      </w:r>
+    </w:p>
+    <w:p>
+      <w:pPr>
+        <w:spacing w:after="120"/>
+        <w:rPr>
+          <w:color w:val="6B6B6B"/>
+          <w:sz w:val="18"/>
+          <w:szCs w:val="18"/>
+        </w:rPr>
+      </w:pPr>
+      <w:r>
+        <w:rPr>
+          <w:color w:val="6B6B6B"/>
+          <w:sz w:val="18"/>
+          <w:szCs w:val="18"/>
+        </w:rPr>
+        <w:t xml:space="preserve">When: 22 Oct 2026, 16:45–17:19   ·   Pull requests: #32, #35, #36   ·   Decision: D-029</w:t>
+      </w:r>
+    </w:p>
+    <w:p>
+      <w:pPr>
+        <w:spacing w:after="120" w:line="276"/>
+      </w:pPr>
+      <w:r>
+        <w:t xml:space="preserve">An art generator and atlas pipeline, six first-person guns with recoil and reload, and detailed guineafowl. Human art can replace it later.</w:t>
+      </w:r>
+    </w:p>
+    <w:p>
+      <w:pPr>
+        <w:keepNext/>
+        <w:spacing w:after="80" w:before="160"/>
+      </w:pPr>
+      <w:r>
+        <w:rPr>
+          <w:b/>
+          <w:bCs/>
+          <w:color w:val="B7791F"/>
+          <w:sz w:val="20"/>
+          <w:szCs w:val="20"/>
+        </w:rPr>
+        <w:t xml:space="preserve">What the product owner asked for</w:t>
+      </w:r>
+    </w:p>
+    <w:p>
+      <w:pPr>
+        <w:pBdr>
+          <w:left w:val="single" w:color="B7791F" w:sz="18" w:space="8"/>
+        </w:pBdr>
+        <w:shd w:fill="F3ECDD" w:color="auto" w:val="clear"/>
+        <w:spacing w:after="0" w:before="60" w:line="264"/>
+        <w:ind w:left="240" w:right="120"/>
+      </w:pPr>
+      <w:r>
+        <w:rPr>
+          <w:sz w:val="20"/>
+          <w:szCs w:val="20"/>
+        </w:rPr>
+        <w:t xml:space="preserve">Birds looked grey and washed out → back to dark slate with bright cobalt faces so they pop against the veld.</w:t>
+      </w:r>
+    </w:p>
+    <w:p>
+      <w:pPr>
+        <w:pBdr>
+          <w:left w:val="single" w:color="B7791F" w:sz="18" w:space="8"/>
+        </w:pBdr>
+        <w:shd w:fill="F3ECDD" w:color="auto" w:val="clear"/>
+        <w:spacing w:after="0" w:before="0" w:line="264"/>
+        <w:ind w:left="240" w:right="120"/>
+      </w:pPr>
+      <w:r>
+        <w:rPr>
+          <w:sz w:val="20"/>
+          <w:szCs w:val="20"/>
+        </w:rPr>
+        <w:t xml:space="preserve">The shotgun read as a stubby revolver from behind → redrawn as a long double-barrel pointing into the scene.</w:t>
+      </w:r>
+    </w:p>
+    <w:p>
+      <w:pPr>
+        <w:pBdr>
+          <w:left w:val="single" w:color="B7791F" w:sz="18" w:space="8"/>
+        </w:pBdr>
+        <w:shd w:fill="F3ECDD" w:color="auto" w:val="clear"/>
+        <w:spacing w:after="160" w:before="0" w:line="264"/>
+        <w:ind w:left="240" w:right="120"/>
+      </w:pPr>
+      <w:r>
+        <w:rPr>
+          <w:sz w:val="20"/>
+          <w:szCs w:val="20"/>
+        </w:rPr>
+        <w:t xml:space="preserve">Download size and memory rose sharply → trimmed for low-end phones.</w:t>
       </w:r>
     </w:p>
     <w:p>
@@ -6250,7 +6250,7 @@
           <w:sz w:val="18"/>
           <w:szCs w:val="18"/>
         </w:rPr>
-        <w:t xml:space="preserve">Before | after: a foraging flock.</w:t>
+        <w:t xml:space="preserve">Before | after: the Dubbelloop.</w:t>
       </w:r>
     </w:p>
     <w:p>
@@ -6313,279 +6313,7 @@
           <w:sz w:val="18"/>
           <w:szCs w:val="18"/>
         </w:rPr>
-        <w:t xml:space="preserve">Before | after: the boss Generaal.</w:t>
-      </w:r>
-    </w:p>
-    <w:p>
-      <w:pPr>
-        <w:pStyle w:val="Heading2"/>
-        <w:keepNext/>
-      </w:pPr>
-      <w:r>
-        <w:t xml:space="preserve">The long-range plan</w:t>
-      </w:r>
-    </w:p>
-    <w:p>
-      <w:pPr>
-        <w:spacing w:after="120"/>
-        <w:rPr>
-          <w:color w:val="6B6B6B"/>
-          <w:sz w:val="18"/>
-          <w:szCs w:val="18"/>
-        </w:rPr>
-      </w:pPr>
-      <w:r>
-        <w:rPr>
-          <w:color w:val="6B6B6B"/>
-          <w:sz w:val="18"/>
-          <w:szCs w:val="18"/>
-        </w:rPr>
-        <w:t xml:space="preserve">When: 22 Oct 2026, 18:54   ·   Pull requests: #40</w:t>
-      </w:r>
-    </w:p>
-    <w:p>
-      <w:pPr>
-        <w:spacing w:after="120" w:line="276"/>
-      </w:pPr>
-      <w:r>
-        <w:t xml:space="preserve">The product owner’s list after graphics pass 1 became an approved plan (docs/08), split into v1.1 to v1.4.</w:t>
-      </w:r>
-    </w:p>
-    <w:p>
-      <w:pPr>
-        <w:keepNext/>
-        <w:spacing w:after="80" w:before="160"/>
-      </w:pPr>
-      <w:r>
-        <w:rPr>
-          <w:b/>
-          <w:bCs/>
-          <w:color w:val="B7791F"/>
-          <w:sz w:val="20"/>
-          <w:szCs w:val="20"/>
-        </w:rPr>
-        <w:t xml:space="preserve">What the product owner asked for</w:t>
-      </w:r>
-    </w:p>
-    <w:p>
-      <w:pPr>
-        <w:pBdr>
-          <w:left w:val="single" w:color="B7791F" w:sz="18" w:space="8"/>
-        </w:pBdr>
-        <w:shd w:fill="F3ECDD" w:color="auto" w:val="clear"/>
-        <w:spacing w:after="0" w:before="60" w:line="264"/>
-        <w:ind w:left="240" w:right="120"/>
-      </w:pPr>
-      <w:r>
-        <w:rPr>
-          <w:sz w:val="20"/>
-          <w:szCs w:val="20"/>
-        </w:rPr>
-        <w:t xml:space="preserve">Ammo on screen must match each gun and look real: shells, stones, air-rifle pellets, .22 rounds.</w:t>
-      </w:r>
-    </w:p>
-    <w:p>
-      <w:pPr>
-        <w:pBdr>
-          <w:left w:val="single" w:color="B7791F" w:sz="18" w:space="8"/>
-        </w:pBdr>
-        <w:shd w:fill="F3ECDD" w:color="auto" w:val="clear"/>
-        <w:spacing w:after="0" w:before="0" w:line="264"/>
-        <w:ind w:left="240" w:right="120"/>
-      </w:pPr>
-      <w:r>
-        <w:rPr>
-          <w:sz w:val="20"/>
-          <w:szCs w:val="20"/>
-        </w:rPr>
-        <w:t xml:space="preserve">Sound effects are very important.</w:t>
-      </w:r>
-    </w:p>
-    <w:p>
-      <w:pPr>
-        <w:pBdr>
-          <w:left w:val="single" w:color="B7791F" w:sz="18" w:space="8"/>
-        </w:pBdr>
-        <w:shd w:fill="F3ECDD" w:color="auto" w:val="clear"/>
-        <w:spacing w:after="0" w:before="0" w:line="264"/>
-        <w:ind w:left="240" w:right="120"/>
-      </w:pPr>
-      <w:r>
-        <w:rPr>
-          <w:sz w:val="20"/>
-          <w:szCs w:val="20"/>
-        </w:rPr>
-        <w:t xml:space="preserve">The crosshair should change per gun.</w:t>
-      </w:r>
-    </w:p>
-    <w:p>
-      <w:pPr>
-        <w:pBdr>
-          <w:left w:val="single" w:color="B7791F" w:sz="18" w:space="8"/>
-        </w:pBdr>
-        <w:shd w:fill="F3ECDD" w:color="auto" w:val="clear"/>
-        <w:spacing w:after="0" w:before="0" w:line="264"/>
-        <w:ind w:left="240" w:right="120"/>
-      </w:pPr>
-      <w:r>
-        <w:rPr>
-          <w:sz w:val="20"/>
-          <w:szCs w:val="20"/>
-        </w:rPr>
-        <w:t xml:space="preserve">A .22 long rifle, targets much further away, iron sights, peep sight and a low-power scope with zoom.</w:t>
-      </w:r>
-    </w:p>
-    <w:p>
-      <w:pPr>
-        <w:pBdr>
-          <w:left w:val="single" w:color="B7791F" w:sz="18" w:space="8"/>
-        </w:pBdr>
-        <w:shd w:fill="F3ECDD" w:color="auto" w:val="clear"/>
-        <w:spacing w:after="160" w:before="0" w:line="264"/>
-        <w:ind w:left="240" w:right="120"/>
-      </w:pPr>
-      <w:r>
-        <w:rPr>
-          <w:sz w:val="20"/>
-          <w:szCs w:val="20"/>
-        </w:rPr>
-        <w:t xml:space="preserve">Voices for Oupa through a text-to-speech subscription (needs the product owner’s account; later).</w:t>
-      </w:r>
-    </w:p>
-    <w:p>
-      <w:pPr>
-        <w:pStyle w:val="Heading2"/>
-        <w:keepNext/>
-      </w:pPr>
-      <w:r>
-        <w:t xml:space="preserve">Graphics pass 2 — landscapes for all four areas</w:t>
-      </w:r>
-    </w:p>
-    <w:p>
-      <w:pPr>
-        <w:spacing w:after="120"/>
-        <w:rPr>
-          <w:color w:val="6B6B6B"/>
-          <w:sz w:val="18"/>
-          <w:szCs w:val="18"/>
-        </w:rPr>
-      </w:pPr>
-      <w:r>
-        <w:rPr>
-          <w:color w:val="6B6B6B"/>
-          <w:sz w:val="18"/>
-          <w:szCs w:val="18"/>
-        </w:rPr>
-        <w:t xml:space="preserve">When: 22 Oct 2026, 23:18 and 23 Oct 00:05   ·   Pull requests: #41, #42   ·   Decision: D-031</w:t>
-      </w:r>
-    </w:p>
-    <w:p>
-      <w:pPr>
-        <w:spacing w:after="120" w:line="276"/>
-      </w:pPr>
-      <w:r>
-        <w:t xml:space="preserve">Interim landscapes, props, other creatures and effects for the Karoo, Bushveld, Kalahari and Okavango.</w:t>
-      </w:r>
-    </w:p>
-    <w:p>
-      <w:pPr>
-        <w:keepNext/>
-        <w:spacing w:after="80" w:before="160"/>
-      </w:pPr>
-      <w:r>
-        <w:rPr>
-          <w:b/>
-          <w:bCs/>
-          <w:color w:val="B7791F"/>
-          <w:sz w:val="20"/>
-          <w:szCs w:val="20"/>
-        </w:rPr>
-        <w:t xml:space="preserve">What the product owner asked for</w:t>
-      </w:r>
-    </w:p>
-    <w:p>
-      <w:pPr>
-        <w:pBdr>
-          <w:left w:val="single" w:color="B7791F" w:sz="18" w:space="8"/>
-        </w:pBdr>
-        <w:shd w:fill="F3ECDD" w:color="auto" w:val="clear"/>
-        <w:spacing w:after="0" w:before="60" w:line="264"/>
-        <w:ind w:left="240" w:right="120"/>
-      </w:pPr>
-      <w:r>
-        <w:rPr>
-          <w:sz w:val="20"/>
-          <w:szCs w:val="20"/>
-        </w:rPr>
-        <w:t xml:space="preserve">Grass was stamped in a repeating pattern → varied tufts, stones and stalks in irregular clusters.</w:t>
-      </w:r>
-    </w:p>
-    <w:p>
-      <w:pPr>
-        <w:pBdr>
-          <w:left w:val="single" w:color="B7791F" w:sz="18" w:space="8"/>
-        </w:pBdr>
-        <w:shd w:fill="F3ECDD" w:color="auto" w:val="clear"/>
-        <w:spacing w:after="0" w:before="0" w:line="264"/>
-        <w:ind w:left="240" w:right="120"/>
-      </w:pPr>
-      <w:r>
-        <w:rPr>
-          <w:sz w:val="20"/>
-          <w:szCs w:val="20"/>
-        </w:rPr>
-        <w:t xml:space="preserve">Bushes were flat green blobs → twiggy Karoo bossies with light and shadow.</w:t>
-      </w:r>
-    </w:p>
-    <w:p>
-      <w:pPr>
-        <w:pBdr>
-          <w:left w:val="single" w:color="B7791F" w:sz="18" w:space="8"/>
-        </w:pBdr>
-        <w:shd w:fill="F3ECDD" w:color="auto" w:val="clear"/>
-        <w:spacing w:after="0" w:before="0" w:line="264"/>
-        <w:ind w:left="240" w:right="120"/>
-      </w:pPr>
-      <w:r>
-        <w:rPr>
-          <w:sz w:val="20"/>
-          <w:szCs w:val="20"/>
-        </w:rPr>
-        <w:t xml:space="preserve">The sky was plain → an autumn gradient with soft cumulus.</w:t>
-      </w:r>
-    </w:p>
-    <w:p>
-      <w:pPr>
-        <w:pBdr>
-          <w:left w:val="single" w:color="B7791F" w:sz="18" w:space="8"/>
-        </w:pBdr>
-        <w:shd w:fill="F3ECDD" w:color="auto" w:val="clear"/>
-        <w:spacing w:after="0" w:before="0" w:line="264"/>
-        <w:ind w:left="240" w:right="120"/>
-      </w:pPr>
-      <w:r>
-        <w:rPr>
-          <w:sz w:val="20"/>
-          <w:szCs w:val="20"/>
-        </w:rPr>
-        <w:t xml:space="preserve">A dark band behind the Kalahari dunes read as a glitch → a distant thunderhead.</w:t>
-      </w:r>
-    </w:p>
-    <w:p>
-      <w:pPr>
-        <w:pBdr>
-          <w:left w:val="single" w:color="B7791F" w:sz="18" w:space="8"/>
-        </w:pBdr>
-        <w:shd w:fill="F3ECDD" w:color="auto" w:val="clear"/>
-        <w:spacing w:after="160" w:before="0" w:line="264"/>
-        <w:ind w:left="240" w:right="120"/>
-      </w:pPr>
-      <w:r>
-        <w:rPr>
-          <w:sz w:val="20"/>
-          <w:szCs w:val="20"/>
-        </w:rPr>
-        <w:t xml:space="preserve">"Karoo approved, carry on with the other areas" (22 Oct, evening), together with the standing instruction to keep development going around the clock.</w:t>
+        <w:t xml:space="preserve">Before | after: a foraging flock.</w:t>
       </w:r>
     </w:p>
     <w:p>
@@ -6648,7 +6376,279 @@
           <w:sz w:val="18"/>
           <w:szCs w:val="18"/>
         </w:rPr>
-        <w:t xml:space="preserve">Before | after: the Karoo.</w:t>
+        <w:t xml:space="preserve">Before | after: the boss Generaal.</w:t>
+      </w:r>
+    </w:p>
+    <w:p>
+      <w:pPr>
+        <w:pStyle w:val="Heading2"/>
+        <w:keepNext/>
+      </w:pPr>
+      <w:r>
+        <w:t xml:space="preserve">The long-range plan</w:t>
+      </w:r>
+    </w:p>
+    <w:p>
+      <w:pPr>
+        <w:spacing w:after="120"/>
+        <w:rPr>
+          <w:color w:val="6B6B6B"/>
+          <w:sz w:val="18"/>
+          <w:szCs w:val="18"/>
+        </w:rPr>
+      </w:pPr>
+      <w:r>
+        <w:rPr>
+          <w:color w:val="6B6B6B"/>
+          <w:sz w:val="18"/>
+          <w:szCs w:val="18"/>
+        </w:rPr>
+        <w:t xml:space="preserve">When: 22 Oct 2026, 18:54   ·   Pull requests: #40</w:t>
+      </w:r>
+    </w:p>
+    <w:p>
+      <w:pPr>
+        <w:spacing w:after="120" w:line="276"/>
+      </w:pPr>
+      <w:r>
+        <w:t xml:space="preserve">The product owner’s list after graphics pass 1 became an approved plan (docs/08), split into v1.1 to v1.4.</w:t>
+      </w:r>
+    </w:p>
+    <w:p>
+      <w:pPr>
+        <w:keepNext/>
+        <w:spacing w:after="80" w:before="160"/>
+      </w:pPr>
+      <w:r>
+        <w:rPr>
+          <w:b/>
+          <w:bCs/>
+          <w:color w:val="B7791F"/>
+          <w:sz w:val="20"/>
+          <w:szCs w:val="20"/>
+        </w:rPr>
+        <w:t xml:space="preserve">What the product owner asked for</w:t>
+      </w:r>
+    </w:p>
+    <w:p>
+      <w:pPr>
+        <w:pBdr>
+          <w:left w:val="single" w:color="B7791F" w:sz="18" w:space="8"/>
+        </w:pBdr>
+        <w:shd w:fill="F3ECDD" w:color="auto" w:val="clear"/>
+        <w:spacing w:after="0" w:before="60" w:line="264"/>
+        <w:ind w:left="240" w:right="120"/>
+      </w:pPr>
+      <w:r>
+        <w:rPr>
+          <w:sz w:val="20"/>
+          <w:szCs w:val="20"/>
+        </w:rPr>
+        <w:t xml:space="preserve">Ammo on screen must match each gun and look real: shells, stones, air-rifle pellets, .22 rounds.</w:t>
+      </w:r>
+    </w:p>
+    <w:p>
+      <w:pPr>
+        <w:pBdr>
+          <w:left w:val="single" w:color="B7791F" w:sz="18" w:space="8"/>
+        </w:pBdr>
+        <w:shd w:fill="F3ECDD" w:color="auto" w:val="clear"/>
+        <w:spacing w:after="0" w:before="0" w:line="264"/>
+        <w:ind w:left="240" w:right="120"/>
+      </w:pPr>
+      <w:r>
+        <w:rPr>
+          <w:sz w:val="20"/>
+          <w:szCs w:val="20"/>
+        </w:rPr>
+        <w:t xml:space="preserve">Sound effects are very important.</w:t>
+      </w:r>
+    </w:p>
+    <w:p>
+      <w:pPr>
+        <w:pBdr>
+          <w:left w:val="single" w:color="B7791F" w:sz="18" w:space="8"/>
+        </w:pBdr>
+        <w:shd w:fill="F3ECDD" w:color="auto" w:val="clear"/>
+        <w:spacing w:after="0" w:before="0" w:line="264"/>
+        <w:ind w:left="240" w:right="120"/>
+      </w:pPr>
+      <w:r>
+        <w:rPr>
+          <w:sz w:val="20"/>
+          <w:szCs w:val="20"/>
+        </w:rPr>
+        <w:t xml:space="preserve">The crosshair should change per gun.</w:t>
+      </w:r>
+    </w:p>
+    <w:p>
+      <w:pPr>
+        <w:pBdr>
+          <w:left w:val="single" w:color="B7791F" w:sz="18" w:space="8"/>
+        </w:pBdr>
+        <w:shd w:fill="F3ECDD" w:color="auto" w:val="clear"/>
+        <w:spacing w:after="0" w:before="0" w:line="264"/>
+        <w:ind w:left="240" w:right="120"/>
+      </w:pPr>
+      <w:r>
+        <w:rPr>
+          <w:sz w:val="20"/>
+          <w:szCs w:val="20"/>
+        </w:rPr>
+        <w:t xml:space="preserve">A .22 long rifle, targets much further away, iron sights, peep sight and a low-power scope with zoom.</w:t>
+      </w:r>
+    </w:p>
+    <w:p>
+      <w:pPr>
+        <w:pBdr>
+          <w:left w:val="single" w:color="B7791F" w:sz="18" w:space="8"/>
+        </w:pBdr>
+        <w:shd w:fill="F3ECDD" w:color="auto" w:val="clear"/>
+        <w:spacing w:after="160" w:before="0" w:line="264"/>
+        <w:ind w:left="240" w:right="120"/>
+      </w:pPr>
+      <w:r>
+        <w:rPr>
+          <w:sz w:val="20"/>
+          <w:szCs w:val="20"/>
+        </w:rPr>
+        <w:t xml:space="preserve">Voices for Oupa through a text-to-speech subscription (needs the product owner’s account; later).</w:t>
+      </w:r>
+    </w:p>
+    <w:p>
+      <w:pPr>
+        <w:pStyle w:val="Heading2"/>
+        <w:keepNext/>
+      </w:pPr>
+      <w:r>
+        <w:t xml:space="preserve">Graphics pass 2 — landscapes for all four areas</w:t>
+      </w:r>
+    </w:p>
+    <w:p>
+      <w:pPr>
+        <w:spacing w:after="120"/>
+        <w:rPr>
+          <w:color w:val="6B6B6B"/>
+          <w:sz w:val="18"/>
+          <w:szCs w:val="18"/>
+        </w:rPr>
+      </w:pPr>
+      <w:r>
+        <w:rPr>
+          <w:color w:val="6B6B6B"/>
+          <w:sz w:val="18"/>
+          <w:szCs w:val="18"/>
+        </w:rPr>
+        <w:t xml:space="preserve">When: 22 Oct 2026, 23:18 and 23 Oct 00:05   ·   Pull requests: #41, #42   ·   Decision: D-031</w:t>
+      </w:r>
+    </w:p>
+    <w:p>
+      <w:pPr>
+        <w:spacing w:after="120" w:line="276"/>
+      </w:pPr>
+      <w:r>
+        <w:t xml:space="preserve">Interim landscapes, props, other creatures and effects for the Karoo, Bushveld, Kalahari and Okavango.</w:t>
+      </w:r>
+    </w:p>
+    <w:p>
+      <w:pPr>
+        <w:keepNext/>
+        <w:spacing w:after="80" w:before="160"/>
+      </w:pPr>
+      <w:r>
+        <w:rPr>
+          <w:b/>
+          <w:bCs/>
+          <w:color w:val="B7791F"/>
+          <w:sz w:val="20"/>
+          <w:szCs w:val="20"/>
+        </w:rPr>
+        <w:t xml:space="preserve">What the product owner asked for</w:t>
+      </w:r>
+    </w:p>
+    <w:p>
+      <w:pPr>
+        <w:pBdr>
+          <w:left w:val="single" w:color="B7791F" w:sz="18" w:space="8"/>
+        </w:pBdr>
+        <w:shd w:fill="F3ECDD" w:color="auto" w:val="clear"/>
+        <w:spacing w:after="0" w:before="60" w:line="264"/>
+        <w:ind w:left="240" w:right="120"/>
+      </w:pPr>
+      <w:r>
+        <w:rPr>
+          <w:sz w:val="20"/>
+          <w:szCs w:val="20"/>
+        </w:rPr>
+        <w:t xml:space="preserve">Grass was stamped in a repeating pattern → varied tufts, stones and stalks in irregular clusters.</w:t>
+      </w:r>
+    </w:p>
+    <w:p>
+      <w:pPr>
+        <w:pBdr>
+          <w:left w:val="single" w:color="B7791F" w:sz="18" w:space="8"/>
+        </w:pBdr>
+        <w:shd w:fill="F3ECDD" w:color="auto" w:val="clear"/>
+        <w:spacing w:after="0" w:before="0" w:line="264"/>
+        <w:ind w:left="240" w:right="120"/>
+      </w:pPr>
+      <w:r>
+        <w:rPr>
+          <w:sz w:val="20"/>
+          <w:szCs w:val="20"/>
+        </w:rPr>
+        <w:t xml:space="preserve">Bushes were flat green blobs → twiggy Karoo bossies with light and shadow.</w:t>
+      </w:r>
+    </w:p>
+    <w:p>
+      <w:pPr>
+        <w:pBdr>
+          <w:left w:val="single" w:color="B7791F" w:sz="18" w:space="8"/>
+        </w:pBdr>
+        <w:shd w:fill="F3ECDD" w:color="auto" w:val="clear"/>
+        <w:spacing w:after="0" w:before="0" w:line="264"/>
+        <w:ind w:left="240" w:right="120"/>
+      </w:pPr>
+      <w:r>
+        <w:rPr>
+          <w:sz w:val="20"/>
+          <w:szCs w:val="20"/>
+        </w:rPr>
+        <w:t xml:space="preserve">The sky was plain → an autumn gradient with soft cumulus.</w:t>
+      </w:r>
+    </w:p>
+    <w:p>
+      <w:pPr>
+        <w:pBdr>
+          <w:left w:val="single" w:color="B7791F" w:sz="18" w:space="8"/>
+        </w:pBdr>
+        <w:shd w:fill="F3ECDD" w:color="auto" w:val="clear"/>
+        <w:spacing w:after="0" w:before="0" w:line="264"/>
+        <w:ind w:left="240" w:right="120"/>
+      </w:pPr>
+      <w:r>
+        <w:rPr>
+          <w:sz w:val="20"/>
+          <w:szCs w:val="20"/>
+        </w:rPr>
+        <w:t xml:space="preserve">A dark band behind the Kalahari dunes read as a glitch → a distant thunderhead.</w:t>
+      </w:r>
+    </w:p>
+    <w:p>
+      <w:pPr>
+        <w:pBdr>
+          <w:left w:val="single" w:color="B7791F" w:sz="18" w:space="8"/>
+        </w:pBdr>
+        <w:shd w:fill="F3ECDD" w:color="auto" w:val="clear"/>
+        <w:spacing w:after="160" w:before="0" w:line="264"/>
+        <w:ind w:left="240" w:right="120"/>
+      </w:pPr>
+      <w:r>
+        <w:rPr>
+          <w:sz w:val="20"/>
+          <w:szCs w:val="20"/>
+        </w:rPr>
+        <w:t xml:space="preserve">"Karoo approved, carry on with the other areas" (22 Oct, evening), together with the standing instruction to keep development going around the clock.</w:t>
       </w:r>
     </w:p>
     <w:p>
@@ -6711,7 +6711,7 @@
           <w:sz w:val="18"/>
           <w:szCs w:val="18"/>
         </w:rPr>
-        <w:t xml:space="preserve">Before | after: the Bushveld.</w:t>
+        <w:t xml:space="preserve">Before | after: the Karoo.</w:t>
       </w:r>
     </w:p>
     <w:p>
@@ -6774,7 +6774,7 @@
           <w:sz w:val="18"/>
           <w:szCs w:val="18"/>
         </w:rPr>
-        <w:t xml:space="preserve">Before | after: the Kalahari.</w:t>
+        <w:t xml:space="preserve">Before | after: the Bushveld.</w:t>
       </w:r>
     </w:p>
     <w:p>
@@ -6837,98 +6837,7 @@
           <w:sz w:val="18"/>
           <w:szCs w:val="18"/>
         </w:rPr>
-        <w:t xml:space="preserve">Before | after: the Okavango.</w:t>
-      </w:r>
-    </w:p>
-    <w:p>
-      <w:pPr>
-        <w:pStyle w:val="Heading1"/>
-        <w:pageBreakBefore/>
-      </w:pPr>
-      <w:r>
-        <w:t xml:space="preserve">Version 1.x</w:t>
-      </w:r>
-    </w:p>
-    <w:p>
-      <w:pPr>
-        <w:pStyle w:val="Heading2"/>
-        <w:keepNext/>
-      </w:pPr>
-      <w:r>
-        <w:t xml:space="preserve">v1.1 — Gun feel</w:t>
-      </w:r>
-    </w:p>
-    <w:p>
-      <w:pPr>
-        <w:spacing w:after="120"/>
-        <w:rPr>
-          <w:color w:val="6B6B6B"/>
-          <w:sz w:val="18"/>
-          <w:szCs w:val="18"/>
-        </w:rPr>
-      </w:pPr>
-      <w:r>
-        <w:rPr>
-          <w:color w:val="6B6B6B"/>
-          <w:sz w:val="18"/>
-          <w:szCs w:val="18"/>
-        </w:rPr>
-        <w:t xml:space="preserve">When: 23 Oct 2026, 04:24 and 04:40   ·   Pull requests: #43, #44 (and #45: a CI fix)   ·   Decision: D-032</w:t>
-      </w:r>
-    </w:p>
-    <w:p>
-      <w:pPr>
-        <w:keepNext/>
-        <w:spacing w:after="80" w:before="160"/>
-      </w:pPr>
-      <w:r>
-        <w:rPr>
-          <w:b/>
-          <w:bCs/>
-          <w:color w:val="B7791F"/>
-          <w:sz w:val="20"/>
-          <w:szCs w:val="20"/>
-        </w:rPr>
-        <w:t xml:space="preserve">What it added</w:t>
-      </w:r>
-    </w:p>
-    <w:p>
-      <w:pPr>
-        <w:pStyle w:val="ListParagraph"/>
-        <w:numPr>
-          <w:ilvl w:val="0"/>
-          <w:numId w:val="2"/>
-        </w:numPr>
-        <w:spacing w:after="60" w:line="264"/>
-      </w:pPr>
-      <w:r>
-        <w:t xml:space="preserve">Realistic ammo per gun: shotgun shells, stones, air-rifle pellets, paper cartridges, a mielie-kernel hopper.</w:t>
-      </w:r>
-    </w:p>
-    <w:p>
-      <w:pPr>
-        <w:pStyle w:val="ListParagraph"/>
-        <w:numPr>
-          <w:ilvl w:val="0"/>
-          <w:numId w:val="2"/>
-        </w:numPr>
-        <w:spacing w:after="60" w:line="264"/>
-      </w:pPr>
-      <w:r>
-        <w:t xml:space="preserve">A crosshair per gun that shows its spread; an offset crosshair on touch screens so the finger doesn’t hide the target.</w:t>
-      </w:r>
-    </w:p>
-    <w:p>
-      <w:pPr>
-        <w:pStyle w:val="ListParagraph"/>
-        <w:numPr>
-          <w:ilvl w:val="0"/>
-          <w:numId w:val="2"/>
-        </w:numPr>
-        <w:spacing w:after="60" w:line="264"/>
-      </w:pPr>
-      <w:r>
-        <w:t xml:space="preserve">30 interim sound effects, plus music and ambience for each area.</w:t>
+        <w:t xml:space="preserve">Before | after: the Kalahari.</w:t>
       </w:r>
     </w:p>
     <w:p>
@@ -6940,7 +6849,7 @@
       <w:r>
         <w:drawing>
           <wp:inline distT="0" distB="0" distL="0" distR="0">
-            <wp:extent cx="6115050" cy="2181225"/>
+            <wp:extent cx="6115050" cy="1714500"/>
             <wp:effectExtent t="0" r="0" b="0" l="0"/>
             <wp:docPr id="1" name="" descr="" title=""/>
             <wp:cNvGraphicFramePr>
@@ -6965,7 +6874,7 @@
                   <pic:spPr bwMode="auto">
                     <a:xfrm>
                       <a:off x="0" y="0"/>
-                      <a:ext cx="6115050" cy="2181225"/>
+                      <a:ext cx="6115050" cy="1714500"/>
                     </a:xfrm>
                     <a:prstGeom prst="rect">
                       <a:avLst/>
@@ -6991,7 +6900,98 @@
           <w:sz w:val="18"/>
           <w:szCs w:val="18"/>
         </w:rPr>
-        <w:t xml:space="preserve">Before | after: the Dubbelloop’s shells and crosshair.</w:t>
+        <w:t xml:space="preserve">Before | after: the Okavango.</w:t>
+      </w:r>
+    </w:p>
+    <w:p>
+      <w:pPr>
+        <w:pStyle w:val="Heading1"/>
+        <w:pageBreakBefore/>
+      </w:pPr>
+      <w:r>
+        <w:t xml:space="preserve">Version 1.x</w:t>
+      </w:r>
+    </w:p>
+    <w:p>
+      <w:pPr>
+        <w:pStyle w:val="Heading2"/>
+        <w:keepNext/>
+      </w:pPr>
+      <w:r>
+        <w:t xml:space="preserve">v1.1 — Gun feel</w:t>
+      </w:r>
+    </w:p>
+    <w:p>
+      <w:pPr>
+        <w:spacing w:after="120"/>
+        <w:rPr>
+          <w:color w:val="6B6B6B"/>
+          <w:sz w:val="18"/>
+          <w:szCs w:val="18"/>
+        </w:rPr>
+      </w:pPr>
+      <w:r>
+        <w:rPr>
+          <w:color w:val="6B6B6B"/>
+          <w:sz w:val="18"/>
+          <w:szCs w:val="18"/>
+        </w:rPr>
+        <w:t xml:space="preserve">When: 23 Oct 2026, 04:24 and 04:40   ·   Pull requests: #43, #44 (and #45: a CI fix)   ·   Decision: D-032</w:t>
+      </w:r>
+    </w:p>
+    <w:p>
+      <w:pPr>
+        <w:keepNext/>
+        <w:spacing w:after="80" w:before="160"/>
+      </w:pPr>
+      <w:r>
+        <w:rPr>
+          <w:b/>
+          <w:bCs/>
+          <w:color w:val="B7791F"/>
+          <w:sz w:val="20"/>
+          <w:szCs w:val="20"/>
+        </w:rPr>
+        <w:t xml:space="preserve">What it added</w:t>
+      </w:r>
+    </w:p>
+    <w:p>
+      <w:pPr>
+        <w:pStyle w:val="ListParagraph"/>
+        <w:numPr>
+          <w:ilvl w:val="0"/>
+          <w:numId w:val="2"/>
+        </w:numPr>
+        <w:spacing w:after="60" w:line="264"/>
+      </w:pPr>
+      <w:r>
+        <w:t xml:space="preserve">Realistic ammo per gun: shotgun shells, stones, air-rifle pellets, paper cartridges, a mielie-kernel hopper.</w:t>
+      </w:r>
+    </w:p>
+    <w:p>
+      <w:pPr>
+        <w:pStyle w:val="ListParagraph"/>
+        <w:numPr>
+          <w:ilvl w:val="0"/>
+          <w:numId w:val="2"/>
+        </w:numPr>
+        <w:spacing w:after="60" w:line="264"/>
+      </w:pPr>
+      <w:r>
+        <w:t xml:space="preserve">A crosshair per gun that shows its spread; an offset crosshair on touch screens so the finger doesn’t hide the target.</w:t>
+      </w:r>
+    </w:p>
+    <w:p>
+      <w:pPr>
+        <w:pStyle w:val="ListParagraph"/>
+        <w:numPr>
+          <w:ilvl w:val="0"/>
+          <w:numId w:val="2"/>
+        </w:numPr>
+        <w:spacing w:after="60" w:line="264"/>
+      </w:pPr>
+      <w:r>
+        <w:t xml:space="preserve">30 interim sound effects, plus music and ambience for each area.</w:t>
       </w:r>
     </w:p>
     <w:p>
@@ -7054,7 +7054,7 @@
           <w:sz w:val="18"/>
           <w:szCs w:val="18"/>
         </w:rPr>
-        <w:t xml:space="preserve">Before | after: the Kettie’s stones and crosshair.</w:t>
+        <w:t xml:space="preserve">Before | after: the Dubbelloop’s shells and crosshair.</w:t>
       </w:r>
     </w:p>
     <w:p>
@@ -7066,7 +7066,7 @@
       <w:r>
         <w:drawing>
           <wp:inline distT="0" distB="0" distL="0" distR="0">
-            <wp:extent cx="6115050" cy="3438525"/>
+            <wp:extent cx="6115050" cy="2181225"/>
             <wp:effectExtent t="0" r="0" b="0" l="0"/>
             <wp:docPr id="1" name="" descr="" title=""/>
             <wp:cNvGraphicFramePr>
@@ -7091,7 +7091,7 @@
                   <pic:spPr bwMode="auto">
                     <a:xfrm>
                       <a:off x="0" y="0"/>
-                      <a:ext cx="6115050" cy="3438525"/>
+                      <a:ext cx="6115050" cy="2181225"/>
                     </a:xfrm>
                     <a:prstGeom prst="rect">
                       <a:avLst/>
@@ -7117,122 +7117,7 @@
           <w:sz w:val="18"/>
           <w:szCs w:val="18"/>
         </w:rPr>
-        <w:t xml:space="preserve">v1.1: the shotgun crosshair over the flock.</w:t>
-      </w:r>
-    </w:p>
-    <w:p>
-      <w:pPr>
-        <w:pStyle w:val="Heading2"/>
-        <w:keepNext/>
-      </w:pPr>
-      <w:r>
-        <w:t xml:space="preserve">v1.2 — Day-of-week maps and the bonus map Verder</w:t>
-      </w:r>
-    </w:p>
-    <w:p>
-      <w:pPr>
-        <w:spacing w:after="120"/>
-        <w:rPr>
-          <w:color w:val="6B6B6B"/>
-          <w:sz w:val="18"/>
-          <w:szCs w:val="18"/>
-        </w:rPr>
-      </w:pPr>
-      <w:r>
-        <w:rPr>
-          <w:color w:val="6B6B6B"/>
-          <w:sz w:val="18"/>
-          <w:szCs w:val="18"/>
-        </w:rPr>
-        <w:t xml:space="preserve">When: 23 Oct 2026, 11:57   ·   Pull requests: #47 (includes #46)   ·   Decision: D-033</w:t>
-      </w:r>
-    </w:p>
-    <w:p>
-      <w:pPr>
-        <w:keepNext/>
-        <w:spacing w:after="80" w:before="160"/>
-      </w:pPr>
-      <w:r>
-        <w:rPr>
-          <w:b/>
-          <w:bCs/>
-          <w:color w:val="B7791F"/>
-          <w:sz w:val="20"/>
-          <w:szCs w:val="20"/>
-        </w:rPr>
-        <w:t xml:space="preserve">Look review before merging</w:t>
-      </w:r>
-    </w:p>
-    <w:p>
-      <w:pPr>
-        <w:pBdr>
-          <w:left w:val="single" w:color="B7791F" w:sz="18" w:space="8"/>
-        </w:pBdr>
-        <w:shd w:fill="F3ECDD" w:color="auto" w:val="clear"/>
-        <w:spacing w:after="160" w:before="60" w:line="264"/>
-        <w:ind w:left="240" w:right="120"/>
-      </w:pPr>
-      <w:r>
-        <w:rPr>
-          <w:sz w:val="20"/>
-          <w:szCs w:val="20"/>
-        </w:rPr>
-        <w:t xml:space="preserve">Claude’s look review: make each weekday’s light clearly different (Monday haze, Tuesday clear midday, Wednesday overcast, Thursday golden afternoon, Friday dusty wind, Saturday dusk, Sunday bright); give Saturday a real dusk glow; vary the feeding spots. All done before merging.</w:t>
-      </w:r>
-    </w:p>
-    <w:p>
-      <w:pPr>
-        <w:keepNext/>
-        <w:spacing w:after="80" w:before="160"/>
-      </w:pPr>
-      <w:r>
-        <w:rPr>
-          <w:b/>
-          <w:bCs/>
-          <w:color w:val="B7791F"/>
-          <w:sz w:val="20"/>
-          <w:szCs w:val="20"/>
-        </w:rPr>
-        <w:t xml:space="preserve">What it added</w:t>
-      </w:r>
-    </w:p>
-    <w:p>
-      <w:pPr>
-        <w:pStyle w:val="ListParagraph"/>
-        <w:numPr>
-          <w:ilvl w:val="0"/>
-          <w:numId w:val="2"/>
-        </w:numPr>
-        <w:spacing w:after="60" w:line="264"/>
-      </w:pPr>
-      <w:r>
-        <w:t xml:space="preserve">Seven layouts per area, one per weekday (UTC): light, props, feeding spots, fly-over routes and weather change.</w:t>
-      </w:r>
-    </w:p>
-    <w:p>
-      <w:pPr>
-        <w:pStyle w:val="ListParagraph"/>
-        <w:numPr>
-          <w:ilvl w:val="0"/>
-          <w:numId w:val="2"/>
-        </w:numPr>
-        <w:spacing w:after="60" w:line="264"/>
-      </w:pPr>
-      <w:r>
-        <w:t xml:space="preserve">Classic and the Daily play today’s map; replays and challenge links remember it.</w:t>
-      </w:r>
-    </w:p>
-    <w:p>
-      <w:pPr>
-        <w:pStyle w:val="ListParagraph"/>
-        <w:numPr>
-          <w:ilvl w:val="0"/>
-          <w:numId w:val="2"/>
-        </w:numPr>
-        <w:spacing w:after="60" w:line="264"/>
-      </w:pPr>
-      <w:r>
-        <w:t xml:space="preserve">Beat the day’s target to unlock Verder, a bonus map further out; it resets at midnight UTC.</w:t>
+        <w:t xml:space="preserve">Before | after: the Kettie’s stones and crosshair.</w:t>
       </w:r>
     </w:p>
     <w:p>
@@ -7295,7 +7180,122 @@
           <w:sz w:val="18"/>
           <w:szCs w:val="18"/>
         </w:rPr>
-        <w:t xml:space="preserve">v1.2: the title names today’s map and the score that unlocks Verder.</w:t>
+        <w:t xml:space="preserve">v1.1: the shotgun crosshair over the flock.</w:t>
+      </w:r>
+    </w:p>
+    <w:p>
+      <w:pPr>
+        <w:pStyle w:val="Heading2"/>
+        <w:keepNext/>
+      </w:pPr>
+      <w:r>
+        <w:t xml:space="preserve">v1.2 — Day-of-week maps and the bonus map Verder</w:t>
+      </w:r>
+    </w:p>
+    <w:p>
+      <w:pPr>
+        <w:spacing w:after="120"/>
+        <w:rPr>
+          <w:color w:val="6B6B6B"/>
+          <w:sz w:val="18"/>
+          <w:szCs w:val="18"/>
+        </w:rPr>
+      </w:pPr>
+      <w:r>
+        <w:rPr>
+          <w:color w:val="6B6B6B"/>
+          <w:sz w:val="18"/>
+          <w:szCs w:val="18"/>
+        </w:rPr>
+        <w:t xml:space="preserve">When: 23 Oct 2026, 11:57   ·   Pull requests: #47 (includes #46)   ·   Decision: D-033</w:t>
+      </w:r>
+    </w:p>
+    <w:p>
+      <w:pPr>
+        <w:keepNext/>
+        <w:spacing w:after="80" w:before="160"/>
+      </w:pPr>
+      <w:r>
+        <w:rPr>
+          <w:b/>
+          <w:bCs/>
+          <w:color w:val="B7791F"/>
+          <w:sz w:val="20"/>
+          <w:szCs w:val="20"/>
+        </w:rPr>
+        <w:t xml:space="preserve">Look review before merging</w:t>
+      </w:r>
+    </w:p>
+    <w:p>
+      <w:pPr>
+        <w:pBdr>
+          <w:left w:val="single" w:color="B7791F" w:sz="18" w:space="8"/>
+        </w:pBdr>
+        <w:shd w:fill="F3ECDD" w:color="auto" w:val="clear"/>
+        <w:spacing w:after="160" w:before="60" w:line="264"/>
+        <w:ind w:left="240" w:right="120"/>
+      </w:pPr>
+      <w:r>
+        <w:rPr>
+          <w:sz w:val="20"/>
+          <w:szCs w:val="20"/>
+        </w:rPr>
+        <w:t xml:space="preserve">Claude’s look review: make each weekday’s light clearly different (Monday haze, Tuesday clear midday, Wednesday overcast, Thursday golden afternoon, Friday dusty wind, Saturday dusk, Sunday bright); give Saturday a real dusk glow; vary the feeding spots. All done before merging.</w:t>
+      </w:r>
+    </w:p>
+    <w:p>
+      <w:pPr>
+        <w:keepNext/>
+        <w:spacing w:after="80" w:before="160"/>
+      </w:pPr>
+      <w:r>
+        <w:rPr>
+          <w:b/>
+          <w:bCs/>
+          <w:color w:val="B7791F"/>
+          <w:sz w:val="20"/>
+          <w:szCs w:val="20"/>
+        </w:rPr>
+        <w:t xml:space="preserve">What it added</w:t>
+      </w:r>
+    </w:p>
+    <w:p>
+      <w:pPr>
+        <w:pStyle w:val="ListParagraph"/>
+        <w:numPr>
+          <w:ilvl w:val="0"/>
+          <w:numId w:val="2"/>
+        </w:numPr>
+        <w:spacing w:after="60" w:line="264"/>
+      </w:pPr>
+      <w:r>
+        <w:t xml:space="preserve">Seven layouts per area, one per weekday (UTC): light, props, feeding spots, fly-over routes and weather change.</w:t>
+      </w:r>
+    </w:p>
+    <w:p>
+      <w:pPr>
+        <w:pStyle w:val="ListParagraph"/>
+        <w:numPr>
+          <w:ilvl w:val="0"/>
+          <w:numId w:val="2"/>
+        </w:numPr>
+        <w:spacing w:after="60" w:line="264"/>
+      </w:pPr>
+      <w:r>
+        <w:t xml:space="preserve">Classic and the Daily play today’s map; replays and challenge links remember it.</w:t>
+      </w:r>
+    </w:p>
+    <w:p>
+      <w:pPr>
+        <w:pStyle w:val="ListParagraph"/>
+        <w:numPr>
+          <w:ilvl w:val="0"/>
+          <w:numId w:val="2"/>
+        </w:numPr>
+        <w:spacing w:after="60" w:line="264"/>
+      </w:pPr>
+      <w:r>
+        <w:t xml:space="preserve">Beat the day’s target to unlock Verder, a bonus map further out; it resets at midnight UTC.</w:t>
       </w:r>
     </w:p>
     <w:p>
@@ -7307,7 +7307,7 @@
       <w:r>
         <w:drawing>
           <wp:inline distT="0" distB="0" distL="0" distR="0">
-            <wp:extent cx="6115050" cy="6848475"/>
+            <wp:extent cx="6115050" cy="3438525"/>
             <wp:effectExtent t="0" r="0" b="0" l="0"/>
             <wp:docPr id="1" name="" descr="" title=""/>
             <wp:cNvGraphicFramePr>
@@ -7332,7 +7332,7 @@
                   <pic:spPr bwMode="auto">
                     <a:xfrm>
                       <a:off x="0" y="0"/>
-                      <a:ext cx="6115050" cy="6848475"/>
+                      <a:ext cx="6115050" cy="3438525"/>
                     </a:xfrm>
                     <a:prstGeom prst="rect">
                       <a:avLst/>
@@ -7358,7 +7358,7 @@
           <w:sz w:val="18"/>
           <w:szCs w:val="18"/>
         </w:rPr>
-        <w:t xml:space="preserve">The Karoo, Monday to Thursday.</w:t>
+        <w:t xml:space="preserve">v1.2: the title names today’s map and the score that unlocks Verder.</w:t>
       </w:r>
     </w:p>
     <w:p>
@@ -7421,7 +7421,7 @@
           <w:sz w:val="18"/>
           <w:szCs w:val="18"/>
         </w:rPr>
-        <w:t xml:space="preserve">The Karoo, Friday to Sunday and Verder.</w:t>
+        <w:t xml:space="preserve">The Karoo, Monday to Thursday.</w:t>
       </w:r>
     </w:p>
     <w:p>
@@ -7433,7 +7433,7 @@
       <w:r>
         <w:drawing>
           <wp:inline distT="0" distB="0" distL="0" distR="0">
-            <wp:extent cx="6115050" cy="3438525"/>
+            <wp:extent cx="6115050" cy="6848475"/>
             <wp:effectExtent t="0" r="0" b="0" l="0"/>
             <wp:docPr id="1" name="" descr="" title=""/>
             <wp:cNvGraphicFramePr>
@@ -7458,7 +7458,7 @@
                   <pic:spPr bwMode="auto">
                     <a:xfrm>
                       <a:off x="0" y="0"/>
-                      <a:ext cx="6115050" cy="3438525"/>
+                      <a:ext cx="6115050" cy="6848475"/>
                     </a:xfrm>
                     <a:prstGeom prst="rect">
                       <a:avLst/>
@@ -7484,130 +7484,7 @@
           <w:sz w:val="18"/>
           <w:szCs w:val="18"/>
         </w:rPr>
-        <w:t xml:space="preserve">Verder: the flock far out at the horizon, in haze.</w:t>
-      </w:r>
-    </w:p>
-    <w:p>
-      <w:pPr>
-        <w:pStyle w:val="Heading2"/>
-        <w:keepNext/>
-      </w:pPr>
-      <w:r>
-        <w:t xml:space="preserve">Playtest admin page</w:t>
-      </w:r>
-    </w:p>
-    <w:p>
-      <w:pPr>
-        <w:spacing w:after="120"/>
-        <w:rPr>
-          <w:color w:val="6B6B6B"/>
-          <w:sz w:val="18"/>
-          <w:szCs w:val="18"/>
-        </w:rPr>
-      </w:pPr>
-      <w:r>
-        <w:rPr>
-          <w:color w:val="6B6B6B"/>
-          <w:sz w:val="18"/>
-          <w:szCs w:val="18"/>
-        </w:rPr>
-        <w:t xml:space="preserve">When: 23 Oct 2026, 13:30 (requested 11:50, live 13:32)   ·   Pull requests: #48   ·   Decision: D-034</w:t>
-      </w:r>
-    </w:p>
-    <w:p>
-      <w:pPr>
-        <w:spacing w:after="120" w:line="276"/>
-      </w:pPr>
-      <w:r>
-        <w:t xml:space="preserve">Open the test site with ?admin=1 to reach every level directly.</w:t>
-      </w:r>
-    </w:p>
-    <w:p>
-      <w:pPr>
-        <w:keepNext/>
-        <w:spacing w:after="80" w:before="160"/>
-      </w:pPr>
-      <w:r>
-        <w:rPr>
-          <w:b/>
-          <w:bCs/>
-          <w:color w:val="B7791F"/>
-          <w:sz w:val="20"/>
-          <w:szCs w:val="20"/>
-        </w:rPr>
-        <w:t xml:space="preserve">What the product owner asked for</w:t>
-      </w:r>
-    </w:p>
-    <w:p>
-      <w:pPr>
-        <w:pBdr>
-          <w:left w:val="single" w:color="B7791F" w:sz="18" w:space="8"/>
-        </w:pBdr>
-        <w:shd w:fill="F3ECDD" w:color="auto" w:val="clear"/>
-        <w:spacing w:after="160" w:before="60" w:line="264"/>
-        <w:ind w:left="240" w:right="120"/>
-      </w:pPr>
-      <w:r>
-        <w:rPr>
-          <w:sz w:val="20"/>
-          <w:szCs w:val="20"/>
-        </w:rPr>
-        <w:t xml:space="preserve">"I want an ADMIN url that I can activate in my browser that enables access to all the levels to test them … select a level, review and test them one by one and give feedback." (spelling tidied)</w:t>
-      </w:r>
-    </w:p>
-    <w:p>
-      <w:pPr>
-        <w:keepNext/>
-        <w:spacing w:after="80" w:before="160"/>
-      </w:pPr>
-      <w:r>
-        <w:rPr>
-          <w:b/>
-          <w:bCs/>
-          <w:color w:val="B7791F"/>
-          <w:sz w:val="20"/>
-          <w:szCs w:val="20"/>
-        </w:rPr>
-        <w:t xml:space="preserve">What it added</w:t>
-      </w:r>
-    </w:p>
-    <w:p>
-      <w:pPr>
-        <w:pStyle w:val="ListParagraph"/>
-        <w:numPr>
-          <w:ilvl w:val="0"/>
-          <w:numId w:val="2"/>
-        </w:numPr>
-        <w:spacing w:after="60" w:line="264"/>
-      </w:pPr>
-      <w:r>
-        <w:t xml:space="preserve">Lists all 49 levels: each area plain, its seven weekday maps and Verder, the Daily on any date, and every Season Run stage.</w:t>
-      </w:r>
-    </w:p>
-    <w:p>
-      <w:pPr>
-        <w:pStyle w:val="ListParagraph"/>
-        <w:numPr>
-          <w:ilvl w:val="0"/>
-          <w:numId w:val="2"/>
-        </w:numPr>
-        <w:spacing w:after="60" w:line="264"/>
-      </w:pPr>
-      <w:r>
-        <w:t xml:space="preserve">Choose the gun, seed, hunt length and weather; Play; come back to rate it (OK or Needs work, 1–5 stars, notes).</w:t>
-      </w:r>
-    </w:p>
-    <w:p>
-      <w:pPr>
-        <w:pStyle w:val="ListParagraph"/>
-        <w:numPr>
-          <w:ilvl w:val="0"/>
-          <w:numId w:val="2"/>
-        </w:numPr>
-        <w:spacing w:after="60" w:line="264"/>
-      </w:pPr>
-      <w:r>
-        <w:t xml:space="preserve">"Send to GitHub" opens a pre-filled feedback issue; "Copy report" copies it. Admin hunts never touch normal progress. Web test build only.</w:t>
+        <w:t xml:space="preserve">The Karoo, Friday to Sunday and Verder.</w:t>
       </w:r>
     </w:p>
     <w:p>
@@ -7670,7 +7547,7 @@
           <w:sz w:val="18"/>
           <w:szCs w:val="18"/>
         </w:rPr>
-        <w:t xml:space="preserve">The admin page: every map grouped by area and day, with options, review, stars and notes.</w:t>
+        <w:t xml:space="preserve">Verder: the flock far out at the horizon, in haze.</w:t>
       </w:r>
     </w:p>
     <w:p>
@@ -7679,7 +7556,7 @@
         <w:keepNext/>
       </w:pPr>
       <w:r>
-        <w:t xml:space="preserve">Speed tests run alone</w:t>
+        <w:t xml:space="preserve">Playtest admin page</w:t>
       </w:r>
     </w:p>
     <w:p>
@@ -7697,7 +7574,7 @@
           <w:sz w:val="18"/>
           <w:szCs w:val="18"/>
         </w:rPr>
-        <w:t xml:space="preserve">When: 23 Oct 2026, 14:10   ·   Pull requests: #50</w:t>
+        <w:t xml:space="preserve">When: 23 Oct 2026, 13:30 (requested 11:50, live 13:32)   ·   Pull requests: #48   ·   Decision: D-034</w:t>
       </w:r>
     </w:p>
     <w:p>
@@ -7705,43 +7582,7 @@
         <w:spacing w:after="120" w:line="276"/>
       </w:pPr>
       <w:r>
-        <w:t xml:space="preserve">A low-end-phone speed test kept failing on the shared test machine. Run alone, the frame cost is 11 ms against a 20 ms budget, so the game itself was fine; the test now runs in its own job.</w:t>
-      </w:r>
-    </w:p>
-    <w:p>
-      <w:pPr>
-        <w:pStyle w:val="Heading1"/>
-        <w:pageBreakBefore/>
-      </w:pPr>
-      <w:r>
-        <w:t xml:space="preserve">In progress</w:t>
-      </w:r>
-    </w:p>
-    <w:p>
-      <w:pPr>
-        <w:pStyle w:val="Heading2"/>
-        <w:keepNext/>
-      </w:pPr>
-      <w:r>
-        <w:t xml:space="preserve">Graphics pass 3 — towards semi-realistic</w:t>
-      </w:r>
-    </w:p>
-    <w:p>
-      <w:pPr>
-        <w:spacing w:after="120"/>
-        <w:rPr>
-          <w:color w:val="6B6B6B"/>
-          <w:sz w:val="18"/>
-          <w:szCs w:val="18"/>
-        </w:rPr>
-      </w:pPr>
-      <w:r>
-        <w:rPr>
-          <w:color w:val="6B6B6B"/>
-          <w:sz w:val="18"/>
-          <w:szCs w:val="18"/>
-        </w:rPr>
-        <w:t xml:space="preserve">When: started 23 Oct 2026, 11:59   ·   Pull requests: #49 (open)   ·   Decision: D-035</w:t>
+        <w:t xml:space="preserve">Open the test site with ?admin=1 to reach every level directly.</w:t>
       </w:r>
     </w:p>
     <w:p>
@@ -7774,7 +7615,7 @@
           <w:sz w:val="20"/>
           <w:szCs w:val="20"/>
         </w:rPr>
-        <w:t xml:space="preserve">"The farmhouse seems half cut, layers issue. Also the mountains can’t all be flat, look at mountains in Namibia and make them more interesting. The car detail needs to be better. And the detail on the guns needs a more realistic touch, they look too cartoony; the same applies for the birds. I see there is even a bird that has no texture at all." (23 Oct, about 11:40; spelling tidied)</w:t>
+        <w:t xml:space="preserve">"I want an ADMIN url that I can activate in my browser that enables access to all the levels to test them … select a level, review and test them one by one and give feedback." (spelling tidied)</w:t>
       </w:r>
     </w:p>
     <w:p>
@@ -7790,7 +7631,7 @@
           <w:sz w:val="20"/>
           <w:szCs w:val="20"/>
         </w:rPr>
-        <w:t xml:space="preserve">Progress</w:t>
+        <w:t xml:space="preserve">What it added</w:t>
       </w:r>
     </w:p>
     <w:p>
@@ -7803,7 +7644,7 @@
         <w:spacing w:after="60" w:line="264"/>
       </w:pPr>
       <w:r>
-        <w:t xml:space="preserve">Round 1 (done 15:05): the farmhouse stands whole; every area has varied, Namibia-inspired hills (layered mesas, granite domes like Spitzkoppe, a massif like the Brandberg); a detailed old bakkie with no badge; finer guns and guineafowl; the bird with no texture was the kwêvoël (grey go-away-bird) and is now textured.</w:t>
+        <w:t xml:space="preserve">Lists all 49 levels: each area plain, its seven weekday maps and Verder, the Daily on any date, and every Season Run stage.</w:t>
       </w:r>
     </w:p>
     <w:p>
@@ -7816,7 +7657,20 @@
         <w:spacing w:after="60" w:line="264"/>
       </w:pPr>
       <w:r>
-        <w:t xml:space="preserve">Round 2 (done 15:36, after Claude’s review notes): guns without cartoon outlines, with fine wood grain, blued steel, a real stock shape and a slim pump slide; a hump-backed, egg-shaped guineafowl with a small head on a slim barred neck, a small eye, ringed spots and a soft edge; rounded, lopsided koppies instead of cones; Kalahari dunes with curved crests and slip faces.</w:t>
+        <w:t xml:space="preserve">Choose the gun, seed, hunt length and weather; Play; come back to rate it (OK or Needs work, 1–5 stars, notes).</w:t>
+      </w:r>
+    </w:p>
+    <w:p>
+      <w:pPr>
+        <w:pStyle w:val="ListParagraph"/>
+        <w:numPr>
+          <w:ilvl w:val="0"/>
+          <w:numId w:val="2"/>
+        </w:numPr>
+        <w:spacing w:after="60" w:line="264"/>
+      </w:pPr>
+      <w:r>
+        <w:t xml:space="preserve">"Send to GitHub" opens a pre-filled feedback issue; "Copy report" copies it. Admin hunts never touch normal progress. Web test build only.</w:t>
       </w:r>
     </w:p>
     <w:p>
@@ -7828,7 +7682,7 @@
       <w:r>
         <w:drawing>
           <wp:inline distT="0" distB="0" distL="0" distR="0">
-            <wp:extent cx="6115050" cy="2581275"/>
+            <wp:extent cx="6115050" cy="3438525"/>
             <wp:effectExtent t="0" r="0" b="0" l="0"/>
             <wp:docPr id="1" name="" descr="" title=""/>
             <wp:cNvGraphicFramePr>
@@ -7853,7 +7707,7 @@
                   <pic:spPr bwMode="auto">
                     <a:xfrm>
                       <a:off x="0" y="0"/>
-                      <a:ext cx="6115050" cy="2581275"/>
+                      <a:ext cx="6115050" cy="3438525"/>
                     </a:xfrm>
                     <a:prstGeom prst="rect">
                       <a:avLst/>
@@ -7879,7 +7733,170 @@
           <w:sz w:val="18"/>
           <w:szCs w:val="18"/>
         </w:rPr>
-        <w:t xml:space="preserve">Round 1, before | after: hills in the Karoo, Kalahari, Bushveld and Okavango, and the farmhouse.</w:t>
+        <w:t xml:space="preserve">The admin page: every map grouped by area and day, with options, review, stars and notes.</w:t>
+      </w:r>
+    </w:p>
+    <w:p>
+      <w:pPr>
+        <w:pStyle w:val="Heading2"/>
+        <w:keepNext/>
+      </w:pPr>
+      <w:r>
+        <w:t xml:space="preserve">Speed tests run alone</w:t>
+      </w:r>
+    </w:p>
+    <w:p>
+      <w:pPr>
+        <w:spacing w:after="120"/>
+        <w:rPr>
+          <w:color w:val="6B6B6B"/>
+          <w:sz w:val="18"/>
+          <w:szCs w:val="18"/>
+        </w:rPr>
+      </w:pPr>
+      <w:r>
+        <w:rPr>
+          <w:color w:val="6B6B6B"/>
+          <w:sz w:val="18"/>
+          <w:szCs w:val="18"/>
+        </w:rPr>
+        <w:t xml:space="preserve">When: 23 Oct 2026, 14:10   ·   Pull requests: #50</w:t>
+      </w:r>
+    </w:p>
+    <w:p>
+      <w:pPr>
+        <w:spacing w:after="120" w:line="276"/>
+      </w:pPr>
+      <w:r>
+        <w:t xml:space="preserve">A low-end-phone speed test kept failing on the shared test machine. Run alone, the frame cost is 11 ms against a 20 ms budget, so the game itself was fine; the test now runs in its own job.</w:t>
+      </w:r>
+    </w:p>
+    <w:p>
+      <w:pPr>
+        <w:pStyle w:val="Heading2"/>
+        <w:keepNext/>
+      </w:pPr>
+      <w:r>
+        <w:t xml:space="preserve">Graphics pass 3 — towards semi-realistic</w:t>
+      </w:r>
+    </w:p>
+    <w:p>
+      <w:pPr>
+        <w:spacing w:after="120"/>
+        <w:rPr>
+          <w:color w:val="6B6B6B"/>
+          <w:sz w:val="18"/>
+          <w:szCs w:val="18"/>
+        </w:rPr>
+      </w:pPr>
+      <w:r>
+        <w:rPr>
+          <w:color w:val="6B6B6B"/>
+          <w:sz w:val="18"/>
+          <w:szCs w:val="18"/>
+        </w:rPr>
+        <w:t xml:space="preserve">When: 23 Oct 2026, 17:58 (started 11:59)   ·   Pull requests: #49   ·   Decision: D-035</w:t>
+      </w:r>
+    </w:p>
+    <w:p>
+      <w:pPr>
+        <w:keepNext/>
+        <w:spacing w:after="80" w:before="160"/>
+      </w:pPr>
+      <w:r>
+        <w:rPr>
+          <w:b/>
+          <w:bCs/>
+          <w:color w:val="B7791F"/>
+          <w:sz w:val="20"/>
+          <w:szCs w:val="20"/>
+        </w:rPr>
+        <w:t xml:space="preserve">What the product owner asked for</w:t>
+      </w:r>
+    </w:p>
+    <w:p>
+      <w:pPr>
+        <w:pBdr>
+          <w:left w:val="single" w:color="B7791F" w:sz="18" w:space="8"/>
+        </w:pBdr>
+        <w:shd w:fill="F3ECDD" w:color="auto" w:val="clear"/>
+        <w:spacing w:after="160" w:before="60" w:line="264"/>
+        <w:ind w:left="240" w:right="120"/>
+      </w:pPr>
+      <w:r>
+        <w:rPr>
+          <w:sz w:val="20"/>
+          <w:szCs w:val="20"/>
+        </w:rPr>
+        <w:t xml:space="preserve">"The farmhouse seems half cut, layers issue. Also the mountains can’t all be flat, look at mountains in Namibia and make them more interesting. The car detail needs to be better. And the detail on the guns needs a more realistic touch, they look too cartoony; the same applies for the birds. I see there is even a bird that has no texture at all." (23 Oct, about 11:40; spelling tidied)</w:t>
+      </w:r>
+    </w:p>
+    <w:p>
+      <w:pPr>
+        <w:keepNext/>
+        <w:spacing w:after="80" w:before="160"/>
+      </w:pPr>
+      <w:r>
+        <w:rPr>
+          <w:b/>
+          <w:bCs/>
+          <w:color w:val="B7791F"/>
+          <w:sz w:val="20"/>
+          <w:szCs w:val="20"/>
+        </w:rPr>
+        <w:t xml:space="preserve">What it added</w:t>
+      </w:r>
+    </w:p>
+    <w:p>
+      <w:pPr>
+        <w:pStyle w:val="ListParagraph"/>
+        <w:numPr>
+          <w:ilvl w:val="0"/>
+          <w:numId w:val="2"/>
+        </w:numPr>
+        <w:spacing w:after="60" w:line="264"/>
+      </w:pPr>
+      <w:r>
+        <w:t xml:space="preserve">Round 1 (done 15:05): the farmhouse stands whole; every area has varied, Namibia-inspired hills (layered mesas, granite domes like Spitzkoppe, a massif like the Brandberg); a detailed old bakkie with no badge; finer guns and guineafowl; the bird with no texture was the kwêvoël (grey go-away-bird) and is now textured.</w:t>
+      </w:r>
+    </w:p>
+    <w:p>
+      <w:pPr>
+        <w:pStyle w:val="ListParagraph"/>
+        <w:numPr>
+          <w:ilvl w:val="0"/>
+          <w:numId w:val="2"/>
+        </w:numPr>
+        <w:spacing w:after="60" w:line="264"/>
+      </w:pPr>
+      <w:r>
+        <w:t xml:space="preserve">Round 2 (done 15:36, after Claude’s review notes): guns without cartoon outlines, with fine wood grain, blued steel, a real stock shape and a slim pump slide; a hump-backed, egg-shaped guineafowl with a small head on a slim barred neck, a small eye, ringed spots and a soft edge; rounded, lopsided koppies instead of cones; Kalahari dunes with curved crests and slip faces.</w:t>
+      </w:r>
+    </w:p>
+    <w:p>
+      <w:pPr>
+        <w:pStyle w:val="ListParagraph"/>
+        <w:numPr>
+          <w:ilvl w:val="0"/>
+          <w:numId w:val="2"/>
+        </w:numPr>
+        <w:spacing w:after="60" w:line="264"/>
+      </w:pPr>
+      <w:r>
+        <w:t xml:space="preserve">Code review fixes (done 17:33): the gun shed draws small picture icons instead of loading whole gun image sheets (about 1 MB instead of 16 MB or more; 101 MB in total after a hunt on a low-end phone, against a 128 MB limit); the last near-black gun edges went; the bakkie’s spare wheel now hangs where it can be seen and shot.</w:t>
+      </w:r>
+    </w:p>
+    <w:p>
+      <w:pPr>
+        <w:pStyle w:val="ListParagraph"/>
+        <w:numPr>
+          <w:ilvl w:val="0"/>
+          <w:numId w:val="2"/>
+        </w:numPr>
+        <w:spacing w:after="60" w:line="264"/>
+      </w:pPr>
+      <w:r>
+        <w:t xml:space="preserve">Merged at 17:58 with all tests green: 851 unit tests, first download 2.9 MB of 3 MB. The game’s rules did not change.</w:t>
       </w:r>
     </w:p>
     <w:p>
@@ -7891,7 +7908,7 @@
       <w:r>
         <w:drawing>
           <wp:inline distT="0" distB="0" distL="0" distR="0">
-            <wp:extent cx="6115050" cy="1800225"/>
+            <wp:extent cx="6115050" cy="2581275"/>
             <wp:effectExtent t="0" r="0" b="0" l="0"/>
             <wp:docPr id="1" name="" descr="" title=""/>
             <wp:cNvGraphicFramePr>
@@ -7916,7 +7933,7 @@
                   <pic:spPr bwMode="auto">
                     <a:xfrm>
                       <a:off x="0" y="0"/>
-                      <a:ext cx="6115050" cy="1800225"/>
+                      <a:ext cx="6115050" cy="2581275"/>
                     </a:xfrm>
                     <a:prstGeom prst="rect">
                       <a:avLst/>
@@ -7942,7 +7959,7 @@
           <w:sz w:val="18"/>
           <w:szCs w:val="18"/>
         </w:rPr>
-        <w:t xml:space="preserve">Round 1, before | after: the bakkie.</w:t>
+        <w:t xml:space="preserve">Round 1, before | after: hills in the Karoo, Kalahari, Bushveld and Okavango, and the farmhouse.</w:t>
       </w:r>
     </w:p>
     <w:p>
@@ -7954,7 +7971,7 @@
       <w:r>
         <w:drawing>
           <wp:inline distT="0" distB="0" distL="0" distR="0">
-            <wp:extent cx="6115050" cy="4419600"/>
+            <wp:extent cx="6115050" cy="1800225"/>
             <wp:effectExtent t="0" r="0" b="0" l="0"/>
             <wp:docPr id="1" name="" descr="" title=""/>
             <wp:cNvGraphicFramePr>
@@ -7979,7 +7996,7 @@
                   <pic:spPr bwMode="auto">
                     <a:xfrm>
                       <a:off x="0" y="0"/>
-                      <a:ext cx="6115050" cy="4419600"/>
+                      <a:ext cx="6115050" cy="1800225"/>
                     </a:xfrm>
                     <a:prstGeom prst="rect">
                       <a:avLst/>
@@ -8005,7 +8022,7 @@
           <w:sz w:val="18"/>
           <w:szCs w:val="18"/>
         </w:rPr>
-        <w:t xml:space="preserve">Round 1, before | after: guineafowl (near and middle distance), the kwêvoël and the hadeda.</w:t>
+        <w:t xml:space="preserve">Round 1, before | after: the bakkie.</w:t>
       </w:r>
     </w:p>
     <w:p>
@@ -8017,7 +8034,7 @@
       <w:r>
         <w:drawing>
           <wp:inline distT="0" distB="0" distL="0" distR="0">
-            <wp:extent cx="3619500" cy="4838700"/>
+            <wp:extent cx="6115050" cy="4419600"/>
             <wp:effectExtent t="0" r="0" b="0" l="0"/>
             <wp:docPr id="1" name="" descr="" title=""/>
             <wp:cNvGraphicFramePr>
@@ -8042,7 +8059,7 @@
                   <pic:spPr bwMode="auto">
                     <a:xfrm>
                       <a:off x="0" y="0"/>
-                      <a:ext cx="3619500" cy="4838700"/>
+                      <a:ext cx="6115050" cy="4419600"/>
                     </a:xfrm>
                     <a:prstGeom prst="rect">
                       <a:avLst/>
@@ -8068,7 +8085,7 @@
           <w:sz w:val="18"/>
           <w:szCs w:val="18"/>
         </w:rPr>
-        <w:t xml:space="preserve">Round 1, before | after: the Dubbelloop and the Pomp.</w:t>
+        <w:t xml:space="preserve">Round 1, before | after: guineafowl (near and middle distance), the kwêvoël and the hadeda.</w:t>
       </w:r>
     </w:p>
     <w:p>
@@ -8080,7 +8097,7 @@
       <w:r>
         <w:drawing>
           <wp:inline distT="0" distB="0" distL="0" distR="0">
-            <wp:extent cx="4953000" cy="4400550"/>
+            <wp:extent cx="3619500" cy="4838700"/>
             <wp:effectExtent t="0" r="0" b="0" l="0"/>
             <wp:docPr id="1" name="" descr="" title=""/>
             <wp:cNvGraphicFramePr>
@@ -8105,7 +8122,7 @@
                   <pic:spPr bwMode="auto">
                     <a:xfrm>
                       <a:off x="0" y="0"/>
-                      <a:ext cx="4953000" cy="4400550"/>
+                      <a:ext cx="3619500" cy="4838700"/>
                     </a:xfrm>
                     <a:prstGeom prst="rect">
                       <a:avLst/>
@@ -8131,7 +8148,7 @@
           <w:sz w:val="18"/>
           <w:szCs w:val="18"/>
         </w:rPr>
-        <w:t xml:space="preserve">v1.2 | round 1 | round 2: the Dubbelloop (top) and the Pomp (bottom).</w:t>
+        <w:t xml:space="preserve">Round 1, before | after: the Dubbelloop and the Pomp.</w:t>
       </w:r>
     </w:p>
     <w:p>
@@ -8143,7 +8160,7 @@
       <w:r>
         <w:drawing>
           <wp:inline distT="0" distB="0" distL="0" distR="0">
-            <wp:extent cx="6115050" cy="3028950"/>
+            <wp:extent cx="4953000" cy="4400550"/>
             <wp:effectExtent t="0" r="0" b="0" l="0"/>
             <wp:docPr id="1" name="" descr="" title=""/>
             <wp:cNvGraphicFramePr>
@@ -8168,7 +8185,7 @@
                   <pic:spPr bwMode="auto">
                     <a:xfrm>
                       <a:off x="0" y="0"/>
-                      <a:ext cx="6115050" cy="3028950"/>
+                      <a:ext cx="4953000" cy="4400550"/>
                     </a:xfrm>
                     <a:prstGeom prst="rect">
                       <a:avLst/>
@@ -8194,7 +8211,7 @@
           <w:sz w:val="18"/>
           <w:szCs w:val="18"/>
         </w:rPr>
-        <w:t xml:space="preserve">v1.2 | round 1 | round 2: the guineafowl near (top) and at middle distance (bottom).</w:t>
+        <w:t xml:space="preserve">v1.2 | round 1 | round 2: the Dubbelloop (top) and the Pomp (bottom).</w:t>
       </w:r>
     </w:p>
     <w:p>
@@ -8206,7 +8223,7 @@
       <w:r>
         <w:drawing>
           <wp:inline distT="0" distB="0" distL="0" distR="0">
-            <wp:extent cx="6115050" cy="1933575"/>
+            <wp:extent cx="6115050" cy="3028950"/>
             <wp:effectExtent t="0" r="0" b="0" l="0"/>
             <wp:docPr id="1" name="" descr="" title=""/>
             <wp:cNvGraphicFramePr>
@@ -8231,6 +8248,69 @@
                   <pic:spPr bwMode="auto">
                     <a:xfrm>
                       <a:off x="0" y="0"/>
+                      <a:ext cx="6115050" cy="3028950"/>
+                    </a:xfrm>
+                    <a:prstGeom prst="rect">
+                      <a:avLst/>
+                    </a:prstGeom>
+                  </pic:spPr>
+                </pic:pic>
+              </a:graphicData>
+            </a:graphic>
+          </wp:inline>
+        </w:drawing>
+      </w:r>
+    </w:p>
+    <w:p>
+      <w:pPr>
+        <w:spacing w:after="240"/>
+        <w:jc w:val="center"/>
+      </w:pPr>
+      <w:r>
+        <w:rPr>
+          <w:i/>
+          <w:iCs/>
+          <w:color w:val="6B6B6B"/>
+          <w:sz w:val="18"/>
+          <w:szCs w:val="18"/>
+        </w:rPr>
+        <w:t xml:space="preserve">v1.2 | round 1 | round 2: the guineafowl near (top) and at middle distance (bottom).</w:t>
+      </w:r>
+    </w:p>
+    <w:p>
+      <w:pPr>
+        <w:keepNext/>
+        <w:spacing w:after="60" w:before="160"/>
+        <w:jc w:val="center"/>
+      </w:pPr>
+      <w:r>
+        <w:drawing>
+          <wp:inline distT="0" distB="0" distL="0" distR="0">
+            <wp:extent cx="6115050" cy="1933575"/>
+            <wp:effectExtent t="0" r="0" b="0" l="0"/>
+            <wp:docPr id="1" name="" descr="" title=""/>
+            <wp:cNvGraphicFramePr>
+              <a:graphicFrameLocks xmlns:a="http://schemas.openxmlformats.org/drawingml/2006/main" noChangeAspect="1"/>
+            </wp:cNvGraphicFramePr>
+            <a:graphic xmlns:a="http://schemas.openxmlformats.org/drawingml/2006/main">
+              <a:graphicData uri="http://schemas.openxmlformats.org/drawingml/2006/picture">
+                <pic:pic xmlns:pic="http://schemas.openxmlformats.org/drawingml/2006/picture">
+                  <pic:nvPicPr>
+                    <pic:cNvPr id="0" name="" descr=""/>
+                    <pic:cNvPicPr>
+                      <a:picLocks noChangeAspect="1" noChangeArrowheads="1"/>
+                    </pic:cNvPicPr>
+                  </pic:nvPicPr>
+                  <pic:blipFill>
+                    <a:blip r:embed="rId53" cstate="none"/>
+                    <a:srcRect/>
+                    <a:stretch>
+                      <a:fillRect/>
+                    </a:stretch>
+                  </pic:blipFill>
+                  <pic:spPr bwMode="auto">
+                    <a:xfrm>
+                      <a:off x="0" y="0"/>
                       <a:ext cx="6115050" cy="1933575"/>
                     </a:xfrm>
                     <a:prstGeom prst="rect">
@@ -8258,6 +8338,132 @@
           <w:szCs w:val="18"/>
         </w:rPr>
         <w:t xml:space="preserve">Round 2: rounded Karoo koppies (top) and Kalahari dunes with curved crests (bottom).</w:t>
+      </w:r>
+    </w:p>
+    <w:p>
+      <w:pPr>
+        <w:keepNext/>
+        <w:spacing w:after="60" w:before="160"/>
+        <w:jc w:val="center"/>
+      </w:pPr>
+      <w:r>
+        <w:drawing>
+          <wp:inline distT="0" distB="0" distL="0" distR="0">
+            <wp:extent cx="6115050" cy="1714500"/>
+            <wp:effectExtent t="0" r="0" b="0" l="0"/>
+            <wp:docPr id="1" name="" descr="" title=""/>
+            <wp:cNvGraphicFramePr>
+              <a:graphicFrameLocks xmlns:a="http://schemas.openxmlformats.org/drawingml/2006/main" noChangeAspect="1"/>
+            </wp:cNvGraphicFramePr>
+            <a:graphic xmlns:a="http://schemas.openxmlformats.org/drawingml/2006/main">
+              <a:graphicData uri="http://schemas.openxmlformats.org/drawingml/2006/picture">
+                <pic:pic xmlns:pic="http://schemas.openxmlformats.org/drawingml/2006/picture">
+                  <pic:nvPicPr>
+                    <pic:cNvPr id="0" name="" descr=""/>
+                    <pic:cNvPicPr>
+                      <a:picLocks noChangeAspect="1" noChangeArrowheads="1"/>
+                    </pic:cNvPicPr>
+                  </pic:nvPicPr>
+                  <pic:blipFill>
+                    <a:blip r:embed="rId54" cstate="none"/>
+                    <a:srcRect/>
+                    <a:stretch>
+                      <a:fillRect/>
+                    </a:stretch>
+                  </pic:blipFill>
+                  <pic:spPr bwMode="auto">
+                    <a:xfrm>
+                      <a:off x="0" y="0"/>
+                      <a:ext cx="6115050" cy="1714500"/>
+                    </a:xfrm>
+                    <a:prstGeom prst="rect">
+                      <a:avLst/>
+                    </a:prstGeom>
+                  </pic:spPr>
+                </pic:pic>
+              </a:graphicData>
+            </a:graphic>
+          </wp:inline>
+        </w:drawing>
+      </w:r>
+    </w:p>
+    <w:p>
+      <w:pPr>
+        <w:spacing w:after="240"/>
+        <w:jc w:val="center"/>
+      </w:pPr>
+      <w:r>
+        <w:rPr>
+          <w:i/>
+          <w:iCs/>
+          <w:color w:val="6B6B6B"/>
+          <w:sz w:val="18"/>
+          <w:szCs w:val="18"/>
+        </w:rPr>
+        <w:t xml:space="preserve">Before | after, in the game: the Karoo at the start of a hunt.</w:t>
+      </w:r>
+    </w:p>
+    <w:p>
+      <w:pPr>
+        <w:keepNext/>
+        <w:spacing w:after="60" w:before="160"/>
+        <w:jc w:val="center"/>
+      </w:pPr>
+      <w:r>
+        <w:drawing>
+          <wp:inline distT="0" distB="0" distL="0" distR="0">
+            <wp:extent cx="6115050" cy="2771775"/>
+            <wp:effectExtent t="0" r="0" b="0" l="0"/>
+            <wp:docPr id="1" name="" descr="" title=""/>
+            <wp:cNvGraphicFramePr>
+              <a:graphicFrameLocks xmlns:a="http://schemas.openxmlformats.org/drawingml/2006/main" noChangeAspect="1"/>
+            </wp:cNvGraphicFramePr>
+            <a:graphic xmlns:a="http://schemas.openxmlformats.org/drawingml/2006/main">
+              <a:graphicData uri="http://schemas.openxmlformats.org/drawingml/2006/picture">
+                <pic:pic xmlns:pic="http://schemas.openxmlformats.org/drawingml/2006/picture">
+                  <pic:nvPicPr>
+                    <pic:cNvPr id="0" name="" descr=""/>
+                    <pic:cNvPicPr>
+                      <a:picLocks noChangeAspect="1" noChangeArrowheads="1"/>
+                    </pic:cNvPicPr>
+                  </pic:nvPicPr>
+                  <pic:blipFill>
+                    <a:blip r:embed="rId55" cstate="none"/>
+                    <a:srcRect/>
+                    <a:stretch>
+                      <a:fillRect/>
+                    </a:stretch>
+                  </pic:blipFill>
+                  <pic:spPr bwMode="auto">
+                    <a:xfrm>
+                      <a:off x="0" y="0"/>
+                      <a:ext cx="6115050" cy="2771775"/>
+                    </a:xfrm>
+                    <a:prstGeom prst="rect">
+                      <a:avLst/>
+                    </a:prstGeom>
+                  </pic:spPr>
+                </pic:pic>
+              </a:graphicData>
+            </a:graphic>
+          </wp:inline>
+        </w:drawing>
+      </w:r>
+    </w:p>
+    <w:p>
+      <w:pPr>
+        <w:spacing w:after="240"/>
+        <w:jc w:val="center"/>
+      </w:pPr>
+      <w:r>
+        <w:rPr>
+          <w:i/>
+          <w:iCs/>
+          <w:color w:val="6B6B6B"/>
+          <w:sz w:val="18"/>
+          <w:szCs w:val="18"/>
+        </w:rPr>
+        <w:t xml:space="preserve">The Skiet-Skuur gun cards with their new pictures, on an iPhone 14 held sideways.</w:t>
       </w:r>
     </w:p>
     <w:p>
@@ -8872,7 +9078,7 @@
                 <w:sz w:val="19"/>
                 <w:szCs w:val="19"/>
               </w:rPr>
-              <w:t xml:space="preserve">Graphics pass 3 (#49): rounds 1 and 2 done, being reviewed and merged</w:t>
+              <w:t xml:space="preserve">Graphics pass 3, merged at 17:58 (#49) after two look rounds and a code review</w:t>
             </w:r>
           </w:p>
         </w:tc>
@@ -9469,7 +9675,7 @@
                 <w:sz w:val="19"/>
                 <w:szCs w:val="19"/>
               </w:rPr>
-              <w:t xml:space="preserve">Graphics pass 3</w:t>
+              <w:t xml:space="preserve">v1.3 Long range (running since 18:00, 23 Oct)</w:t>
             </w:r>
           </w:p>
         </w:tc>
@@ -9500,7 +9706,7 @@
                 <w:sz w:val="19"/>
                 <w:szCs w:val="19"/>
               </w:rPr>
-              <w:t xml:space="preserve">Finish round 2, before/after screenshots to the product owner, review, merge</w:t>
+              <w:t xml:space="preserve">First a memory fix (gun pictures freed after a hunt); a far layer only rifles reach; iron sight 1.5×, peep 2×, small scope 4×; hold to zoom with sway; the .22 (Die Twee-Twee); bonus maps Nog Verder and Die Verste</w:t>
             </w:r>
           </w:p>
         </w:tc>
@@ -9562,136 +9768,7 @@
                 <w:sz w:val="19"/>
                 <w:szCs w:val="19"/>
               </w:rPr>
-              <w:t xml:space="preserve">about 17:00–18:00 UTC, 23 Oct</w:t>
-            </w:r>
-          </w:p>
-        </w:tc>
-      </w:tr>
-      <w:tr>
-        <w:trPr>
-          <w:cantSplit/>
-        </w:trPr>
-        <w:tc>
-          <w:tcPr>
-            <w:tcW w:type="dxa" w:w="1927"/>
-            <w:tcBorders>
-              <w:top w:val="single" w:color="D8CBB0" w:sz="4"/>
-              <w:left w:val="single" w:color="D8CBB0" w:sz="4"/>
-              <w:bottom w:val="single" w:color="D8CBB0" w:sz="4"/>
-              <w:right w:val="single" w:color="D8CBB0" w:sz="4"/>
-            </w:tcBorders>
-            <w:tcMar>
-              <w:top w:type="dxa" w:w="60"/>
-              <w:left w:type="dxa" w:w="100"/>
-              <w:bottom w:type="dxa" w:w="60"/>
-              <w:right w:type="dxa" w:w="100"/>
-            </w:tcMar>
-          </w:tcPr>
-          <w:p>
-            <w:pPr>
-              <w:spacing w:line="252"/>
-            </w:pPr>
-            <w:r>
-              <w:rPr>
-                <w:b w:val="false"/>
-                <w:bCs w:val="false"/>
-                <w:sz w:val="19"/>
-                <w:szCs w:val="19"/>
-              </w:rPr>
-              <w:t xml:space="preserve">v1.3 Long range</w:t>
-            </w:r>
-          </w:p>
-        </w:tc>
-        <w:tc>
-          <w:tcPr>
-            <w:tcW w:type="dxa" w:w="5011"/>
-            <w:tcBorders>
-              <w:top w:val="single" w:color="D8CBB0" w:sz="4"/>
-              <w:left w:val="single" w:color="D8CBB0" w:sz="4"/>
-              <w:bottom w:val="single" w:color="D8CBB0" w:sz="4"/>
-              <w:right w:val="single" w:color="D8CBB0" w:sz="4"/>
-            </w:tcBorders>
-            <w:tcMar>
-              <w:top w:type="dxa" w:w="60"/>
-              <w:left w:type="dxa" w:w="100"/>
-              <w:bottom w:type="dxa" w:w="60"/>
-              <w:right w:type="dxa" w:w="100"/>
-            </w:tcMar>
-          </w:tcPr>
-          <w:p>
-            <w:pPr>
-              <w:spacing w:line="252"/>
-            </w:pPr>
-            <w:r>
-              <w:rPr>
-                <w:b w:val="false"/>
-                <w:bCs w:val="false"/>
-                <w:sz w:val="19"/>
-                <w:szCs w:val="19"/>
-              </w:rPr>
-              <w:t xml:space="preserve">A far layer only rifles reach; iron sight 1.5×, peep 2×, small scope 4×; hold to zoom with sway; the .22 (Die Twee-Twee); bonus maps Nog Verder and Die Verste</w:t>
-            </w:r>
-          </w:p>
-        </w:tc>
-        <w:tc>
-          <w:tcPr>
-            <w:tcW w:type="dxa" w:w="963"/>
-            <w:tcBorders>
-              <w:top w:val="single" w:color="D8CBB0" w:sz="4"/>
-              <w:left w:val="single" w:color="D8CBB0" w:sz="4"/>
-              <w:bottom w:val="single" w:color="D8CBB0" w:sz="4"/>
-              <w:right w:val="single" w:color="D8CBB0" w:sz="4"/>
-            </w:tcBorders>
-            <w:tcMar>
-              <w:top w:type="dxa" w:w="60"/>
-              <w:left w:type="dxa" w:w="100"/>
-              <w:bottom w:type="dxa" w:w="60"/>
-              <w:right w:type="dxa" w:w="100"/>
-            </w:tcMar>
-          </w:tcPr>
-          <w:p>
-            <w:pPr>
-              <w:spacing w:line="252"/>
-            </w:pPr>
-            <w:r>
-              <w:rPr>
-                <w:b w:val="false"/>
-                <w:bCs w:val="false"/>
-                <w:sz w:val="19"/>
-                <w:szCs w:val="19"/>
-              </w:rPr>
-              <w:t xml:space="preserve">Tank</w:t>
-            </w:r>
-          </w:p>
-        </w:tc>
-        <w:tc>
-          <w:tcPr>
-            <w:tcW w:type="dxa" w:w="1737"/>
-            <w:tcBorders>
-              <w:top w:val="single" w:color="D8CBB0" w:sz="4"/>
-              <w:left w:val="single" w:color="D8CBB0" w:sz="4"/>
-              <w:bottom w:val="single" w:color="D8CBB0" w:sz="4"/>
-              <w:right w:val="single" w:color="D8CBB0" w:sz="4"/>
-            </w:tcBorders>
-            <w:tcMar>
-              <w:top w:type="dxa" w:w="60"/>
-              <w:left w:type="dxa" w:w="100"/>
-              <w:bottom w:type="dxa" w:w="60"/>
-              <w:right w:type="dxa" w:w="100"/>
-            </w:tcMar>
-          </w:tcPr>
-          <w:p>
-            <w:pPr>
-              <w:spacing w:line="252"/>
-            </w:pPr>
-            <w:r>
-              <w:rPr>
-                <w:b w:val="false"/>
-                <w:bCs w:val="false"/>
-                <w:sz w:val="19"/>
-                <w:szCs w:val="19"/>
-              </w:rPr>
-              <w:t xml:space="preserve">6–8 h</w:t>
+              <w:t xml:space="preserve">6–8 h, about 02:00–04:00 UTC on 24 Oct</w:t>
             </w:r>
           </w:p>
         </w:tc>

</xml_diff>

<commit_message>
docs(history): v1.3 and the GitHub baselines stage; build board generator
- Development history: new stages for #55 (screenshot baselines recorded on GitHub) and v1.3
  long range (#53, #54) with six screenshots, updated figures, requests, next steps and D-036.
  The Word document is rebuilt.
- docs/history/board: the generator and state behind the build board (gen.py now finds the repo
  itself; its JSON output is not committed).

Co-Authored-By: Claude Opus 5.5 <noreply@anthropic.com>
Claude-Session: https://claude.ai/code/session_01X9BKcABj5FscZbGJZnCiA3
</commit_message>
<xml_diff>
--- a/docs/history/Tarantal-Development-History.docx
+++ b/docs/history/Tarantal-Development-History.docx
@@ -127,7 +127,7 @@
           <w:sz w:val="24"/>
           <w:szCs w:val="24"/>
         </w:rPr>
-        <w:t xml:space="preserve">19–23 October 2026</w:t>
+        <w:t xml:space="preserve">19–24 October 2026</w:t>
       </w:r>
     </w:p>
     <w:p>
@@ -141,7 +141,7 @@
           <w:sz w:val="20"/>
           <w:szCs w:val="20"/>
         </w:rPr>
-        <w:t xml:space="preserve">Last updated 23 October 2026, 18:10 UTC</w:t>
+        <w:t xml:space="preserve">Last updated 24 October 2026, 02:40 UTC</w:t>
       </w:r>
     </w:p>
     <w:p>
@@ -403,7 +403,7 @@
                 <w:sz w:val="19"/>
                 <w:szCs w:val="19"/>
               </w:rPr>
-              <w:t xml:space="preserve">4</w:t>
+              <w:t xml:space="preserve">5</w:t>
             </w:r>
           </w:p>
         </w:tc>
@@ -470,7 +470,7 @@
                 <w:sz w:val="19"/>
                 <w:szCs w:val="19"/>
               </w:rPr>
-              <w:t xml:space="preserve">524</w:t>
+              <w:t xml:space="preserve">575</w:t>
             </w:r>
           </w:p>
         </w:tc>
@@ -537,7 +537,7 @@
                 <w:sz w:val="19"/>
                 <w:szCs w:val="19"/>
               </w:rPr>
-              <w:t xml:space="preserve">51 opened, all merged</w:t>
+              <w:t xml:space="preserve">54 opened, all merged</w:t>
             </w:r>
           </w:p>
         </w:tc>
@@ -604,7 +604,7 @@
                 <w:sz w:val="19"/>
                 <w:szCs w:val="19"/>
               </w:rPr>
-              <w:t xml:space="preserve">about 31,000 lines</w:t>
+              <w:t xml:space="preserve">about 33,500 lines</w:t>
             </w:r>
           </w:p>
         </w:tc>
@@ -671,7 +671,7 @@
                 <w:sz w:val="19"/>
                 <w:szCs w:val="19"/>
               </w:rPr>
-              <w:t xml:space="preserve">851 unit tests in 94 files, 35 browser test suites on 3 device profiles</w:t>
+              <w:t xml:space="preserve">908 unit tests, 37 browser test suites on 3 device profiles</w:t>
             </w:r>
           </w:p>
         </w:tc>
@@ -738,7 +738,7 @@
                 <w:sz w:val="19"/>
                 <w:szCs w:val="19"/>
               </w:rPr>
-              <w:t xml:space="preserve">4 (Karoo, Bushveld, Okavango, Kalahari), each with 7 weekday maps and a bonus map</w:t>
+              <w:t xml:space="preserve">4 (Karoo, Bushveld, Okavango, Kalahari), each with 7 weekday maps and 3 bonus maps (Verder, Nog Verder, Die Verste)</w:t>
             </w:r>
           </w:p>
         </w:tc>
@@ -805,7 +805,7 @@
                 <w:sz w:val="19"/>
                 <w:szCs w:val="19"/>
               </w:rPr>
-              <w:t xml:space="preserve">6 (Dubbelloop, Windbuks, Kettie, Plaas-Pomp, Voorlaaier, Mielie-Masjien)</w:t>
+              <w:t xml:space="preserve">7 (Dubbelloop, Windbuks, Kettie, Plaas-Pomp, Die Twee-Twee with 3 sights, Voorlaaier, Mielie-Masjien)</w:t>
             </w:r>
           </w:p>
         </w:tc>
@@ -1006,7 +1006,7 @@
                 <w:sz w:val="19"/>
                 <w:szCs w:val="19"/>
               </w:rPr>
-              <w:t xml:space="preserve">35 (D-001 to D-035)</w:t>
+              <w:t xml:space="preserve">36 (D-001 to D-036)</w:t>
             </w:r>
           </w:p>
         </w:tc>
@@ -1314,7 +1314,7 @@
                 <w:sz w:val="19"/>
                 <w:szCs w:val="19"/>
               </w:rPr>
-              <w:t xml:space="preserve">Writes each job’s brief, checks in every 20 minutes, reviews looks and code, fixes small test and CI problems, merges on green tests, keeps the status doc and this history current</w:t>
+              <w:t xml:space="preserve">Writes each job’s brief, checks in every 10 minutes (with an hourly backup check), reviews looks and code, fixes small test and CI problems, merges on green tests, keeps the status doc and this history current</w:t>
             </w:r>
           </w:p>
         </w:tc>
@@ -1381,7 +1381,7 @@
                 <w:sz w:val="19"/>
                 <w:szCs w:val="19"/>
               </w:rPr>
-              <w:t xml:space="preserve">Runs the tests on every pull request (about 15 minutes) and the full suite on every merge; publishes the test build to GitHub Pages</w:t>
+              <w:t xml:space="preserve">Runs the tests on every pull request (about 15 minutes) and the full suite on every merge; records the visual-test screenshots; publishes the test build to GitHub Pages</w:t>
             </w:r>
           </w:p>
         </w:tc>
@@ -3975,6 +3975,202 @@
           </w:p>
         </w:tc>
       </w:tr>
+      <w:tr>
+        <w:trPr>
+          <w:cantSplit/>
+        </w:trPr>
+        <w:tc>
+          <w:tcPr>
+            <w:tcW w:type="dxa" w:w="2698"/>
+            <w:tcBorders>
+              <w:top w:val="single" w:color="D8CBB0" w:sz="4"/>
+              <w:left w:val="single" w:color="D8CBB0" w:sz="4"/>
+              <w:bottom w:val="single" w:color="D8CBB0" w:sz="4"/>
+              <w:right w:val="single" w:color="D8CBB0" w:sz="4"/>
+            </w:tcBorders>
+            <w:tcMar>
+              <w:top w:type="dxa" w:w="60"/>
+              <w:left w:type="dxa" w:w="100"/>
+              <w:bottom w:type="dxa" w:w="60"/>
+              <w:right w:type="dxa" w:w="100"/>
+            </w:tcMar>
+          </w:tcPr>
+          <w:p>
+            <w:pPr>
+              <w:spacing w:line="252"/>
+            </w:pPr>
+            <w:r>
+              <w:rPr>
+                <w:b w:val="false"/>
+                <w:bCs w:val="false"/>
+                <w:sz w:val="19"/>
+                <w:szCs w:val="19"/>
+              </w:rPr>
+              <w:t xml:space="preserve">23 Oct 2026, 21:20</w:t>
+            </w:r>
+          </w:p>
+        </w:tc>
+        <w:tc>
+          <w:tcPr>
+            <w:tcW w:type="dxa" w:w="4819"/>
+            <w:tcBorders>
+              <w:top w:val="single" w:color="D8CBB0" w:sz="4"/>
+              <w:left w:val="single" w:color="D8CBB0" w:sz="4"/>
+              <w:bottom w:val="single" w:color="D8CBB0" w:sz="4"/>
+              <w:right w:val="single" w:color="D8CBB0" w:sz="4"/>
+            </w:tcBorders>
+            <w:tcMar>
+              <w:top w:type="dxa" w:w="60"/>
+              <w:left w:type="dxa" w:w="100"/>
+              <w:bottom w:type="dxa" w:w="60"/>
+              <w:right w:type="dxa" w:w="100"/>
+            </w:tcMar>
+          </w:tcPr>
+          <w:p>
+            <w:pPr>
+              <w:spacing w:line="252"/>
+            </w:pPr>
+            <w:r>
+              <w:rPr>
+                <w:b w:val="false"/>
+                <w:bCs w:val="false"/>
+                <w:sz w:val="19"/>
+                <w:szCs w:val="19"/>
+              </w:rPr>
+              <w:t xml:space="preserve">Screenshot baselines recorded on GitHub</w:t>
+            </w:r>
+          </w:p>
+        </w:tc>
+        <w:tc>
+          <w:tcPr>
+            <w:tcW w:type="dxa" w:w="2121"/>
+            <w:tcBorders>
+              <w:top w:val="single" w:color="D8CBB0" w:sz="4"/>
+              <w:left w:val="single" w:color="D8CBB0" w:sz="4"/>
+              <w:bottom w:val="single" w:color="D8CBB0" w:sz="4"/>
+              <w:right w:val="single" w:color="D8CBB0" w:sz="4"/>
+            </w:tcBorders>
+            <w:tcMar>
+              <w:top w:type="dxa" w:w="60"/>
+              <w:left w:type="dxa" w:w="100"/>
+              <w:bottom w:type="dxa" w:w="60"/>
+              <w:right w:type="dxa" w:w="100"/>
+            </w:tcMar>
+          </w:tcPr>
+          <w:p>
+            <w:pPr>
+              <w:spacing w:line="252"/>
+            </w:pPr>
+            <w:r>
+              <w:rPr>
+                <w:b w:val="false"/>
+                <w:bCs w:val="false"/>
+                <w:sz w:val="19"/>
+                <w:szCs w:val="19"/>
+              </w:rPr>
+              <w:t xml:space="preserve">#55</w:t>
+            </w:r>
+          </w:p>
+        </w:tc>
+      </w:tr>
+      <w:tr>
+        <w:trPr>
+          <w:cantSplit/>
+        </w:trPr>
+        <w:tc>
+          <w:tcPr>
+            <w:tcW w:type="dxa" w:w="2698"/>
+            <w:tcBorders>
+              <w:top w:val="single" w:color="D8CBB0" w:sz="4"/>
+              <w:left w:val="single" w:color="D8CBB0" w:sz="4"/>
+              <w:bottom w:val="single" w:color="D8CBB0" w:sz="4"/>
+              <w:right w:val="single" w:color="D8CBB0" w:sz="4"/>
+            </w:tcBorders>
+            <w:tcMar>
+              <w:top w:type="dxa" w:w="60"/>
+              <w:left w:type="dxa" w:w="100"/>
+              <w:bottom w:type="dxa" w:w="60"/>
+              <w:right w:type="dxa" w:w="100"/>
+            </w:tcMar>
+          </w:tcPr>
+          <w:p>
+            <w:pPr>
+              <w:spacing w:line="252"/>
+            </w:pPr>
+            <w:r>
+              <w:rPr>
+                <w:b w:val="false"/>
+                <w:bCs w:val="false"/>
+                <w:sz w:val="19"/>
+                <w:szCs w:val="19"/>
+              </w:rPr>
+              <w:t xml:space="preserve">24 Oct 2026, 02:24 (started 23 Oct, 18:00; part A merged 02:14)</w:t>
+            </w:r>
+          </w:p>
+        </w:tc>
+        <w:tc>
+          <w:tcPr>
+            <w:tcW w:type="dxa" w:w="4819"/>
+            <w:tcBorders>
+              <w:top w:val="single" w:color="D8CBB0" w:sz="4"/>
+              <w:left w:val="single" w:color="D8CBB0" w:sz="4"/>
+              <w:bottom w:val="single" w:color="D8CBB0" w:sz="4"/>
+              <w:right w:val="single" w:color="D8CBB0" w:sz="4"/>
+            </w:tcBorders>
+            <w:tcMar>
+              <w:top w:type="dxa" w:w="60"/>
+              <w:left w:type="dxa" w:w="100"/>
+              <w:bottom w:type="dxa" w:w="60"/>
+              <w:right w:type="dxa" w:w="100"/>
+            </w:tcMar>
+          </w:tcPr>
+          <w:p>
+            <w:pPr>
+              <w:spacing w:line="252"/>
+            </w:pPr>
+            <w:r>
+              <w:rPr>
+                <w:b w:val="false"/>
+                <w:bCs w:val="false"/>
+                <w:sz w:val="19"/>
+                <w:szCs w:val="19"/>
+              </w:rPr>
+              <w:t xml:space="preserve">v1.3 — Long range: the Ver plane, sights and zoom, Die Twee-Twee</w:t>
+            </w:r>
+          </w:p>
+        </w:tc>
+        <w:tc>
+          <w:tcPr>
+            <w:tcW w:type="dxa" w:w="2121"/>
+            <w:tcBorders>
+              <w:top w:val="single" w:color="D8CBB0" w:sz="4"/>
+              <w:left w:val="single" w:color="D8CBB0" w:sz="4"/>
+              <w:bottom w:val="single" w:color="D8CBB0" w:sz="4"/>
+              <w:right w:val="single" w:color="D8CBB0" w:sz="4"/>
+            </w:tcBorders>
+            <w:tcMar>
+              <w:top w:type="dxa" w:w="60"/>
+              <w:left w:type="dxa" w:w="100"/>
+              <w:bottom w:type="dxa" w:w="60"/>
+              <w:right w:type="dxa" w:w="100"/>
+            </w:tcMar>
+          </w:tcPr>
+          <w:p>
+            <w:pPr>
+              <w:spacing w:line="252"/>
+            </w:pPr>
+            <w:r>
+              <w:rPr>
+                <w:b w:val="false"/>
+                <w:bCs w:val="false"/>
+                <w:sz w:val="19"/>
+                <w:szCs w:val="19"/>
+              </w:rPr>
+              <w:t xml:space="preserve">#53, #54</w:t>
+            </w:r>
+          </w:p>
+        </w:tc>
+      </w:tr>
     </w:tbl>
     <w:p>
       <w:pPr>
@@ -8468,6 +8664,703 @@
     </w:p>
     <w:p>
       <w:pPr>
+        <w:pStyle w:val="Heading2"/>
+        <w:keepNext/>
+      </w:pPr>
+      <w:r>
+        <w:t xml:space="preserve">Screenshot baselines recorded on GitHub</w:t>
+      </w:r>
+    </w:p>
+    <w:p>
+      <w:pPr>
+        <w:spacing w:after="120"/>
+        <w:rPr>
+          <w:color w:val="6B6B6B"/>
+          <w:sz w:val="18"/>
+          <w:szCs w:val="18"/>
+        </w:rPr>
+      </w:pPr>
+      <w:r>
+        <w:rPr>
+          <w:color w:val="6B6B6B"/>
+          <w:sz w:val="18"/>
+          <w:szCs w:val="18"/>
+        </w:rPr>
+        <w:t xml:space="preserve">When: 23 Oct 2026, 21:20   ·   Pull requests: #55   ·   Decision: D-030</w:t>
+      </w:r>
+    </w:p>
+    <w:p>
+      <w:pPr>
+        <w:spacing w:after="120" w:line="276"/>
+      </w:pPr>
+      <w:r>
+        <w:t xml:space="preserve">The visual tests compare each screen with a stored screenshot. Those reference screenshots are now taken by GitHub, not on the build server.</w:t>
+      </w:r>
+    </w:p>
+    <w:p>
+      <w:pPr>
+        <w:keepNext/>
+        <w:spacing w:after="80" w:before="160"/>
+      </w:pPr>
+      <w:r>
+        <w:rPr>
+          <w:b/>
+          <w:bCs/>
+          <w:color w:val="B7791F"/>
+          <w:sz w:val="20"/>
+          <w:szCs w:val="20"/>
+        </w:rPr>
+        <w:t xml:space="preserve">What the product owner asked for</w:t>
+      </w:r>
+    </w:p>
+    <w:p>
+      <w:pPr>
+        <w:pBdr>
+          <w:left w:val="single" w:color="B7791F" w:sz="18" w:space="8"/>
+        </w:pBdr>
+        <w:shd w:fill="F3ECDD" w:color="auto" w:val="clear"/>
+        <w:spacing w:after="160" w:before="60" w:line="264"/>
+        <w:ind w:left="240" w:right="120"/>
+      </w:pPr>
+      <w:r>
+        <w:rPr>
+          <w:sz w:val="20"/>
+          <w:szCs w:val="20"/>
+        </w:rPr>
+        <w:t xml:space="preserve">"yes, let GitHub record the screenshot baselines" (23 Oct, about 20:50)</w:t>
+      </w:r>
+    </w:p>
+    <w:p>
+      <w:pPr>
+        <w:keepNext/>
+        <w:spacing w:after="80" w:before="160"/>
+      </w:pPr>
+      <w:r>
+        <w:rPr>
+          <w:b/>
+          <w:bCs/>
+          <w:color w:val="B7791F"/>
+          <w:sz w:val="20"/>
+          <w:szCs w:val="20"/>
+        </w:rPr>
+        <w:t xml:space="preserve">What it added</w:t>
+      </w:r>
+    </w:p>
+    <w:p>
+      <w:pPr>
+        <w:pStyle w:val="ListParagraph"/>
+        <w:numPr>
+          <w:ilvl w:val="0"/>
+          <w:numId w:val="2"/>
+        </w:numPr>
+        <w:spacing w:after="60" w:line="264"/>
+      </w:pPr>
+      <w:r>
+        <w:t xml:space="preserve">Label a pull request update-baselines (or start the workflow by hand): GitHub renders the screens in the same browser image as the tests, commits the ones that changed to the branch and re-runs the tests.</w:t>
+      </w:r>
+    </w:p>
+    <w:p>
+      <w:pPr>
+        <w:pStyle w:val="ListParagraph"/>
+        <w:numPr>
+          <w:ilvl w:val="0"/>
+          <w:numId w:val="2"/>
+        </w:numPr>
+        <w:spacing w:after="60" w:line="264"/>
+      </w:pPr>
+      <w:r>
+        <w:t xml:space="preserve">The heavy screenshot container no longer runs on Tank’s server, which had been the slowest step there, and every machine now compares against the same pictures.</w:t>
+      </w:r>
+    </w:p>
+    <w:p>
+      <w:pPr>
+        <w:pStyle w:val="Heading2"/>
+        <w:keepNext/>
+      </w:pPr>
+      <w:r>
+        <w:t xml:space="preserve">v1.3 — Long range: the Ver plane, sights and zoom, Die Twee-Twee</w:t>
+      </w:r>
+    </w:p>
+    <w:p>
+      <w:pPr>
+        <w:spacing w:after="120"/>
+        <w:rPr>
+          <w:color w:val="6B6B6B"/>
+          <w:sz w:val="18"/>
+          <w:szCs w:val="18"/>
+        </w:rPr>
+      </w:pPr>
+      <w:r>
+        <w:rPr>
+          <w:color w:val="6B6B6B"/>
+          <w:sz w:val="18"/>
+          <w:szCs w:val="18"/>
+        </w:rPr>
+        <w:t xml:space="preserve">When: 24 Oct 2026, 02:24 (started 23 Oct, 18:00; part A merged 02:14)   ·   Pull requests: #53, #54   ·   Decision: D-036</w:t>
+      </w:r>
+    </w:p>
+    <w:p>
+      <w:pPr>
+        <w:spacing w:after="120" w:line="276"/>
+      </w:pPr>
+      <w:r>
+        <w:t xml:space="preserve">The first rifle. A new farthest layer of the landscape that only rifles can reach, sights that zoom when you hold, and two harder bonus maps.</w:t>
+      </w:r>
+    </w:p>
+    <w:p>
+      <w:pPr>
+        <w:keepNext/>
+        <w:spacing w:after="80" w:before="160"/>
+      </w:pPr>
+      <w:r>
+        <w:rPr>
+          <w:b/>
+          <w:bCs/>
+          <w:color w:val="B7791F"/>
+          <w:sz w:val="20"/>
+          <w:szCs w:val="20"/>
+        </w:rPr>
+        <w:t xml:space="preserve">Look review and independent review before merging</w:t>
+      </w:r>
+    </w:p>
+    <w:p>
+      <w:pPr>
+        <w:pBdr>
+          <w:left w:val="single" w:color="B7791F" w:sz="18" w:space="8"/>
+        </w:pBdr>
+        <w:shd w:fill="F3ECDD" w:color="auto" w:val="clear"/>
+        <w:spacing w:after="0" w:before="60" w:line="264"/>
+        <w:ind w:left="240" w:right="120"/>
+      </w:pPr>
+      <w:r>
+        <w:rPr>
+          <w:sz w:val="20"/>
+          <w:szCs w:val="20"/>
+        </w:rPr>
+        <w:t xml:space="preserve">Claude’s look review: the scope and peep looked right; the iron sight’s rear leaf covered too much of the view and its front post was a hairline. Redrawn with a slim leaf and a broad, lit post; the dark area fell from about 35–40 % of the view to 13–15 %.</w:t>
+      </w:r>
+    </w:p>
+    <w:p>
+      <w:pPr>
+        <w:pBdr>
+          <w:left w:val="single" w:color="B7791F" w:sz="18" w:space="8"/>
+        </w:pBdr>
+        <w:shd w:fill="F3ECDD" w:color="auto" w:val="clear"/>
+        <w:spacing w:after="0" w:before="0" w:line="264"/>
+        <w:ind w:left="240" w:right="120"/>
+      </w:pPr>
+      <w:r>
+        <w:rPr>
+          <w:sz w:val="20"/>
+          <w:szCs w:val="20"/>
+        </w:rPr>
+        <w:t xml:space="preserve">The independent review found that the rifle test bot never shot crates or secrets, so the first balance figures were wrong. With the bot fixed, the .22 and the bonus maps were retuned (Nog Verder ×0.6, Die Verste ×0.46). It also restored the approved rule that Die Verste needs a scope and fixed the bonus-map names, a mid-hunt stutter when a crate gun loaded, the rifle hints in four languages and the replay tool’s file format.</w:t>
+      </w:r>
+    </w:p>
+    <w:p>
+      <w:pPr>
+        <w:pBdr>
+          <w:left w:val="single" w:color="B7791F" w:sz="18" w:space="8"/>
+        </w:pBdr>
+        <w:shd w:fill="F3ECDD" w:color="auto" w:val="clear"/>
+        <w:spacing w:after="160" w:before="0" w:line="264"/>
+        <w:ind w:left="240" w:right="120"/>
+      </w:pPr>
+      <w:r>
+        <w:rPr>
+          <w:sz w:val="20"/>
+          <w:szCs w:val="20"/>
+        </w:rPr>
+        <w:t xml:space="preserve">Speed: the scoped view passes its CPU budget on desktop and Pixel 7. On the phone profile it draws about 2.6 times the pixels of an open hunt, because the far layers all fill the screen when zoomed in; that is tracked in issue #56 for a check on a real phone before v1.4’s stronger scope.</w:t>
+      </w:r>
+    </w:p>
+    <w:p>
+      <w:pPr>
+        <w:keepNext/>
+        <w:spacing w:after="80" w:before="160"/>
+      </w:pPr>
+      <w:r>
+        <w:rPr>
+          <w:b/>
+          <w:bCs/>
+          <w:color w:val="B7791F"/>
+          <w:sz w:val="20"/>
+          <w:szCs w:val="20"/>
+        </w:rPr>
+        <w:t xml:space="preserve">What it added</w:t>
+      </w:r>
+    </w:p>
+    <w:p>
+      <w:pPr>
+        <w:pStyle w:val="ListParagraph"/>
+        <w:numPr>
+          <w:ilvl w:val="0"/>
+          <w:numId w:val="2"/>
+        </w:numPr>
+        <w:spacing w:after="60" w:line="264"/>
+      </w:pPr>
+      <w:r>
+        <w:t xml:space="preserve">Memory first: gun pictures are freed after a hunt on low-end phones, so the game stays under their 128 MB limit (about 106 MB at most, down from 125 MB after a hunt with both crate guns).</w:t>
+      </w:r>
+    </w:p>
+    <w:p>
+      <w:pPr>
+        <w:pStyle w:val="ListParagraph"/>
+        <w:numPr>
+          <w:ilvl w:val="0"/>
+          <w:numId w:val="2"/>
+        </w:numPr>
+        <w:spacing w:after="60" w:line="264"/>
+      </w:pPr>
+      <w:r>
+        <w:t xml:space="preserve">The Ver plane: a farthest layer with its own flocks, feeding spots and fly-overs, reachable only with a rifle.</w:t>
+      </w:r>
+    </w:p>
+    <w:p>
+      <w:pPr>
+        <w:pStyle w:val="ListParagraph"/>
+        <w:numPr>
+          <w:ilvl w:val="0"/>
+          <w:numId w:val="2"/>
+        </w:numPr>
+        <w:spacing w:after="60" w:line="264"/>
+      </w:pPr>
+      <w:r>
+        <w:t xml:space="preserve">Hold to raise the sight and zoom, let go to fire; sway and a breath hold. Iron sight 1.5×, peep 2×, small scope 4×. Sliding onto the ammo (touch) or right-clicking (mouse) lowers it without firing.</w:t>
+      </w:r>
+    </w:p>
+    <w:p>
+      <w:pPr>
+        <w:pStyle w:val="ListParagraph"/>
+        <w:numPr>
+          <w:ilvl w:val="0"/>
+          <w:numId w:val="2"/>
+        </w:numPr>
+        <w:spacing w:after="60" w:line="264"/>
+      </w:pPr>
+      <w:r>
+        <w:t xml:space="preserve">Die Twee-Twee (.22, 5 rounds) with three sights fitted in the Skiet-Skuur and unlocked through rank and the Notaboek.</w:t>
+      </w:r>
+    </w:p>
+    <w:p>
+      <w:pPr>
+        <w:pStyle w:val="ListParagraph"/>
+        <w:numPr>
+          <w:ilvl w:val="0"/>
+          <w:numId w:val="2"/>
+        </w:numPr>
+        <w:spacing w:after="60" w:line="264"/>
+      </w:pPr>
+      <w:r>
+        <w:t xml:space="preserve">Bonus maps Nog Verder and Die Verste; Die Verste needs a rifle with a scope, and its button says so.</w:t>
+      </w:r>
+    </w:p>
+    <w:p>
+      <w:pPr>
+        <w:pStyle w:val="ListParagraph"/>
+        <w:numPr>
+          <w:ilvl w:val="0"/>
+          <w:numId w:val="2"/>
+        </w:numPr>
+        <w:spacing w:after="60" w:line="264"/>
+      </w:pPr>
+      <w:r>
+        <w:t xml:space="preserve">Replays of zoomed shots play out identically on desktop, Pixel 7 and iPhone.</w:t>
+      </w:r>
+    </w:p>
+    <w:p>
+      <w:pPr>
+        <w:pStyle w:val="ListParagraph"/>
+        <w:numPr>
+          <w:ilvl w:val="0"/>
+          <w:numId w:val="2"/>
+        </w:numPr>
+        <w:spacing w:after="60" w:line="264"/>
+      </w:pPr>
+      <w:r>
+        <w:t xml:space="preserve">Balance (500 hunts per bot): the .22 scores below both shotguns on the plain maps (3 971 / 3 849 / 3 620 with iron / peep / scope, against 4 180 and 4 306); on the bonus maps every gun stays under 4 500. First download 2.94 MB of 3 MB; 908 unit tests.</w:t>
+      </w:r>
+    </w:p>
+    <w:p>
+      <w:pPr>
+        <w:keepNext/>
+        <w:spacing w:after="60" w:before="160"/>
+        <w:jc w:val="center"/>
+      </w:pPr>
+      <w:r>
+        <w:drawing>
+          <wp:inline distT="0" distB="0" distL="0" distR="0">
+            <wp:extent cx="6115050" cy="1714500"/>
+            <wp:effectExtent t="0" r="0" b="0" l="0"/>
+            <wp:docPr id="1" name="" descr="" title=""/>
+            <wp:cNvGraphicFramePr>
+              <a:graphicFrameLocks xmlns:a="http://schemas.openxmlformats.org/drawingml/2006/main" noChangeAspect="1"/>
+            </wp:cNvGraphicFramePr>
+            <a:graphic xmlns:a="http://schemas.openxmlformats.org/drawingml/2006/main">
+              <a:graphicData uri="http://schemas.openxmlformats.org/drawingml/2006/picture">
+                <pic:pic xmlns:pic="http://schemas.openxmlformats.org/drawingml/2006/picture">
+                  <pic:nvPicPr>
+                    <pic:cNvPr id="0" name="" descr=""/>
+                    <pic:cNvPicPr>
+                      <a:picLocks noChangeAspect="1" noChangeArrowheads="1"/>
+                    </pic:cNvPicPr>
+                  </pic:nvPicPr>
+                  <pic:blipFill>
+                    <a:blip r:embed="rId56" cstate="none"/>
+                    <a:srcRect/>
+                    <a:stretch>
+                      <a:fillRect/>
+                    </a:stretch>
+                  </pic:blipFill>
+                  <pic:spPr bwMode="auto">
+                    <a:xfrm>
+                      <a:off x="0" y="0"/>
+                      <a:ext cx="6115050" cy="1714500"/>
+                    </a:xfrm>
+                    <a:prstGeom prst="rect">
+                      <a:avLst/>
+                    </a:prstGeom>
+                  </pic:spPr>
+                </pic:pic>
+              </a:graphicData>
+            </a:graphic>
+          </wp:inline>
+        </w:drawing>
+      </w:r>
+    </w:p>
+    <w:p>
+      <w:pPr>
+        <w:spacing w:after="240"/>
+        <w:jc w:val="center"/>
+      </w:pPr>
+      <w:r>
+        <w:rPr>
+          <w:i/>
+          <w:iCs/>
+          <w:color w:val="6B6B6B"/>
+          <w:sz w:val="18"/>
+          <w:szCs w:val="18"/>
+        </w:rPr>
+        <w:t xml:space="preserve">Open view | small scope 4× on Nog Verder, held on a Ver flock (desktop).</w:t>
+      </w:r>
+    </w:p>
+    <w:p>
+      <w:pPr>
+        <w:keepNext/>
+        <w:spacing w:after="60" w:before="160"/>
+        <w:jc w:val="center"/>
+      </w:pPr>
+      <w:r>
+        <w:drawing>
+          <wp:inline distT="0" distB="0" distL="0" distR="0">
+            <wp:extent cx="6115050" cy="1714500"/>
+            <wp:effectExtent t="0" r="0" b="0" l="0"/>
+            <wp:docPr id="1" name="" descr="" title=""/>
+            <wp:cNvGraphicFramePr>
+              <a:graphicFrameLocks xmlns:a="http://schemas.openxmlformats.org/drawingml/2006/main" noChangeAspect="1"/>
+            </wp:cNvGraphicFramePr>
+            <a:graphic xmlns:a="http://schemas.openxmlformats.org/drawingml/2006/main">
+              <a:graphicData uri="http://schemas.openxmlformats.org/drawingml/2006/picture">
+                <pic:pic xmlns:pic="http://schemas.openxmlformats.org/drawingml/2006/picture">
+                  <pic:nvPicPr>
+                    <pic:cNvPr id="0" name="" descr=""/>
+                    <pic:cNvPicPr>
+                      <a:picLocks noChangeAspect="1" noChangeArrowheads="1"/>
+                    </pic:cNvPicPr>
+                  </pic:nvPicPr>
+                  <pic:blipFill>
+                    <a:blip r:embed="rId57" cstate="none"/>
+                    <a:srcRect/>
+                    <a:stretch>
+                      <a:fillRect/>
+                    </a:stretch>
+                  </pic:blipFill>
+                  <pic:spPr bwMode="auto">
+                    <a:xfrm>
+                      <a:off x="0" y="0"/>
+                      <a:ext cx="6115050" cy="1714500"/>
+                    </a:xfrm>
+                    <a:prstGeom prst="rect">
+                      <a:avLst/>
+                    </a:prstGeom>
+                  </pic:spPr>
+                </pic:pic>
+              </a:graphicData>
+            </a:graphic>
+          </wp:inline>
+        </w:drawing>
+      </w:r>
+    </w:p>
+    <w:p>
+      <w:pPr>
+        <w:spacing w:after="240"/>
+        <w:jc w:val="center"/>
+      </w:pPr>
+      <w:r>
+        <w:rPr>
+          <w:i/>
+          <w:iCs/>
+          <w:color w:val="6B6B6B"/>
+          <w:sz w:val="18"/>
+          <w:szCs w:val="18"/>
+        </w:rPr>
+        <w:t xml:space="preserve">Open view | peep sight 2× (desktop).</w:t>
+      </w:r>
+    </w:p>
+    <w:p>
+      <w:pPr>
+        <w:keepNext/>
+        <w:spacing w:after="60" w:before="160"/>
+        <w:jc w:val="center"/>
+      </w:pPr>
+      <w:r>
+        <w:drawing>
+          <wp:inline distT="0" distB="0" distL="0" distR="0">
+            <wp:extent cx="6115050" cy="1714500"/>
+            <wp:effectExtent t="0" r="0" b="0" l="0"/>
+            <wp:docPr id="1" name="" descr="" title=""/>
+            <wp:cNvGraphicFramePr>
+              <a:graphicFrameLocks xmlns:a="http://schemas.openxmlformats.org/drawingml/2006/main" noChangeAspect="1"/>
+            </wp:cNvGraphicFramePr>
+            <a:graphic xmlns:a="http://schemas.openxmlformats.org/drawingml/2006/main">
+              <a:graphicData uri="http://schemas.openxmlformats.org/drawingml/2006/picture">
+                <pic:pic xmlns:pic="http://schemas.openxmlformats.org/drawingml/2006/picture">
+                  <pic:nvPicPr>
+                    <pic:cNvPr id="0" name="" descr=""/>
+                    <pic:cNvPicPr>
+                      <a:picLocks noChangeAspect="1" noChangeArrowheads="1"/>
+                    </pic:cNvPicPr>
+                  </pic:nvPicPr>
+                  <pic:blipFill>
+                    <a:blip r:embed="rId58" cstate="none"/>
+                    <a:srcRect/>
+                    <a:stretch>
+                      <a:fillRect/>
+                    </a:stretch>
+                  </pic:blipFill>
+                  <pic:spPr bwMode="auto">
+                    <a:xfrm>
+                      <a:off x="0" y="0"/>
+                      <a:ext cx="6115050" cy="1714500"/>
+                    </a:xfrm>
+                    <a:prstGeom prst="rect">
+                      <a:avLst/>
+                    </a:prstGeom>
+                  </pic:spPr>
+                </pic:pic>
+              </a:graphicData>
+            </a:graphic>
+          </wp:inline>
+        </w:drawing>
+      </w:r>
+    </w:p>
+    <w:p>
+      <w:pPr>
+        <w:spacing w:after="240"/>
+        <w:jc w:val="center"/>
+      </w:pPr>
+      <w:r>
+        <w:rPr>
+          <w:i/>
+          <w:iCs/>
+          <w:color w:val="6B6B6B"/>
+          <w:sz w:val="18"/>
+          <w:szCs w:val="18"/>
+        </w:rPr>
+        <w:t xml:space="preserve">Open view | iron sight 1.5×, after the redraw (desktop).</w:t>
+      </w:r>
+    </w:p>
+    <w:p>
+      <w:pPr>
+        <w:keepNext/>
+        <w:spacing w:after="60" w:before="160"/>
+        <w:jc w:val="center"/>
+      </w:pPr>
+      <w:r>
+        <w:drawing>
+          <wp:inline distT="0" distB="0" distL="0" distR="0">
+            <wp:extent cx="6115050" cy="1266825"/>
+            <wp:effectExtent t="0" r="0" b="0" l="0"/>
+            <wp:docPr id="1" name="" descr="" title=""/>
+            <wp:cNvGraphicFramePr>
+              <a:graphicFrameLocks xmlns:a="http://schemas.openxmlformats.org/drawingml/2006/main" noChangeAspect="1"/>
+            </wp:cNvGraphicFramePr>
+            <a:graphic xmlns:a="http://schemas.openxmlformats.org/drawingml/2006/main">
+              <a:graphicData uri="http://schemas.openxmlformats.org/drawingml/2006/picture">
+                <pic:pic xmlns:pic="http://schemas.openxmlformats.org/drawingml/2006/picture">
+                  <pic:nvPicPr>
+                    <pic:cNvPr id="0" name="" descr=""/>
+                    <pic:cNvPicPr>
+                      <a:picLocks noChangeAspect="1" noChangeArrowheads="1"/>
+                    </pic:cNvPicPr>
+                  </pic:nvPicPr>
+                  <pic:blipFill>
+                    <a:blip r:embed="rId59" cstate="none"/>
+                    <a:srcRect/>
+                    <a:stretch>
+                      <a:fillRect/>
+                    </a:stretch>
+                  </pic:blipFill>
+                  <pic:spPr bwMode="auto">
+                    <a:xfrm>
+                      <a:off x="0" y="0"/>
+                      <a:ext cx="6115050" cy="1266825"/>
+                    </a:xfrm>
+                    <a:prstGeom prst="rect">
+                      <a:avLst/>
+                    </a:prstGeom>
+                  </pic:spPr>
+                </pic:pic>
+              </a:graphicData>
+            </a:graphic>
+          </wp:inline>
+        </w:drawing>
+      </w:r>
+    </w:p>
+    <w:p>
+      <w:pPr>
+        <w:spacing w:after="240"/>
+        <w:jc w:val="center"/>
+      </w:pPr>
+      <w:r>
+        <w:rPr>
+          <w:i/>
+          <w:iCs/>
+          <w:color w:val="6B6B6B"/>
+          <w:sz w:val="18"/>
+          <w:szCs w:val="18"/>
+        </w:rPr>
+        <w:t xml:space="preserve">The small scope on a Pixel 7 held sideways.</w:t>
+      </w:r>
+    </w:p>
+    <w:p>
+      <w:pPr>
+        <w:keepNext/>
+        <w:spacing w:after="60" w:before="160"/>
+        <w:jc w:val="center"/>
+      </w:pPr>
+      <w:r>
+        <w:drawing>
+          <wp:inline distT="0" distB="0" distL="0" distR="0">
+            <wp:extent cx="6115050" cy="3438525"/>
+            <wp:effectExtent t="0" r="0" b="0" l="0"/>
+            <wp:docPr id="1" name="" descr="" title=""/>
+            <wp:cNvGraphicFramePr>
+              <a:graphicFrameLocks xmlns:a="http://schemas.openxmlformats.org/drawingml/2006/main" noChangeAspect="1"/>
+            </wp:cNvGraphicFramePr>
+            <a:graphic xmlns:a="http://schemas.openxmlformats.org/drawingml/2006/main">
+              <a:graphicData uri="http://schemas.openxmlformats.org/drawingml/2006/picture">
+                <pic:pic xmlns:pic="http://schemas.openxmlformats.org/drawingml/2006/picture">
+                  <pic:nvPicPr>
+                    <pic:cNvPr id="0" name="" descr=""/>
+                    <pic:cNvPicPr>
+                      <a:picLocks noChangeAspect="1" noChangeArrowheads="1"/>
+                    </pic:cNvPicPr>
+                  </pic:nvPicPr>
+                  <pic:blipFill>
+                    <a:blip r:embed="rId60" cstate="none"/>
+                    <a:srcRect/>
+                    <a:stretch>
+                      <a:fillRect/>
+                    </a:stretch>
+                  </pic:blipFill>
+                  <pic:spPr bwMode="auto">
+                    <a:xfrm>
+                      <a:off x="0" y="0"/>
+                      <a:ext cx="6115050" cy="3438525"/>
+                    </a:xfrm>
+                    <a:prstGeom prst="rect">
+                      <a:avLst/>
+                    </a:prstGeom>
+                  </pic:spPr>
+                </pic:pic>
+              </a:graphicData>
+            </a:graphic>
+          </wp:inline>
+        </w:drawing>
+      </w:r>
+    </w:p>
+    <w:p>
+      <w:pPr>
+        <w:spacing w:after="240"/>
+        <w:jc w:val="center"/>
+      </w:pPr>
+      <w:r>
+        <w:rPr>
+          <w:i/>
+          <w:iCs/>
+          <w:color w:val="6B6B6B"/>
+          <w:sz w:val="18"/>
+          <w:szCs w:val="18"/>
+        </w:rPr>
+        <w:t xml:space="preserve">The Skiet-Skuur: the Twee-Twee with its three sights.</w:t>
+      </w:r>
+    </w:p>
+    <w:p>
+      <w:pPr>
+        <w:keepNext/>
+        <w:spacing w:after="60" w:before="160"/>
+        <w:jc w:val="center"/>
+      </w:pPr>
+      <w:r>
+        <w:drawing>
+          <wp:inline distT="0" distB="0" distL="0" distR="0">
+            <wp:extent cx="6115050" cy="3438525"/>
+            <wp:effectExtent t="0" r="0" b="0" l="0"/>
+            <wp:docPr id="1" name="" descr="" title=""/>
+            <wp:cNvGraphicFramePr>
+              <a:graphicFrameLocks xmlns:a="http://schemas.openxmlformats.org/drawingml/2006/main" noChangeAspect="1"/>
+            </wp:cNvGraphicFramePr>
+            <a:graphic xmlns:a="http://schemas.openxmlformats.org/drawingml/2006/main">
+              <a:graphicData uri="http://schemas.openxmlformats.org/drawingml/2006/picture">
+                <pic:pic xmlns:pic="http://schemas.openxmlformats.org/drawingml/2006/picture">
+                  <pic:nvPicPr>
+                    <pic:cNvPr id="0" name="" descr=""/>
+                    <pic:cNvPicPr>
+                      <a:picLocks noChangeAspect="1" noChangeArrowheads="1"/>
+                    </pic:cNvPicPr>
+                  </pic:nvPicPr>
+                  <pic:blipFill>
+                    <a:blip r:embed="rId61" cstate="none"/>
+                    <a:srcRect/>
+                    <a:stretch>
+                      <a:fillRect/>
+                    </a:stretch>
+                  </pic:blipFill>
+                  <pic:spPr bwMode="auto">
+                    <a:xfrm>
+                      <a:off x="0" y="0"/>
+                      <a:ext cx="6115050" cy="3438525"/>
+                    </a:xfrm>
+                    <a:prstGeom prst="rect">
+                      <a:avLst/>
+                    </a:prstGeom>
+                  </pic:spPr>
+                </pic:pic>
+              </a:graphicData>
+            </a:graphic>
+          </wp:inline>
+        </w:drawing>
+      </w:r>
+    </w:p>
+    <w:p>
+      <w:pPr>
+        <w:spacing w:after="240"/>
+        <w:jc w:val="center"/>
+      </w:pPr>
+      <w:r>
+        <w:rPr>
+          <w:i/>
+          <w:iCs/>
+          <w:color w:val="6B6B6B"/>
+          <w:sz w:val="18"/>
+          <w:szCs w:val="18"/>
+        </w:rPr>
+        <w:t xml:space="preserve">The title: Die Verste locked until a scoped rifle is fitted; the rifle hints along the bottom.</w:t>
+      </w:r>
+    </w:p>
+    <w:p>
+      <w:pPr>
         <w:pStyle w:val="Heading1"/>
         <w:pageBreakBefore/>
       </w:pPr>
@@ -8784,7 +9677,7 @@
                 <w:sz w:val="19"/>
                 <w:szCs w:val="19"/>
               </w:rPr>
-              <w:t xml:space="preserve">Plan approved (#40); ammo, crosshairs and sound in v1.1; long range in v1.3 and v1.4</w:t>
+              <w:t xml:space="preserve">Plan approved (#40); ammo, crosshairs and sound in v1.1; the .22, sights and zoom in v1.3 (#53, #54); the long rifle in v1.4</w:t>
             </w:r>
           </w:p>
         </w:tc>
@@ -8980,7 +9873,7 @@
                 <w:sz w:val="19"/>
                 <w:szCs w:val="19"/>
               </w:rPr>
-              <w:t xml:space="preserve">Claude checks in every 20 minutes, with an hourly backup check</w:t>
+              <w:t xml:space="preserve">Claude checks in every 10 minutes, with an hourly backup check</w:t>
             </w:r>
           </w:p>
         </w:tc>
@@ -9372,7 +10265,7 @@
                 <w:sz w:val="19"/>
                 <w:szCs w:val="19"/>
               </w:rPr>
-              <w:t xml:space="preserve">Queued after v1.3</w:t>
+              <w:t xml:space="preserve">Next, straight after v1.3</w:t>
             </w:r>
           </w:p>
         </w:tc>
@@ -9471,6 +10364,202 @@
                 <w:szCs w:val="19"/>
               </w:rPr>
               <w:t xml:space="preserve">This document</w:t>
+            </w:r>
+          </w:p>
+        </w:tc>
+      </w:tr>
+      <w:tr>
+        <w:trPr>
+          <w:cantSplit/>
+        </w:trPr>
+        <w:tc>
+          <w:tcPr>
+            <w:tcW w:type="dxa" w:w="1542"/>
+            <w:tcBorders>
+              <w:top w:val="single" w:color="D8CBB0" w:sz="4"/>
+              <w:left w:val="single" w:color="D8CBB0" w:sz="4"/>
+              <w:bottom w:val="single" w:color="D8CBB0" w:sz="4"/>
+              <w:right w:val="single" w:color="D8CBB0" w:sz="4"/>
+            </w:tcBorders>
+            <w:tcMar>
+              <w:top w:type="dxa" w:w="60"/>
+              <w:left w:type="dxa" w:w="100"/>
+              <w:bottom w:type="dxa" w:w="60"/>
+              <w:right w:type="dxa" w:w="100"/>
+            </w:tcMar>
+          </w:tcPr>
+          <w:p>
+            <w:pPr>
+              <w:spacing w:line="252"/>
+            </w:pPr>
+            <w:r>
+              <w:rPr>
+                <w:b w:val="false"/>
+                <w:bCs w:val="false"/>
+                <w:sz w:val="19"/>
+                <w:szCs w:val="19"/>
+              </w:rPr>
+              <w:t xml:space="preserve">23 Oct, 20:50</w:t>
+            </w:r>
+          </w:p>
+        </w:tc>
+        <w:tc>
+          <w:tcPr>
+            <w:tcW w:type="dxa" w:w="4433"/>
+            <w:tcBorders>
+              <w:top w:val="single" w:color="D8CBB0" w:sz="4"/>
+              <w:left w:val="single" w:color="D8CBB0" w:sz="4"/>
+              <w:bottom w:val="single" w:color="D8CBB0" w:sz="4"/>
+              <w:right w:val="single" w:color="D8CBB0" w:sz="4"/>
+            </w:tcBorders>
+            <w:tcMar>
+              <w:top w:type="dxa" w:w="60"/>
+              <w:left w:type="dxa" w:w="100"/>
+              <w:bottom w:type="dxa" w:w="60"/>
+              <w:right w:type="dxa" w:w="100"/>
+            </w:tcMar>
+          </w:tcPr>
+          <w:p>
+            <w:pPr>
+              <w:spacing w:line="252"/>
+            </w:pPr>
+            <w:r>
+              <w:rPr>
+                <w:b w:val="false"/>
+                <w:bCs w:val="false"/>
+                <w:sz w:val="19"/>
+                <w:szCs w:val="19"/>
+              </w:rPr>
+              <w:t xml:space="preserve">Let GitHub record the screenshot baselines</w:t>
+            </w:r>
+          </w:p>
+        </w:tc>
+        <w:tc>
+          <w:tcPr>
+            <w:tcW w:type="dxa" w:w="3663"/>
+            <w:tcBorders>
+              <w:top w:val="single" w:color="D8CBB0" w:sz="4"/>
+              <w:left w:val="single" w:color="D8CBB0" w:sz="4"/>
+              <w:bottom w:val="single" w:color="D8CBB0" w:sz="4"/>
+              <w:right w:val="single" w:color="D8CBB0" w:sz="4"/>
+            </w:tcBorders>
+            <w:tcMar>
+              <w:top w:type="dxa" w:w="60"/>
+              <w:left w:type="dxa" w:w="100"/>
+              <w:bottom w:type="dxa" w:w="60"/>
+              <w:right w:type="dxa" w:w="100"/>
+            </w:tcMar>
+          </w:tcPr>
+          <w:p>
+            <w:pPr>
+              <w:spacing w:line="252"/>
+            </w:pPr>
+            <w:r>
+              <w:rPr>
+                <w:b w:val="false"/>
+                <w:bCs w:val="false"/>
+                <w:sz w:val="19"/>
+                <w:szCs w:val="19"/>
+              </w:rPr>
+              <w:t xml:space="preserve">Done (#55)</w:t>
+            </w:r>
+          </w:p>
+        </w:tc>
+      </w:tr>
+      <w:tr>
+        <w:trPr>
+          <w:cantSplit/>
+        </w:trPr>
+        <w:tc>
+          <w:tcPr>
+            <w:tcW w:type="dxa" w:w="1542"/>
+            <w:tcBorders>
+              <w:top w:val="single" w:color="D8CBB0" w:sz="4"/>
+              <w:left w:val="single" w:color="D8CBB0" w:sz="4"/>
+              <w:bottom w:val="single" w:color="D8CBB0" w:sz="4"/>
+              <w:right w:val="single" w:color="D8CBB0" w:sz="4"/>
+            </w:tcBorders>
+            <w:tcMar>
+              <w:top w:type="dxa" w:w="60"/>
+              <w:left w:type="dxa" w:w="100"/>
+              <w:bottom w:type="dxa" w:w="60"/>
+              <w:right w:type="dxa" w:w="100"/>
+            </w:tcMar>
+          </w:tcPr>
+          <w:p>
+            <w:pPr>
+              <w:spacing w:line="252"/>
+            </w:pPr>
+            <w:r>
+              <w:rPr>
+                <w:b w:val="false"/>
+                <w:bCs w:val="false"/>
+                <w:sz w:val="19"/>
+                <w:szCs w:val="19"/>
+              </w:rPr>
+              <w:t xml:space="preserve">23 Oct, 21:15</w:t>
+            </w:r>
+          </w:p>
+        </w:tc>
+        <w:tc>
+          <w:tcPr>
+            <w:tcW w:type="dxa" w:w="4433"/>
+            <w:tcBorders>
+              <w:top w:val="single" w:color="D8CBB0" w:sz="4"/>
+              <w:left w:val="single" w:color="D8CBB0" w:sz="4"/>
+              <w:bottom w:val="single" w:color="D8CBB0" w:sz="4"/>
+              <w:right w:val="single" w:color="D8CBB0" w:sz="4"/>
+            </w:tcBorders>
+            <w:tcMar>
+              <w:top w:type="dxa" w:w="60"/>
+              <w:left w:type="dxa" w:w="100"/>
+              <w:bottom w:type="dxa" w:w="60"/>
+              <w:right w:type="dxa" w:w="100"/>
+            </w:tcMar>
+          </w:tcPr>
+          <w:p>
+            <w:pPr>
+              <w:spacing w:line="252"/>
+            </w:pPr>
+            <w:r>
+              <w:rPr>
+                <w:b w:val="false"/>
+                <w:bCs w:val="false"/>
+                <w:sz w:val="19"/>
+                <w:szCs w:val="19"/>
+              </w:rPr>
+              <w:t xml:space="preserve">Keep the build file updated with an infographic every 2–3 hours; keep Tank building overnight</w:t>
+            </w:r>
+          </w:p>
+        </w:tc>
+        <w:tc>
+          <w:tcPr>
+            <w:tcW w:type="dxa" w:w="3663"/>
+            <w:tcBorders>
+              <w:top w:val="single" w:color="D8CBB0" w:sz="4"/>
+              <w:left w:val="single" w:color="D8CBB0" w:sz="4"/>
+              <w:bottom w:val="single" w:color="D8CBB0" w:sz="4"/>
+              <w:right w:val="single" w:color="D8CBB0" w:sz="4"/>
+            </w:tcBorders>
+            <w:tcMar>
+              <w:top w:type="dxa" w:w="60"/>
+              <w:left w:type="dxa" w:w="100"/>
+              <w:bottom w:type="dxa" w:w="60"/>
+              <w:right w:type="dxa" w:w="100"/>
+            </w:tcMar>
+          </w:tcPr>
+          <w:p>
+            <w:pPr>
+              <w:spacing w:line="252"/>
+            </w:pPr>
+            <w:r>
+              <w:rPr>
+                <w:b w:val="false"/>
+                <w:bCs w:val="false"/>
+                <w:sz w:val="19"/>
+                <w:szCs w:val="19"/>
+              </w:rPr>
+              <w:t xml:space="preserve">The build board and the status doc, refreshed every 2–3 hours and after each merge; v1.3 merged overnight</w:t>
             </w:r>
           </w:p>
         </w:tc>
@@ -9675,7 +10764,7 @@
                 <w:sz w:val="19"/>
                 <w:szCs w:val="19"/>
               </w:rPr>
-              <w:t xml:space="preserve">v1.3 Long range (running since 18:00, 23 Oct)</w:t>
+              <w:t xml:space="preserve">Training ground (Skietbaan)</w:t>
             </w:r>
           </w:p>
         </w:tc>
@@ -9706,7 +10795,7 @@
                 <w:sz w:val="19"/>
                 <w:szCs w:val="19"/>
               </w:rPr>
-              <w:t xml:space="preserve">First a memory fix (gun pictures freed after a hunt); a far layer only rifles reach; iron sight 1.5×, peep 2×, small scope 4×; hold to zoom with sway; the .22 (Die Twee-Twee); bonus maps Nog Verder and Die Verste</w:t>
+              <w:t xml:space="preserve">Try every gun on targets and birds at near, middle, far and Ver distance; hit statistics and spread; from the admin page</w:t>
             </w:r>
           </w:p>
         </w:tc>
@@ -9768,7 +10857,7 @@
                 <w:sz w:val="19"/>
                 <w:szCs w:val="19"/>
               </w:rPr>
-              <w:t xml:space="preserve">6–8 h, about 02:00–04:00 UTC on 24 Oct</w:t>
+              <w:t xml:space="preserve">3–4 h</w:t>
             </w:r>
           </w:p>
         </w:tc>
@@ -9804,7 +10893,7 @@
                 <w:sz w:val="19"/>
                 <w:szCs w:val="19"/>
               </w:rPr>
-              <w:t xml:space="preserve">Training ground (Skietbaan)</w:t>
+              <w:t xml:space="preserve">v1.4 Die Langloop + Namibië</w:t>
             </w:r>
           </w:p>
         </w:tc>
@@ -9835,136 +10924,7 @@
                 <w:sz w:val="19"/>
                 <w:szCs w:val="19"/>
               </w:rPr>
-              <w:t xml:space="preserve">Try every gun on targets and birds at near, middle and far distance; hit statistics and spread; from the admin page</w:t>
-            </w:r>
-          </w:p>
-        </w:tc>
-        <w:tc>
-          <w:tcPr>
-            <w:tcW w:type="dxa" w:w="963"/>
-            <w:tcBorders>
-              <w:top w:val="single" w:color="D8CBB0" w:sz="4"/>
-              <w:left w:val="single" w:color="D8CBB0" w:sz="4"/>
-              <w:bottom w:val="single" w:color="D8CBB0" w:sz="4"/>
-              <w:right w:val="single" w:color="D8CBB0" w:sz="4"/>
-            </w:tcBorders>
-            <w:tcMar>
-              <w:top w:type="dxa" w:w="60"/>
-              <w:left w:type="dxa" w:w="100"/>
-              <w:bottom w:type="dxa" w:w="60"/>
-              <w:right w:type="dxa" w:w="100"/>
-            </w:tcMar>
-          </w:tcPr>
-          <w:p>
-            <w:pPr>
-              <w:spacing w:line="252"/>
-            </w:pPr>
-            <w:r>
-              <w:rPr>
-                <w:b w:val="false"/>
-                <w:bCs w:val="false"/>
-                <w:sz w:val="19"/>
-                <w:szCs w:val="19"/>
-              </w:rPr>
-              <w:t xml:space="preserve">Tank</w:t>
-            </w:r>
-          </w:p>
-        </w:tc>
-        <w:tc>
-          <w:tcPr>
-            <w:tcW w:type="dxa" w:w="1737"/>
-            <w:tcBorders>
-              <w:top w:val="single" w:color="D8CBB0" w:sz="4"/>
-              <w:left w:val="single" w:color="D8CBB0" w:sz="4"/>
-              <w:bottom w:val="single" w:color="D8CBB0" w:sz="4"/>
-              <w:right w:val="single" w:color="D8CBB0" w:sz="4"/>
-            </w:tcBorders>
-            <w:tcMar>
-              <w:top w:type="dxa" w:w="60"/>
-              <w:left w:type="dxa" w:w="100"/>
-              <w:bottom w:type="dxa" w:w="60"/>
-              <w:right w:type="dxa" w:w="100"/>
-            </w:tcMar>
-          </w:tcPr>
-          <w:p>
-            <w:pPr>
-              <w:spacing w:line="252"/>
-            </w:pPr>
-            <w:r>
-              <w:rPr>
-                <w:b w:val="false"/>
-                <w:bCs w:val="false"/>
-                <w:sz w:val="19"/>
-                <w:szCs w:val="19"/>
-              </w:rPr>
-              <w:t xml:space="preserve">3–4 h</w:t>
-            </w:r>
-          </w:p>
-        </w:tc>
-      </w:tr>
-      <w:tr>
-        <w:trPr>
-          <w:cantSplit/>
-        </w:trPr>
-        <w:tc>
-          <w:tcPr>
-            <w:tcW w:type="dxa" w:w="1927"/>
-            <w:tcBorders>
-              <w:top w:val="single" w:color="D8CBB0" w:sz="4"/>
-              <w:left w:val="single" w:color="D8CBB0" w:sz="4"/>
-              <w:bottom w:val="single" w:color="D8CBB0" w:sz="4"/>
-              <w:right w:val="single" w:color="D8CBB0" w:sz="4"/>
-            </w:tcBorders>
-            <w:tcMar>
-              <w:top w:type="dxa" w:w="60"/>
-              <w:left w:type="dxa" w:w="100"/>
-              <w:bottom w:type="dxa" w:w="60"/>
-              <w:right w:type="dxa" w:w="100"/>
-            </w:tcMar>
-          </w:tcPr>
-          <w:p>
-            <w:pPr>
-              <w:spacing w:line="252"/>
-            </w:pPr>
-            <w:r>
-              <w:rPr>
-                <w:b w:val="false"/>
-                <w:bCs w:val="false"/>
-                <w:sz w:val="19"/>
-                <w:szCs w:val="19"/>
-              </w:rPr>
-              <w:t xml:space="preserve">v1.4 Die Langloop + Namibië</w:t>
-            </w:r>
-          </w:p>
-        </w:tc>
-        <w:tc>
-          <w:tcPr>
-            <w:tcW w:type="dxa" w:w="5011"/>
-            <w:tcBorders>
-              <w:top w:val="single" w:color="D8CBB0" w:sz="4"/>
-              <w:left w:val="single" w:color="D8CBB0" w:sz="4"/>
-              <w:bottom w:val="single" w:color="D8CBB0" w:sz="4"/>
-              <w:right w:val="single" w:color="D8CBB0" w:sz="4"/>
-            </w:tcBorders>
-            <w:tcMar>
-              <w:top w:type="dxa" w:w="60"/>
-              <w:left w:type="dxa" w:w="100"/>
-              <w:bottom w:type="dxa" w:w="60"/>
-              <w:right w:type="dxa" w:w="100"/>
-            </w:tcMar>
-          </w:tcPr>
-          <w:p>
-            <w:pPr>
-              <w:spacing w:line="252"/>
-            </w:pPr>
-            <w:r>
-              <w:rPr>
-                <w:b w:val="false"/>
-                <w:bCs w:val="false"/>
-                <w:sz w:val="19"/>
-                <w:szCs w:val="19"/>
-              </w:rPr>
-              <w:t xml:space="preserve">A long rifle with a 3–9× scope; the Namibië area (Etosha salt pan with mirages, quiver trees, Namib dunes, a far waterhole)</w:t>
+              <w:t xml:space="preserve">A long rifle with a 3–9× scope; the Namibië area (Etosha salt pan with mirages, quiver trees, Namib dunes, a far waterhole); first the scoped drawing cost (issue #56)</w:t>
             </w:r>
           </w:p>
         </w:tc>
@@ -11470,6 +12430,73 @@
                 <w:szCs w:val="19"/>
               </w:rPr>
               <w:t xml:space="preserve">Art direction: semi-realistic (graphics pass 3)</w:t>
+            </w:r>
+          </w:p>
+        </w:tc>
+      </w:tr>
+      <w:tr>
+        <w:trPr>
+          <w:cantSplit/>
+        </w:trPr>
+        <w:tc>
+          <w:tcPr>
+            <w:tcW w:type="dxa" w:w="1734"/>
+            <w:tcBorders>
+              <w:top w:val="single" w:color="D8CBB0" w:sz="4"/>
+              <w:left w:val="single" w:color="D8CBB0" w:sz="4"/>
+              <w:bottom w:val="single" w:color="D8CBB0" w:sz="4"/>
+              <w:right w:val="single" w:color="D8CBB0" w:sz="4"/>
+            </w:tcBorders>
+            <w:tcMar>
+              <w:top w:type="dxa" w:w="60"/>
+              <w:left w:type="dxa" w:w="100"/>
+              <w:bottom w:type="dxa" w:w="60"/>
+              <w:right w:type="dxa" w:w="100"/>
+            </w:tcMar>
+          </w:tcPr>
+          <w:p>
+            <w:pPr>
+              <w:spacing w:line="252"/>
+            </w:pPr>
+            <w:r>
+              <w:rPr>
+                <w:b w:val="false"/>
+                <w:bCs w:val="false"/>
+                <w:sz w:val="19"/>
+                <w:szCs w:val="19"/>
+              </w:rPr>
+              <w:t xml:space="preserve">D-036</w:t>
+            </w:r>
+          </w:p>
+        </w:tc>
+        <w:tc>
+          <w:tcPr>
+            <w:tcW w:type="dxa" w:w="7904"/>
+            <w:tcBorders>
+              <w:top w:val="single" w:color="D8CBB0" w:sz="4"/>
+              <w:left w:val="single" w:color="D8CBB0" w:sz="4"/>
+              <w:bottom w:val="single" w:color="D8CBB0" w:sz="4"/>
+              <w:right w:val="single" w:color="D8CBB0" w:sz="4"/>
+            </w:tcBorders>
+            <w:tcMar>
+              <w:top w:type="dxa" w:w="60"/>
+              <w:left w:type="dxa" w:w="100"/>
+              <w:bottom w:type="dxa" w:w="60"/>
+              <w:right w:type="dxa" w:w="100"/>
+            </w:tcMar>
+          </w:tcPr>
+          <w:p>
+            <w:pPr>
+              <w:spacing w:line="252"/>
+            </w:pPr>
+            <w:r>
+              <w:rPr>
+                <w:b w:val="false"/>
+                <w:bCs w:val="false"/>
+                <w:sz w:val="19"/>
+                <w:szCs w:val="19"/>
+              </w:rPr>
+              <w:t xml:space="preserve">v1.3 long range: the Ver plane, sights and zoom, the .22, Nog Verder and Die Verste</w:t>
             </w:r>
           </w:p>
         </w:tc>

</xml_diff>

<commit_message>
docs(history): Training ground (Skietbaan) stage; build board state for v1.4
Adds the Training ground chapter (#58, D-037) with five screenshots, the
updated figures (596 commits, 56 PRs, 954 unit tests, 39 browser suites,
37 decisions), the request marked done, v1.4 as the next step, and the
board state with v1.4 running. Rebuilt the .docx.

Co-Authored-By: Claude Opus 5.5 <noreply@anthropic.com>
Claude-Session: https://claude.ai/code/session_01X9BKcABj5FscZbGJZnCiA3
</commit_message>
<xml_diff>
--- a/docs/history/Tarantal-Development-History.docx
+++ b/docs/history/Tarantal-Development-History.docx
@@ -141,7 +141,7 @@
           <w:sz w:val="20"/>
           <w:szCs w:val="20"/>
         </w:rPr>
-        <w:t xml:space="preserve">Last updated 24 October 2026, 02:40 UTC</w:t>
+        <w:t xml:space="preserve">Last updated 24 October 2026, 05:50 UTC</w:t>
       </w:r>
     </w:p>
     <w:p>
@@ -470,7 +470,7 @@
                 <w:sz w:val="19"/>
                 <w:szCs w:val="19"/>
               </w:rPr>
-              <w:t xml:space="preserve">575</w:t>
+              <w:t xml:space="preserve">596</w:t>
             </w:r>
           </w:p>
         </w:tc>
@@ -537,7 +537,7 @@
                 <w:sz w:val="19"/>
                 <w:szCs w:val="19"/>
               </w:rPr>
-              <w:t xml:space="preserve">54 opened, all merged</w:t>
+              <w:t xml:space="preserve">56 opened, all merged</w:t>
             </w:r>
           </w:p>
         </w:tc>
@@ -604,7 +604,7 @@
                 <w:sz w:val="19"/>
                 <w:szCs w:val="19"/>
               </w:rPr>
-              <w:t xml:space="preserve">about 33,500 lines</w:t>
+              <w:t xml:space="preserve">about 35,800 lines</w:t>
             </w:r>
           </w:p>
         </w:tc>
@@ -671,7 +671,7 @@
                 <w:sz w:val="19"/>
                 <w:szCs w:val="19"/>
               </w:rPr>
-              <w:t xml:space="preserve">908 unit tests, 37 browser test suites on 3 device profiles</w:t>
+              <w:t xml:space="preserve">954 unit tests, 39 browser test suites on 3 device profiles</w:t>
             </w:r>
           </w:p>
         </w:tc>
@@ -1006,7 +1006,7 @@
                 <w:sz w:val="19"/>
                 <w:szCs w:val="19"/>
               </w:rPr>
-              <w:t xml:space="preserve">36 (D-001 to D-036)</w:t>
+              <w:t xml:space="preserve">37 (D-001 to D-037)</w:t>
             </w:r>
           </w:p>
         </w:tc>
@@ -4171,6 +4171,104 @@
           </w:p>
         </w:tc>
       </w:tr>
+      <w:tr>
+        <w:trPr>
+          <w:cantSplit/>
+        </w:trPr>
+        <w:tc>
+          <w:tcPr>
+            <w:tcW w:type="dxa" w:w="2698"/>
+            <w:tcBorders>
+              <w:top w:val="single" w:color="D8CBB0" w:sz="4"/>
+              <w:left w:val="single" w:color="D8CBB0" w:sz="4"/>
+              <w:bottom w:val="single" w:color="D8CBB0" w:sz="4"/>
+              <w:right w:val="single" w:color="D8CBB0" w:sz="4"/>
+            </w:tcBorders>
+            <w:tcMar>
+              <w:top w:type="dxa" w:w="60"/>
+              <w:left w:type="dxa" w:w="100"/>
+              <w:bottom w:type="dxa" w:w="60"/>
+              <w:right w:type="dxa" w:w="100"/>
+            </w:tcMar>
+          </w:tcPr>
+          <w:p>
+            <w:pPr>
+              <w:spacing w:line="252"/>
+            </w:pPr>
+            <w:r>
+              <w:rPr>
+                <w:b w:val="false"/>
+                <w:bCs w:val="false"/>
+                <w:sz w:val="19"/>
+                <w:szCs w:val="19"/>
+              </w:rPr>
+              <w:t xml:space="preserve">24 Oct 2026, 05:38 (started 02:25)</w:t>
+            </w:r>
+          </w:p>
+        </w:tc>
+        <w:tc>
+          <w:tcPr>
+            <w:tcW w:type="dxa" w:w="4819"/>
+            <w:tcBorders>
+              <w:top w:val="single" w:color="D8CBB0" w:sz="4"/>
+              <w:left w:val="single" w:color="D8CBB0" w:sz="4"/>
+              <w:bottom w:val="single" w:color="D8CBB0" w:sz="4"/>
+              <w:right w:val="single" w:color="D8CBB0" w:sz="4"/>
+            </w:tcBorders>
+            <w:tcMar>
+              <w:top w:type="dxa" w:w="60"/>
+              <w:left w:type="dxa" w:w="100"/>
+              <w:bottom w:type="dxa" w:w="60"/>
+              <w:right w:type="dxa" w:w="100"/>
+            </w:tcMar>
+          </w:tcPr>
+          <w:p>
+            <w:pPr>
+              <w:spacing w:line="252"/>
+            </w:pPr>
+            <w:r>
+              <w:rPr>
+                <w:b w:val="false"/>
+                <w:bCs w:val="false"/>
+                <w:sz w:val="19"/>
+                <w:szCs w:val="19"/>
+              </w:rPr>
+              <w:t xml:space="preserve">Training ground (Skietbaan)</w:t>
+            </w:r>
+          </w:p>
+        </w:tc>
+        <w:tc>
+          <w:tcPr>
+            <w:tcW w:type="dxa" w:w="2121"/>
+            <w:tcBorders>
+              <w:top w:val="single" w:color="D8CBB0" w:sz="4"/>
+              <w:left w:val="single" w:color="D8CBB0" w:sz="4"/>
+              <w:bottom w:val="single" w:color="D8CBB0" w:sz="4"/>
+              <w:right w:val="single" w:color="D8CBB0" w:sz="4"/>
+            </w:tcBorders>
+            <w:tcMar>
+              <w:top w:type="dxa" w:w="60"/>
+              <w:left w:type="dxa" w:w="100"/>
+              <w:bottom w:type="dxa" w:w="60"/>
+              <w:right w:type="dxa" w:w="100"/>
+            </w:tcMar>
+          </w:tcPr>
+          <w:p>
+            <w:pPr>
+              <w:spacing w:line="252"/>
+            </w:pPr>
+            <w:r>
+              <w:rPr>
+                <w:b w:val="false"/>
+                <w:bCs w:val="false"/>
+                <w:sz w:val="19"/>
+                <w:szCs w:val="19"/>
+              </w:rPr>
+              <w:t xml:space="preserve">#58</w:t>
+            </w:r>
+          </w:p>
+        </w:tc>
+      </w:tr>
     </w:tbl>
     <w:p>
       <w:pPr>
@@ -9361,6 +9459,500 @@
     </w:p>
     <w:p>
       <w:pPr>
+        <w:pStyle w:val="Heading2"/>
+        <w:keepNext/>
+      </w:pPr>
+      <w:r>
+        <w:t xml:space="preserve">Training ground (Skietbaan)</w:t>
+      </w:r>
+    </w:p>
+    <w:p>
+      <w:pPr>
+        <w:spacing w:after="120"/>
+        <w:rPr>
+          <w:color w:val="6B6B6B"/>
+          <w:sz w:val="18"/>
+          <w:szCs w:val="18"/>
+        </w:rPr>
+      </w:pPr>
+      <w:r>
+        <w:rPr>
+          <w:color w:val="6B6B6B"/>
+          <w:sz w:val="18"/>
+          <w:szCs w:val="18"/>
+        </w:rPr>
+        <w:t xml:space="preserve">When: 24 Oct 2026, 05:38 (started 02:25)   ·   Pull requests: #58   ·   Decision: D-037</w:t>
+      </w:r>
+    </w:p>
+    <w:p>
+      <w:pPr>
+        <w:spacing w:after="120" w:line="276"/>
+      </w:pPr>
+      <w:r>
+        <w:t xml:space="preserve">A shooting range on the admin page: try any gun, locked ones too, at any distance and see exactly how it shoots, without the pressure of a hunt.</w:t>
+      </w:r>
+    </w:p>
+    <w:p>
+      <w:pPr>
+        <w:keepNext/>
+        <w:spacing w:after="80" w:before="160"/>
+      </w:pPr>
+      <w:r>
+        <w:rPr>
+          <w:b/>
+          <w:bCs/>
+          <w:color w:val="B7791F"/>
+          <w:sz w:val="20"/>
+          <w:szCs w:val="20"/>
+        </w:rPr>
+        <w:t xml:space="preserve">Look review and independent review before merging</w:t>
+      </w:r>
+    </w:p>
+    <w:p>
+      <w:pPr>
+        <w:pBdr>
+          <w:left w:val="single" w:color="B7791F" w:sz="18" w:space="8"/>
+        </w:pBdr>
+        <w:shd w:fill="F3ECDD" w:color="auto" w:val="clear"/>
+        <w:spacing w:after="0" w:before="60" w:line="264"/>
+        <w:ind w:left="240" w:right="120"/>
+      </w:pPr>
+      <w:r>
+        <w:rPr>
+          <w:sz w:val="20"/>
+          <w:szCs w:val="20"/>
+        </w:rPr>
+        <w:t xml:space="preserve">The independent review found the code sound: hunts, Daily seeds and challenge links are unchanged (the range is left out of the content fingerprint), the portal builds are clean and the save is never written.</w:t>
+      </w:r>
+    </w:p>
+    <w:p>
+      <w:pPr>
+        <w:pBdr>
+          <w:left w:val="single" w:color="B7791F" w:sz="18" w:space="8"/>
+        </w:pBdr>
+        <w:shd w:fill="F3ECDD" w:color="auto" w:val="clear"/>
+        <w:spacing w:after="160" w:before="0" w:line="264"/>
+        <w:ind w:left="240" w:right="120"/>
+      </w:pPr>
+      <w:r>
+        <w:rPr>
+          <w:sz w:val="20"/>
+          <w:szCs w:val="20"/>
+        </w:rPr>
+        <w:t xml:space="preserve">Claude’s look review on the phones: Start was off the bottom of a Pixel 7 screen, the page jumped back to the top after every tap, and the stats box hid the flying birds. Now Start sits in a footer with a summary of the choices, the page keeps its place, the stats shrink to a small box that lets taps through, and hunt-style score labels no longer show on the range. A browser test now also shoots a flying bird.</w:t>
+      </w:r>
+    </w:p>
+    <w:p>
+      <w:pPr>
+        <w:keepNext/>
+        <w:spacing w:after="80" w:before="160"/>
+      </w:pPr>
+      <w:r>
+        <w:rPr>
+          <w:b/>
+          <w:bCs/>
+          <w:color w:val="B7791F"/>
+          <w:sz w:val="20"/>
+          <w:szCs w:val="20"/>
+        </w:rPr>
+        <w:t xml:space="preserve">What it added</w:t>
+      </w:r>
+    </w:p>
+    <w:p>
+      <w:pPr>
+        <w:pStyle w:val="ListParagraph"/>
+        <w:numPr>
+          <w:ilvl w:val="0"/>
+          <w:numId w:val="2"/>
+        </w:numPr>
+        <w:spacing w:after="60" w:line="264"/>
+      </w:pPr>
+      <w:r>
+        <w:t xml:space="preserve">Pick a gun (all 9, including the Twee-Twee with each sight and the two crate guns), an area, a distance (near, middle, far or Ver; guns that can’t reach Ver say "out of reach") and a target: a paper target, a standing bird, a flying bird or a small flock.</w:t>
+      </w:r>
+    </w:p>
+    <w:p>
+      <w:pPr>
+        <w:pStyle w:val="ListParagraph"/>
+        <w:numPr>
+          <w:ilvl w:val="0"/>
+          <w:numId w:val="2"/>
+        </w:numPr>
+        <w:spacing w:after="60" w:line="264"/>
+      </w:pPr>
+      <w:r>
+        <w:t xml:space="preserve">It runs on the real game engine, so every hit is exactly what a hunt would give: no timer, score, Frenzy or penalties, endless spare ammo but reloads as normal. A test replays a range session twice and gets the same result.</w:t>
+      </w:r>
+    </w:p>
+    <w:p>
+      <w:pPr>
+        <w:pStyle w:val="ListParagraph"/>
+        <w:numPr>
+          <w:ilvl w:val="0"/>
+          <w:numId w:val="2"/>
+        </w:numPr>
+        <w:spacing w:after="60" w:line="264"/>
+      </w:pPr>
+      <w:r>
+        <w:t xml:space="preserve">Statistics per gun and distance: shots, hits, misses, hit %, shotgun pellets on target per shot; on paper, the last 20 holes are drawn with the group size (also as a % of a guineafowl’s width at that distance) and where the group centres against the aim. Reset and "Copy report".</w:t>
+      </w:r>
+    </w:p>
+    <w:p>
+      <w:pPr>
+        <w:pStyle w:val="ListParagraph"/>
+        <w:numPr>
+          <w:ilvl w:val="0"/>
+          <w:numId w:val="2"/>
+        </w:numPr>
+        <w:spacing w:after="60" w:line="264"/>
+      </w:pPr>
+      <w:r>
+        <w:t xml:space="preserve">It never touches the save: a browser test compares every stored value before and after a session, byte for byte.</w:t>
+      </w:r>
+    </w:p>
+    <w:p>
+      <w:pPr>
+        <w:pStyle w:val="ListParagraph"/>
+        <w:numPr>
+          <w:ilvl w:val="0"/>
+          <w:numId w:val="2"/>
+        </w:numPr>
+        <w:spacing w:after="60" w:line="264"/>
+      </w:pPr>
+      <w:r>
+        <w:t xml:space="preserve">Only in the GitHub Pages test build, from ?admin=1. The Poki and CrazyGames builds don’t contain it at all, and the size check fails any portal build that does. Its code loads only when opened (8.7 KB); the first download grew by 1.1 KB to 2.94 MB of 3 MB.</w:t>
+      </w:r>
+    </w:p>
+    <w:p>
+      <w:pPr>
+        <w:pStyle w:val="ListParagraph"/>
+        <w:numPr>
+          <w:ilvl w:val="0"/>
+          <w:numId w:val="2"/>
+        </w:numPr>
+        <w:spacing w:after="60" w:line="264"/>
+      </w:pPr>
+      <w:r>
+        <w:t xml:space="preserve">Strings in English, Afrikaans, German and Dutch; browser tests on desktop, Pixel 7 and iPhone 14 held sideways.</w:t>
+      </w:r>
+    </w:p>
+    <w:p>
+      <w:pPr>
+        <w:keepNext/>
+        <w:spacing w:after="60" w:before="160"/>
+        <w:jc w:val="center"/>
+      </w:pPr>
+      <w:r>
+        <w:drawing>
+          <wp:inline distT="0" distB="0" distL="0" distR="0">
+            <wp:extent cx="6115050" cy="3438525"/>
+            <wp:effectExtent t="0" r="0" b="0" l="0"/>
+            <wp:docPr id="1" name="" descr="" title=""/>
+            <wp:cNvGraphicFramePr>
+              <a:graphicFrameLocks xmlns:a="http://schemas.openxmlformats.org/drawingml/2006/main" noChangeAspect="1"/>
+            </wp:cNvGraphicFramePr>
+            <a:graphic xmlns:a="http://schemas.openxmlformats.org/drawingml/2006/main">
+              <a:graphicData uri="http://schemas.openxmlformats.org/drawingml/2006/picture">
+                <pic:pic xmlns:pic="http://schemas.openxmlformats.org/drawingml/2006/picture">
+                  <pic:nvPicPr>
+                    <pic:cNvPr id="0" name="" descr=""/>
+                    <pic:cNvPicPr>
+                      <a:picLocks noChangeAspect="1" noChangeArrowheads="1"/>
+                    </pic:cNvPicPr>
+                  </pic:nvPicPr>
+                  <pic:blipFill>
+                    <a:blip r:embed="rId62" cstate="none"/>
+                    <a:srcRect/>
+                    <a:stretch>
+                      <a:fillRect/>
+                    </a:stretch>
+                  </pic:blipFill>
+                  <pic:spPr bwMode="auto">
+                    <a:xfrm>
+                      <a:off x="0" y="0"/>
+                      <a:ext cx="6115050" cy="3438525"/>
+                    </a:xfrm>
+                    <a:prstGeom prst="rect">
+                      <a:avLst/>
+                    </a:prstGeom>
+                  </pic:spPr>
+                </pic:pic>
+              </a:graphicData>
+            </a:graphic>
+          </wp:inline>
+        </w:drawing>
+      </w:r>
+    </w:p>
+    <w:p>
+      <w:pPr>
+        <w:spacing w:after="240"/>
+        <w:jc w:val="center"/>
+      </w:pPr>
+      <w:r>
+        <w:rPr>
+          <w:i/>
+          <w:iCs/>
+          <w:color w:val="6B6B6B"/>
+          <w:sz w:val="18"/>
+          <w:szCs w:val="18"/>
+        </w:rPr>
+        <w:t xml:space="preserve">The setup page with the session table (desktop). Ver is "out of reach" for the Dubbelloop.</w:t>
+      </w:r>
+    </w:p>
+    <w:p>
+      <w:pPr>
+        <w:keepNext/>
+        <w:spacing w:after="60" w:before="160"/>
+        <w:jc w:val="center"/>
+      </w:pPr>
+      <w:r>
+        <w:drawing>
+          <wp:inline distT="0" distB="0" distL="0" distR="0">
+            <wp:extent cx="6115050" cy="3438525"/>
+            <wp:effectExtent t="0" r="0" b="0" l="0"/>
+            <wp:docPr id="1" name="" descr="" title=""/>
+            <wp:cNvGraphicFramePr>
+              <a:graphicFrameLocks xmlns:a="http://schemas.openxmlformats.org/drawingml/2006/main" noChangeAspect="1"/>
+            </wp:cNvGraphicFramePr>
+            <a:graphic xmlns:a="http://schemas.openxmlformats.org/drawingml/2006/main">
+              <a:graphicData uri="http://schemas.openxmlformats.org/drawingml/2006/picture">
+                <pic:pic xmlns:pic="http://schemas.openxmlformats.org/drawingml/2006/picture">
+                  <pic:nvPicPr>
+                    <pic:cNvPr id="0" name="" descr=""/>
+                    <pic:cNvPicPr>
+                      <a:picLocks noChangeAspect="1" noChangeArrowheads="1"/>
+                    </pic:cNvPicPr>
+                  </pic:nvPicPr>
+                  <pic:blipFill>
+                    <a:blip r:embed="rId63" cstate="none"/>
+                    <a:srcRect/>
+                    <a:stretch>
+                      <a:fillRect/>
+                    </a:stretch>
+                  </pic:blipFill>
+                  <pic:spPr bwMode="auto">
+                    <a:xfrm>
+                      <a:off x="0" y="0"/>
+                      <a:ext cx="6115050" cy="3438525"/>
+                    </a:xfrm>
+                    <a:prstGeom prst="rect">
+                      <a:avLst/>
+                    </a:prstGeom>
+                  </pic:spPr>
+                </pic:pic>
+              </a:graphicData>
+            </a:graphic>
+          </wp:inline>
+        </w:drawing>
+      </w:r>
+    </w:p>
+    <w:p>
+      <w:pPr>
+        <w:spacing w:after="240"/>
+        <w:jc w:val="center"/>
+      </w:pPr>
+      <w:r>
+        <w:rPr>
+          <w:i/>
+          <w:iCs/>
+          <w:color w:val="6B6B6B"/>
+          <w:sz w:val="18"/>
+          <w:szCs w:val="18"/>
+        </w:rPr>
+        <w:t xml:space="preserve">Dubbelloop at near on the paper target: 16 pellet holes from two shots, with the group size and centre.</w:t>
+      </w:r>
+    </w:p>
+    <w:p>
+      <w:pPr>
+        <w:keepNext/>
+        <w:spacing w:after="60" w:before="160"/>
+        <w:jc w:val="center"/>
+      </w:pPr>
+      <w:r>
+        <w:drawing>
+          <wp:inline distT="0" distB="0" distL="0" distR="0">
+            <wp:extent cx="6115050" cy="3438525"/>
+            <wp:effectExtent t="0" r="0" b="0" l="0"/>
+            <wp:docPr id="1" name="" descr="" title=""/>
+            <wp:cNvGraphicFramePr>
+              <a:graphicFrameLocks xmlns:a="http://schemas.openxmlformats.org/drawingml/2006/main" noChangeAspect="1"/>
+            </wp:cNvGraphicFramePr>
+            <a:graphic xmlns:a="http://schemas.openxmlformats.org/drawingml/2006/main">
+              <a:graphicData uri="http://schemas.openxmlformats.org/drawingml/2006/picture">
+                <pic:pic xmlns:pic="http://schemas.openxmlformats.org/drawingml/2006/picture">
+                  <pic:nvPicPr>
+                    <pic:cNvPr id="0" name="" descr=""/>
+                    <pic:cNvPicPr>
+                      <a:picLocks noChangeAspect="1" noChangeArrowheads="1"/>
+                    </pic:cNvPicPr>
+                  </pic:nvPicPr>
+                  <pic:blipFill>
+                    <a:blip r:embed="rId64" cstate="none"/>
+                    <a:srcRect/>
+                    <a:stretch>
+                      <a:fillRect/>
+                    </a:stretch>
+                  </pic:blipFill>
+                  <pic:spPr bwMode="auto">
+                    <a:xfrm>
+                      <a:off x="0" y="0"/>
+                      <a:ext cx="6115050" cy="3438525"/>
+                    </a:xfrm>
+                    <a:prstGeom prst="rect">
+                      <a:avLst/>
+                    </a:prstGeom>
+                  </pic:spPr>
+                </pic:pic>
+              </a:graphicData>
+            </a:graphic>
+          </wp:inline>
+        </w:drawing>
+      </w:r>
+    </w:p>
+    <w:p>
+      <w:pPr>
+        <w:spacing w:after="240"/>
+        <w:jc w:val="center"/>
+      </w:pPr>
+      <w:r>
+        <w:rPr>
+          <w:i/>
+          <w:iCs/>
+          <w:color w:val="6B6B6B"/>
+          <w:sz w:val="18"/>
+          <w:szCs w:val="18"/>
+        </w:rPr>
+        <w:t xml:space="preserve">The .22 with the small scope at Ver: four shots inside 1.4 px.</w:t>
+      </w:r>
+    </w:p>
+    <w:p>
+      <w:pPr>
+        <w:keepNext/>
+        <w:spacing w:after="60" w:before="160"/>
+        <w:jc w:val="center"/>
+      </w:pPr>
+      <w:r>
+        <w:drawing>
+          <wp:inline distT="0" distB="0" distL="0" distR="0">
+            <wp:extent cx="6115050" cy="2552700"/>
+            <wp:effectExtent t="0" r="0" b="0" l="0"/>
+            <wp:docPr id="1" name="" descr="" title=""/>
+            <wp:cNvGraphicFramePr>
+              <a:graphicFrameLocks xmlns:a="http://schemas.openxmlformats.org/drawingml/2006/main" noChangeAspect="1"/>
+            </wp:cNvGraphicFramePr>
+            <a:graphic xmlns:a="http://schemas.openxmlformats.org/drawingml/2006/main">
+              <a:graphicData uri="http://schemas.openxmlformats.org/drawingml/2006/picture">
+                <pic:pic xmlns:pic="http://schemas.openxmlformats.org/drawingml/2006/picture">
+                  <pic:nvPicPr>
+                    <pic:cNvPr id="0" name="" descr=""/>
+                    <pic:cNvPicPr>
+                      <a:picLocks noChangeAspect="1" noChangeArrowheads="1"/>
+                    </pic:cNvPicPr>
+                  </pic:nvPicPr>
+                  <pic:blipFill>
+                    <a:blip r:embed="rId65" cstate="none"/>
+                    <a:srcRect/>
+                    <a:stretch>
+                      <a:fillRect/>
+                    </a:stretch>
+                  </pic:blipFill>
+                  <pic:spPr bwMode="auto">
+                    <a:xfrm>
+                      <a:off x="0" y="0"/>
+                      <a:ext cx="6115050" cy="2552700"/>
+                    </a:xfrm>
+                    <a:prstGeom prst="rect">
+                      <a:avLst/>
+                    </a:prstGeom>
+                  </pic:spPr>
+                </pic:pic>
+              </a:graphicData>
+            </a:graphic>
+          </wp:inline>
+        </w:drawing>
+      </w:r>
+    </w:p>
+    <w:p>
+      <w:pPr>
+        <w:spacing w:after="240"/>
+        <w:jc w:val="center"/>
+      </w:pPr>
+      <w:r>
+        <w:rPr>
+          <w:i/>
+          <w:iCs/>
+          <w:color w:val="6B6B6B"/>
+          <w:sz w:val="18"/>
+          <w:szCs w:val="18"/>
+        </w:rPr>
+        <w:t xml:space="preserve">The setup page on a Pixel 7 held sideways, with Start in a footer that is always on screen.</w:t>
+      </w:r>
+    </w:p>
+    <w:p>
+      <w:pPr>
+        <w:keepNext/>
+        <w:spacing w:after="60" w:before="160"/>
+        <w:jc w:val="center"/>
+      </w:pPr>
+      <w:r>
+        <w:drawing>
+          <wp:inline distT="0" distB="0" distL="0" distR="0">
+            <wp:extent cx="6115050" cy="2552700"/>
+            <wp:effectExtent t="0" r="0" b="0" l="0"/>
+            <wp:docPr id="1" name="" descr="" title=""/>
+            <wp:cNvGraphicFramePr>
+              <a:graphicFrameLocks xmlns:a="http://schemas.openxmlformats.org/drawingml/2006/main" noChangeAspect="1"/>
+            </wp:cNvGraphicFramePr>
+            <a:graphic xmlns:a="http://schemas.openxmlformats.org/drawingml/2006/main">
+              <a:graphicData uri="http://schemas.openxmlformats.org/drawingml/2006/picture">
+                <pic:pic xmlns:pic="http://schemas.openxmlformats.org/drawingml/2006/picture">
+                  <pic:nvPicPr>
+                    <pic:cNvPr id="0" name="" descr=""/>
+                    <pic:cNvPicPr>
+                      <a:picLocks noChangeAspect="1" noChangeArrowheads="1"/>
+                    </pic:cNvPicPr>
+                  </pic:nvPicPr>
+                  <pic:blipFill>
+                    <a:blip r:embed="rId66" cstate="none"/>
+                    <a:srcRect/>
+                    <a:stretch>
+                      <a:fillRect/>
+                    </a:stretch>
+                  </pic:blipFill>
+                  <pic:spPr bwMode="auto">
+                    <a:xfrm>
+                      <a:off x="0" y="0"/>
+                      <a:ext cx="6115050" cy="2552700"/>
+                    </a:xfrm>
+                    <a:prstGeom prst="rect">
+                      <a:avLst/>
+                    </a:prstGeom>
+                  </pic:spPr>
+                </pic:pic>
+              </a:graphicData>
+            </a:graphic>
+          </wp:inline>
+        </w:drawing>
+      </w:r>
+    </w:p>
+    <w:p>
+      <w:pPr>
+        <w:spacing w:after="240"/>
+        <w:jc w:val="center"/>
+      </w:pPr>
+      <w:r>
+        <w:rPr>
+          <w:i/>
+          <w:iCs/>
+          <w:color w:val="6B6B6B"/>
+          <w:sz w:val="18"/>
+          <w:szCs w:val="18"/>
+        </w:rPr>
+        <w:t xml:space="preserve">A flying bird bagged at middle distance on a Pixel 7; the stats shrink to a small box with "More".</w:t>
+      </w:r>
+    </w:p>
+    <w:p>
+      <w:pPr>
         <w:pStyle w:val="Heading1"/>
         <w:pageBreakBefore/>
       </w:pPr>
@@ -10265,7 +10857,7 @@
                 <w:sz w:val="19"/>
                 <w:szCs w:val="19"/>
               </w:rPr>
-              <w:t xml:space="preserve">Next, straight after v1.3</w:t>
+              <w:t xml:space="preserve">Done: the Skietbaan on the admin page (#58)</w:t>
             </w:r>
           </w:p>
         </w:tc>
@@ -10764,7 +11356,7 @@
                 <w:sz w:val="19"/>
                 <w:szCs w:val="19"/>
               </w:rPr>
-              <w:t xml:space="preserve">Training ground (Skietbaan)</w:t>
+              <w:t xml:space="preserve">v1.4 Die Langloop + Namibië</w:t>
             </w:r>
           </w:p>
         </w:tc>
@@ -10795,7 +11387,7 @@
                 <w:sz w:val="19"/>
                 <w:szCs w:val="19"/>
               </w:rPr>
-              <w:t xml:space="preserve">Try every gun on targets and birds at near, middle, far and Ver distance; hit statistics and spread; from the admin page</w:t>
+              <w:t xml:space="preserve">A long rifle with a 3–9× scope; the Namibië area (Etosha salt pan with mirages, quiver trees, Namib dunes, a far waterhole); first the scoped drawing cost (issue #56)</w:t>
             </w:r>
           </w:p>
         </w:tc>
@@ -10857,136 +11449,7 @@
                 <w:sz w:val="19"/>
                 <w:szCs w:val="19"/>
               </w:rPr>
-              <w:t xml:space="preserve">3–4 h</w:t>
-            </w:r>
-          </w:p>
-        </w:tc>
-      </w:tr>
-      <w:tr>
-        <w:trPr>
-          <w:cantSplit/>
-        </w:trPr>
-        <w:tc>
-          <w:tcPr>
-            <w:tcW w:type="dxa" w:w="1927"/>
-            <w:tcBorders>
-              <w:top w:val="single" w:color="D8CBB0" w:sz="4"/>
-              <w:left w:val="single" w:color="D8CBB0" w:sz="4"/>
-              <w:bottom w:val="single" w:color="D8CBB0" w:sz="4"/>
-              <w:right w:val="single" w:color="D8CBB0" w:sz="4"/>
-            </w:tcBorders>
-            <w:tcMar>
-              <w:top w:type="dxa" w:w="60"/>
-              <w:left w:type="dxa" w:w="100"/>
-              <w:bottom w:type="dxa" w:w="60"/>
-              <w:right w:type="dxa" w:w="100"/>
-            </w:tcMar>
-          </w:tcPr>
-          <w:p>
-            <w:pPr>
-              <w:spacing w:line="252"/>
-            </w:pPr>
-            <w:r>
-              <w:rPr>
-                <w:b w:val="false"/>
-                <w:bCs w:val="false"/>
-                <w:sz w:val="19"/>
-                <w:szCs w:val="19"/>
-              </w:rPr>
-              <w:t xml:space="preserve">v1.4 Die Langloop + Namibië</w:t>
-            </w:r>
-          </w:p>
-        </w:tc>
-        <w:tc>
-          <w:tcPr>
-            <w:tcW w:type="dxa" w:w="5011"/>
-            <w:tcBorders>
-              <w:top w:val="single" w:color="D8CBB0" w:sz="4"/>
-              <w:left w:val="single" w:color="D8CBB0" w:sz="4"/>
-              <w:bottom w:val="single" w:color="D8CBB0" w:sz="4"/>
-              <w:right w:val="single" w:color="D8CBB0" w:sz="4"/>
-            </w:tcBorders>
-            <w:tcMar>
-              <w:top w:type="dxa" w:w="60"/>
-              <w:left w:type="dxa" w:w="100"/>
-              <w:bottom w:type="dxa" w:w="60"/>
-              <w:right w:type="dxa" w:w="100"/>
-            </w:tcMar>
-          </w:tcPr>
-          <w:p>
-            <w:pPr>
-              <w:spacing w:line="252"/>
-            </w:pPr>
-            <w:r>
-              <w:rPr>
-                <w:b w:val="false"/>
-                <w:bCs w:val="false"/>
-                <w:sz w:val="19"/>
-                <w:szCs w:val="19"/>
-              </w:rPr>
-              <w:t xml:space="preserve">A long rifle with a 3–9× scope; the Namibië area (Etosha salt pan with mirages, quiver trees, Namib dunes, a far waterhole); first the scoped drawing cost (issue #56)</w:t>
-            </w:r>
-          </w:p>
-        </w:tc>
-        <w:tc>
-          <w:tcPr>
-            <w:tcW w:type="dxa" w:w="963"/>
-            <w:tcBorders>
-              <w:top w:val="single" w:color="D8CBB0" w:sz="4"/>
-              <w:left w:val="single" w:color="D8CBB0" w:sz="4"/>
-              <w:bottom w:val="single" w:color="D8CBB0" w:sz="4"/>
-              <w:right w:val="single" w:color="D8CBB0" w:sz="4"/>
-            </w:tcBorders>
-            <w:tcMar>
-              <w:top w:type="dxa" w:w="60"/>
-              <w:left w:type="dxa" w:w="100"/>
-              <w:bottom w:type="dxa" w:w="60"/>
-              <w:right w:type="dxa" w:w="100"/>
-            </w:tcMar>
-          </w:tcPr>
-          <w:p>
-            <w:pPr>
-              <w:spacing w:line="252"/>
-            </w:pPr>
-            <w:r>
-              <w:rPr>
-                <w:b w:val="false"/>
-                <w:bCs w:val="false"/>
-                <w:sz w:val="19"/>
-                <w:szCs w:val="19"/>
-              </w:rPr>
-              <w:t xml:space="preserve">Tank</w:t>
-            </w:r>
-          </w:p>
-        </w:tc>
-        <w:tc>
-          <w:tcPr>
-            <w:tcW w:type="dxa" w:w="1737"/>
-            <w:tcBorders>
-              <w:top w:val="single" w:color="D8CBB0" w:sz="4"/>
-              <w:left w:val="single" w:color="D8CBB0" w:sz="4"/>
-              <w:bottom w:val="single" w:color="D8CBB0" w:sz="4"/>
-              <w:right w:val="single" w:color="D8CBB0" w:sz="4"/>
-            </w:tcBorders>
-            <w:tcMar>
-              <w:top w:type="dxa" w:w="60"/>
-              <w:left w:type="dxa" w:w="100"/>
-              <w:bottom w:type="dxa" w:w="60"/>
-              <w:right w:type="dxa" w:w="100"/>
-            </w:tcMar>
-          </w:tcPr>
-          <w:p>
-            <w:pPr>
-              <w:spacing w:line="252"/>
-            </w:pPr>
-            <w:r>
-              <w:rPr>
-                <w:b w:val="false"/>
-                <w:bCs w:val="false"/>
-                <w:sz w:val="19"/>
-                <w:szCs w:val="19"/>
-              </w:rPr>
-              <w:t xml:space="preserve">6–8 h</w:t>
+              <w:t xml:space="preserve">6–8 h (started 24 Oct, 05:40)</w:t>
             </w:r>
           </w:p>
         </w:tc>
@@ -12501,6 +12964,73 @@
           </w:p>
         </w:tc>
       </w:tr>
+      <w:tr>
+        <w:trPr>
+          <w:cantSplit/>
+        </w:trPr>
+        <w:tc>
+          <w:tcPr>
+            <w:tcW w:type="dxa" w:w="1734"/>
+            <w:tcBorders>
+              <w:top w:val="single" w:color="D8CBB0" w:sz="4"/>
+              <w:left w:val="single" w:color="D8CBB0" w:sz="4"/>
+              <w:bottom w:val="single" w:color="D8CBB0" w:sz="4"/>
+              <w:right w:val="single" w:color="D8CBB0" w:sz="4"/>
+            </w:tcBorders>
+            <w:tcMar>
+              <w:top w:type="dxa" w:w="60"/>
+              <w:left w:type="dxa" w:w="100"/>
+              <w:bottom w:type="dxa" w:w="60"/>
+              <w:right w:type="dxa" w:w="100"/>
+            </w:tcMar>
+          </w:tcPr>
+          <w:p>
+            <w:pPr>
+              <w:spacing w:line="252"/>
+            </w:pPr>
+            <w:r>
+              <w:rPr>
+                <w:b w:val="false"/>
+                <w:bCs w:val="false"/>
+                <w:sz w:val="19"/>
+                <w:szCs w:val="19"/>
+              </w:rPr>
+              <w:t xml:space="preserve">D-037</w:t>
+            </w:r>
+          </w:p>
+        </w:tc>
+        <w:tc>
+          <w:tcPr>
+            <w:tcW w:type="dxa" w:w="7904"/>
+            <w:tcBorders>
+              <w:top w:val="single" w:color="D8CBB0" w:sz="4"/>
+              <w:left w:val="single" w:color="D8CBB0" w:sz="4"/>
+              <w:bottom w:val="single" w:color="D8CBB0" w:sz="4"/>
+              <w:right w:val="single" w:color="D8CBB0" w:sz="4"/>
+            </w:tcBorders>
+            <w:tcMar>
+              <w:top w:type="dxa" w:w="60"/>
+              <w:left w:type="dxa" w:w="100"/>
+              <w:bottom w:type="dxa" w:w="60"/>
+              <w:right w:type="dxa" w:w="100"/>
+            </w:tcMar>
+          </w:tcPr>
+          <w:p>
+            <w:pPr>
+              <w:spacing w:line="252"/>
+            </w:pPr>
+            <w:r>
+              <w:rPr>
+                <w:b w:val="false"/>
+                <w:bCs w:val="false"/>
+                <w:sz w:val="19"/>
+                <w:szCs w:val="19"/>
+              </w:rPr>
+              <w:t xml:space="preserve">Training ground (Skietbaan): admin and test build only, never touches the save, left out of the content fingerprint</w:t>
+            </w:r>
+          </w:p>
+        </w:tc>
+      </w:tr>
     </w:tbl>
     <w:p>
       <w:pPr>
@@ -13328,7 +13858,7 @@
                 <w:sz w:val="19"/>
                 <w:szCs w:val="19"/>
               </w:rPr>
-              <w:t xml:space="preserve">Shooting range (the planned training ground)</w:t>
+              <w:t xml:space="preserve">Shooting range: the training ground on the admin page</w:t>
             </w:r>
           </w:p>
         </w:tc>

</xml_diff>

<commit_message>
docs(history): Training ground update stage (#61); board state
Adds the chapter for the mixed targets, steel plates and hit feedback
(#61, D-037 update) with four screenshots and the review notes, the
24 Oct request, and updated figures (618 commits, 971 unit tests).
Rebuilt the .docx.

Co-Authored-By: Claude Opus 5.5 <noreply@anthropic.com>
Claude-Session: https://claude.ai/code/session_01X9BKcABj5FscZbGJZnCiA3
</commit_message>
<xml_diff>
--- a/docs/history/Tarantal-Development-History.docx
+++ b/docs/history/Tarantal-Development-History.docx
@@ -141,7 +141,7 @@
           <w:sz w:val="20"/>
           <w:szCs w:val="20"/>
         </w:rPr>
-        <w:t xml:space="preserve">Last updated 24 October 2026, 05:50 UTC</w:t>
+        <w:t xml:space="preserve">Last updated 24 October 2026, 10:35 UTC</w:t>
       </w:r>
     </w:p>
     <w:p>
@@ -470,7 +470,7 @@
                 <w:sz w:val="19"/>
                 <w:szCs w:val="19"/>
               </w:rPr>
-              <w:t xml:space="preserve">596</w:t>
+              <w:t xml:space="preserve">618</w:t>
             </w:r>
           </w:p>
         </w:tc>
@@ -537,7 +537,7 @@
                 <w:sz w:val="19"/>
                 <w:szCs w:val="19"/>
               </w:rPr>
-              <w:t xml:space="preserve">56 opened, all merged</w:t>
+              <w:t xml:space="preserve">59 opened, 58 merged, 1 in progress (v1.4)</w:t>
             </w:r>
           </w:p>
         </w:tc>
@@ -604,7 +604,7 @@
                 <w:sz w:val="19"/>
                 <w:szCs w:val="19"/>
               </w:rPr>
-              <w:t xml:space="preserve">about 35,800 lines</w:t>
+              <w:t xml:space="preserve">about 37,000 lines</w:t>
             </w:r>
           </w:p>
         </w:tc>
@@ -671,7 +671,7 @@
                 <w:sz w:val="19"/>
                 <w:szCs w:val="19"/>
               </w:rPr>
-              <w:t xml:space="preserve">954 unit tests, 39 browser test suites on 3 device profiles</w:t>
+              <w:t xml:space="preserve">971 unit tests, 39 browser test suites on 3 device profiles</w:t>
             </w:r>
           </w:p>
         </w:tc>
@@ -4269,6 +4269,104 @@
           </w:p>
         </w:tc>
       </w:tr>
+      <w:tr>
+        <w:trPr>
+          <w:cantSplit/>
+        </w:trPr>
+        <w:tc>
+          <w:tcPr>
+            <w:tcW w:type="dxa" w:w="2698"/>
+            <w:tcBorders>
+              <w:top w:val="single" w:color="D8CBB0" w:sz="4"/>
+              <w:left w:val="single" w:color="D8CBB0" w:sz="4"/>
+              <w:bottom w:val="single" w:color="D8CBB0" w:sz="4"/>
+              <w:right w:val="single" w:color="D8CBB0" w:sz="4"/>
+            </w:tcBorders>
+            <w:tcMar>
+              <w:top w:type="dxa" w:w="60"/>
+              <w:left w:type="dxa" w:w="100"/>
+              <w:bottom w:type="dxa" w:w="60"/>
+              <w:right w:type="dxa" w:w="100"/>
+            </w:tcMar>
+          </w:tcPr>
+          <w:p>
+            <w:pPr>
+              <w:spacing w:line="252"/>
+            </w:pPr>
+            <w:r>
+              <w:rPr>
+                <w:b w:val="false"/>
+                <w:bCs w:val="false"/>
+                <w:sz w:val="19"/>
+                <w:szCs w:val="19"/>
+              </w:rPr>
+              <w:t xml:space="preserve">24 Oct 2026, 10:21 (asked for at 05:45)</w:t>
+            </w:r>
+          </w:p>
+        </w:tc>
+        <w:tc>
+          <w:tcPr>
+            <w:tcW w:type="dxa" w:w="4819"/>
+            <w:tcBorders>
+              <w:top w:val="single" w:color="D8CBB0" w:sz="4"/>
+              <w:left w:val="single" w:color="D8CBB0" w:sz="4"/>
+              <w:bottom w:val="single" w:color="D8CBB0" w:sz="4"/>
+              <w:right w:val="single" w:color="D8CBB0" w:sz="4"/>
+            </w:tcBorders>
+            <w:tcMar>
+              <w:top w:type="dxa" w:w="60"/>
+              <w:left w:type="dxa" w:w="100"/>
+              <w:bottom w:type="dxa" w:w="60"/>
+              <w:right w:type="dxa" w:w="100"/>
+            </w:tcMar>
+          </w:tcPr>
+          <w:p>
+            <w:pPr>
+              <w:spacing w:line="252"/>
+            </w:pPr>
+            <w:r>
+              <w:rPr>
+                <w:b w:val="false"/>
+                <w:bCs w:val="false"/>
+                <w:sz w:val="19"/>
+                <w:szCs w:val="19"/>
+              </w:rPr>
+              <w:t xml:space="preserve">Training ground update: mixed targets, steel plates, hit feedback</w:t>
+            </w:r>
+          </w:p>
+        </w:tc>
+        <w:tc>
+          <w:tcPr>
+            <w:tcW w:type="dxa" w:w="2121"/>
+            <w:tcBorders>
+              <w:top w:val="single" w:color="D8CBB0" w:sz="4"/>
+              <w:left w:val="single" w:color="D8CBB0" w:sz="4"/>
+              <w:bottom w:val="single" w:color="D8CBB0" w:sz="4"/>
+              <w:right w:val="single" w:color="D8CBB0" w:sz="4"/>
+            </w:tcBorders>
+            <w:tcMar>
+              <w:top w:type="dxa" w:w="60"/>
+              <w:left w:type="dxa" w:w="100"/>
+              <w:bottom w:type="dxa" w:w="60"/>
+              <w:right w:type="dxa" w:w="100"/>
+            </w:tcMar>
+          </w:tcPr>
+          <w:p>
+            <w:pPr>
+              <w:spacing w:line="252"/>
+            </w:pPr>
+            <w:r>
+              <w:rPr>
+                <w:b w:val="false"/>
+                <w:bCs w:val="false"/>
+                <w:sz w:val="19"/>
+                <w:szCs w:val="19"/>
+              </w:rPr>
+              <w:t xml:space="preserve">#61</w:t>
+            </w:r>
+          </w:p>
+        </w:tc>
+      </w:tr>
     </w:tbl>
     <w:p>
       <w:pPr>
@@ -9953,6 +10051,437 @@
     </w:p>
     <w:p>
       <w:pPr>
+        <w:pStyle w:val="Heading2"/>
+        <w:keepNext/>
+      </w:pPr>
+      <w:r>
+        <w:t xml:space="preserve">Training ground update: mixed targets, steel plates, hit feedback</w:t>
+      </w:r>
+    </w:p>
+    <w:p>
+      <w:pPr>
+        <w:spacing w:after="120"/>
+        <w:rPr>
+          <w:color w:val="6B6B6B"/>
+          <w:sz w:val="18"/>
+          <w:szCs w:val="18"/>
+        </w:rPr>
+      </w:pPr>
+      <w:r>
+        <w:rPr>
+          <w:color w:val="6B6B6B"/>
+          <w:sz w:val="18"/>
+          <w:szCs w:val="18"/>
+        </w:rPr>
+        <w:t xml:space="preserve">When: 24 Oct 2026, 10:21 (asked for at 05:45)   ·   Pull requests: #61   ·   Decision: D-037 (update 24 Oct)</w:t>
+      </w:r>
+    </w:p>
+    <w:p>
+      <w:pPr>
+        <w:spacing w:after="120" w:line="276"/>
+      </w:pPr>
+      <w:r>
+        <w:t xml:space="preserve">After the product owner played the training ground: more targets at once, every distance for every gun, and a clear reaction on every hit.</w:t>
+      </w:r>
+    </w:p>
+    <w:p>
+      <w:pPr>
+        <w:keepNext/>
+        <w:spacing w:after="80" w:before="160"/>
+      </w:pPr>
+      <w:r>
+        <w:rPr>
+          <w:b/>
+          <w:bCs/>
+          <w:color w:val="B7791F"/>
+          <w:sz w:val="20"/>
+          <w:szCs w:val="20"/>
+        </w:rPr>
+        <w:t xml:space="preserve">Look review and independent review before merging</w:t>
+      </w:r>
+    </w:p>
+    <w:p>
+      <w:pPr>
+        <w:pBdr>
+          <w:left w:val="single" w:color="B7791F" w:sz="18" w:space="8"/>
+        </w:pBdr>
+        <w:shd w:fill="F3ECDD" w:color="auto" w:val="clear"/>
+        <w:spacing w:after="0" w:before="60" w:line="264"/>
+        <w:ind w:left="240" w:right="120"/>
+      </w:pPr>
+      <w:r>
+        <w:rPr>
+          <w:sz w:val="20"/>
+          <w:szCs w:val="20"/>
+        </w:rPr>
+        <w:t xml:space="preserve">The first Tank job kept losing its connection to Claude mid-turn; a fresh job with a short brief finished the work.</w:t>
+      </w:r>
+    </w:p>
+    <w:p>
+      <w:pPr>
+        <w:pBdr>
+          <w:left w:val="single" w:color="B7791F" w:sz="18" w:space="8"/>
+        </w:pBdr>
+        <w:shd w:fill="F3ECDD" w:color="auto" w:val="clear"/>
+        <w:spacing w:after="160" w:before="0" w:line="264"/>
+        <w:ind w:left="240" w:right="120"/>
+      </w:pPr>
+      <w:r>
+        <w:rPr>
+          <w:sz w:val="20"/>
+          <w:szCs w:val="20"/>
+        </w:rPr>
+        <w:t xml:space="preserve">The independent review found that Kettie stones flew through paper targets and plates at near and middle distance, and that in about half of the mixed layouts a target stood behind a nearer one. Both were fixed: stones now stop on every target, the course was re-spaced, and a content check now rejects any layout where targets overlap. Rapid fire no longer floods the sound, and Shuffle always deals a new layout.</w:t>
+      </w:r>
+    </w:p>
+    <w:p>
+      <w:pPr>
+        <w:keepNext/>
+        <w:spacing w:after="80" w:before="160"/>
+      </w:pPr>
+      <w:r>
+        <w:rPr>
+          <w:b/>
+          <w:bCs/>
+          <w:color w:val="B7791F"/>
+          <w:sz w:val="20"/>
+          <w:szCs w:val="20"/>
+        </w:rPr>
+        <w:t xml:space="preserve">What it added</w:t>
+      </w:r>
+    </w:p>
+    <w:p>
+      <w:pPr>
+        <w:pStyle w:val="ListParagraph"/>
+        <w:numPr>
+          <w:ilvl w:val="0"/>
+          <w:numId w:val="2"/>
+        </w:numPr>
+        <w:spacing w:after="60" w:line="264"/>
+      </w:pPr>
+      <w:r>
+        <w:t xml:space="preserve">Mixed course: paper targets, steel plates, standing birds, a fly-over and a small flock at near, middle, far and Ver at the same time. Shuffle deals a new layout; the layout comes from the seed, so it is the same on every device.</w:t>
+      </w:r>
+    </w:p>
+    <w:p>
+      <w:pPr>
+        <w:pStyle w:val="ListParagraph"/>
+        <w:numPr>
+          <w:ilvl w:val="0"/>
+          <w:numId w:val="2"/>
+        </w:numPr>
+        <w:spacing w:after="60" w:line="264"/>
+      </w:pPr>
+      <w:r>
+        <w:t xml:space="preserve">Every distance for every gun: the Kettie or a shotgun can be tried at Ver. Their shots fall short as in a hunt and are counted as "fell short" in the stats.</w:t>
+      </w:r>
+    </w:p>
+    <w:p>
+      <w:pPr>
+        <w:pStyle w:val="ListParagraph"/>
+        <w:numPr>
+          <w:ilvl w:val="0"/>
+          <w:numId w:val="2"/>
+        </w:numPr>
+        <w:spacing w:after="60" w:line="264"/>
+      </w:pPr>
+      <w:r>
+        <w:t xml:space="preserve">Steel plates: a gong on a post that swings and rings when hit, easy to read at long range where paper holes are too small to see.</w:t>
+      </w:r>
+    </w:p>
+    <w:p>
+      <w:pPr>
+        <w:pStyle w:val="ListParagraph"/>
+        <w:numPr>
+          <w:ilvl w:val="0"/>
+          <w:numId w:val="2"/>
+        </w:numPr>
+        <w:spacing w:after="60" w:line="264"/>
+      </w:pPr>
+      <w:r>
+        <w:t xml:space="preserve">A reaction on every hit: paper blinks and thwacks, plates ring and swing, birds play a hit sound, and a HIT ring appears on the target, visible even at Ver without zooming. A miss shows a dust puff, or SHORT where the shot fell short.</w:t>
+      </w:r>
+    </w:p>
+    <w:p>
+      <w:pPr>
+        <w:pStyle w:val="ListParagraph"/>
+        <w:numPr>
+          <w:ilvl w:val="0"/>
+          <w:numId w:val="2"/>
+        </w:numPr>
+        <w:spacing w:after="60" w:line="264"/>
+      </w:pPr>
+      <w:r>
+        <w:t xml:space="preserve">Stats count each hit for the gun, distance and kind of target it struck, and each miss for the target nearest the aim.</w:t>
+      </w:r>
+    </w:p>
+    <w:p>
+      <w:pPr>
+        <w:pStyle w:val="ListParagraph"/>
+        <w:numPr>
+          <w:ilvl w:val="0"/>
+          <w:numId w:val="2"/>
+        </w:numPr>
+        <w:spacing w:after="60" w:line="264"/>
+      </w:pPr>
+      <w:r>
+        <w:t xml:space="preserve">First download +0.9 KB (2.94 MB of 3 MB); everything new loads with the training ground. 971 unit tests.</w:t>
+      </w:r>
+    </w:p>
+    <w:p>
+      <w:pPr>
+        <w:keepNext/>
+        <w:spacing w:after="60" w:before="160"/>
+        <w:jc w:val="center"/>
+      </w:pPr>
+      <w:r>
+        <w:drawing>
+          <wp:inline distT="0" distB="0" distL="0" distR="0">
+            <wp:extent cx="6115050" cy="3438525"/>
+            <wp:effectExtent t="0" r="0" b="0" l="0"/>
+            <wp:docPr id="1" name="" descr="" title=""/>
+            <wp:cNvGraphicFramePr>
+              <a:graphicFrameLocks xmlns:a="http://schemas.openxmlformats.org/drawingml/2006/main" noChangeAspect="1"/>
+            </wp:cNvGraphicFramePr>
+            <a:graphic xmlns:a="http://schemas.openxmlformats.org/drawingml/2006/main">
+              <a:graphicData uri="http://schemas.openxmlformats.org/drawingml/2006/picture">
+                <pic:pic xmlns:pic="http://schemas.openxmlformats.org/drawingml/2006/picture">
+                  <pic:nvPicPr>
+                    <pic:cNvPr id="0" name="" descr=""/>
+                    <pic:cNvPicPr>
+                      <a:picLocks noChangeAspect="1" noChangeArrowheads="1"/>
+                    </pic:cNvPicPr>
+                  </pic:nvPicPr>
+                  <pic:blipFill>
+                    <a:blip r:embed="rId67" cstate="none"/>
+                    <a:srcRect/>
+                    <a:stretch>
+                      <a:fillRect/>
+                    </a:stretch>
+                  </pic:blipFill>
+                  <pic:spPr bwMode="auto">
+                    <a:xfrm>
+                      <a:off x="0" y="0"/>
+                      <a:ext cx="6115050" cy="3438525"/>
+                    </a:xfrm>
+                    <a:prstGeom prst="rect">
+                      <a:avLst/>
+                    </a:prstGeom>
+                  </pic:spPr>
+                </pic:pic>
+              </a:graphicData>
+            </a:graphic>
+          </wp:inline>
+        </w:drawing>
+      </w:r>
+    </w:p>
+    <w:p>
+      <w:pPr>
+        <w:spacing w:after="240"/>
+        <w:jc w:val="center"/>
+      </w:pPr>
+      <w:r>
+        <w:rPr>
+          <w:i/>
+          <w:iCs/>
+          <w:color w:val="6B6B6B"/>
+          <w:sz w:val="18"/>
+          <w:szCs w:val="18"/>
+        </w:rPr>
+        <w:t xml:space="preserve">The mixed course: targets at all four distances at once (desktop, after the re-spacing).</w:t>
+      </w:r>
+    </w:p>
+    <w:p>
+      <w:pPr>
+        <w:keepNext/>
+        <w:spacing w:after="60" w:before="160"/>
+        <w:jc w:val="center"/>
+      </w:pPr>
+      <w:r>
+        <w:drawing>
+          <wp:inline distT="0" distB="0" distL="0" distR="0">
+            <wp:extent cx="6115050" cy="3438525"/>
+            <wp:effectExtent t="0" r="0" b="0" l="0"/>
+            <wp:docPr id="1" name="" descr="" title=""/>
+            <wp:cNvGraphicFramePr>
+              <a:graphicFrameLocks xmlns:a="http://schemas.openxmlformats.org/drawingml/2006/main" noChangeAspect="1"/>
+            </wp:cNvGraphicFramePr>
+            <a:graphic xmlns:a="http://schemas.openxmlformats.org/drawingml/2006/main">
+              <a:graphicData uri="http://schemas.openxmlformats.org/drawingml/2006/picture">
+                <pic:pic xmlns:pic="http://schemas.openxmlformats.org/drawingml/2006/picture">
+                  <pic:nvPicPr>
+                    <pic:cNvPr id="0" name="" descr=""/>
+                    <pic:cNvPicPr>
+                      <a:picLocks noChangeAspect="1" noChangeArrowheads="1"/>
+                    </pic:cNvPicPr>
+                  </pic:nvPicPr>
+                  <pic:blipFill>
+                    <a:blip r:embed="rId68" cstate="none"/>
+                    <a:srcRect/>
+                    <a:stretch>
+                      <a:fillRect/>
+                    </a:stretch>
+                  </pic:blipFill>
+                  <pic:spPr bwMode="auto">
+                    <a:xfrm>
+                      <a:off x="0" y="0"/>
+                      <a:ext cx="6115050" cy="3438525"/>
+                    </a:xfrm>
+                    <a:prstGeom prst="rect">
+                      <a:avLst/>
+                    </a:prstGeom>
+                  </pic:spPr>
+                </pic:pic>
+              </a:graphicData>
+            </a:graphic>
+          </wp:inline>
+        </w:drawing>
+      </w:r>
+    </w:p>
+    <w:p>
+      <w:pPr>
+        <w:spacing w:after="240"/>
+        <w:jc w:val="center"/>
+      </w:pPr>
+      <w:r>
+        <w:rPr>
+          <w:i/>
+          <w:iCs/>
+          <w:color w:val="6B6B6B"/>
+          <w:sz w:val="18"/>
+          <w:szCs w:val="18"/>
+        </w:rPr>
+        <w:t xml:space="preserve">A hit on a far paper target: the HIT ring and the stats for that distance.</w:t>
+      </w:r>
+    </w:p>
+    <w:p>
+      <w:pPr>
+        <w:keepNext/>
+        <w:spacing w:after="60" w:before="160"/>
+        <w:jc w:val="center"/>
+      </w:pPr>
+      <w:r>
+        <w:drawing>
+          <wp:inline distT="0" distB="0" distL="0" distR="0">
+            <wp:extent cx="6115050" cy="2771775"/>
+            <wp:effectExtent t="0" r="0" b="0" l="0"/>
+            <wp:docPr id="1" name="" descr="" title=""/>
+            <wp:cNvGraphicFramePr>
+              <a:graphicFrameLocks xmlns:a="http://schemas.openxmlformats.org/drawingml/2006/main" noChangeAspect="1"/>
+            </wp:cNvGraphicFramePr>
+            <a:graphic xmlns:a="http://schemas.openxmlformats.org/drawingml/2006/main">
+              <a:graphicData uri="http://schemas.openxmlformats.org/drawingml/2006/picture">
+                <pic:pic xmlns:pic="http://schemas.openxmlformats.org/drawingml/2006/picture">
+                  <pic:nvPicPr>
+                    <pic:cNvPr id="0" name="" descr=""/>
+                    <pic:cNvPicPr>
+                      <a:picLocks noChangeAspect="1" noChangeArrowheads="1"/>
+                    </pic:cNvPicPr>
+                  </pic:nvPicPr>
+                  <pic:blipFill>
+                    <a:blip r:embed="rId69" cstate="none"/>
+                    <a:srcRect/>
+                    <a:stretch>
+                      <a:fillRect/>
+                    </a:stretch>
+                  </pic:blipFill>
+                  <pic:spPr bwMode="auto">
+                    <a:xfrm>
+                      <a:off x="0" y="0"/>
+                      <a:ext cx="6115050" cy="2771775"/>
+                    </a:xfrm>
+                    <a:prstGeom prst="rect">
+                      <a:avLst/>
+                    </a:prstGeom>
+                  </pic:spPr>
+                </pic:pic>
+              </a:graphicData>
+            </a:graphic>
+          </wp:inline>
+        </w:drawing>
+      </w:r>
+    </w:p>
+    <w:p>
+      <w:pPr>
+        <w:spacing w:after="240"/>
+        <w:jc w:val="center"/>
+      </w:pPr>
+      <w:r>
+        <w:rPr>
+          <w:i/>
+          <w:iCs/>
+          <w:color w:val="6B6B6B"/>
+          <w:sz w:val="18"/>
+          <w:szCs w:val="18"/>
+        </w:rPr>
+        <w:t xml:space="preserve">A steel plate hit at middle distance on an iPhone 14 held sideways.</w:t>
+      </w:r>
+    </w:p>
+    <w:p>
+      <w:pPr>
+        <w:keepNext/>
+        <w:spacing w:after="60" w:before="160"/>
+        <w:jc w:val="center"/>
+      </w:pPr>
+      <w:r>
+        <w:drawing>
+          <wp:inline distT="0" distB="0" distL="0" distR="0">
+            <wp:extent cx="6115050" cy="2771775"/>
+            <wp:effectExtent t="0" r="0" b="0" l="0"/>
+            <wp:docPr id="1" name="" descr="" title=""/>
+            <wp:cNvGraphicFramePr>
+              <a:graphicFrameLocks xmlns:a="http://schemas.openxmlformats.org/drawingml/2006/main" noChangeAspect="1"/>
+            </wp:cNvGraphicFramePr>
+            <a:graphic xmlns:a="http://schemas.openxmlformats.org/drawingml/2006/main">
+              <a:graphicData uri="http://schemas.openxmlformats.org/drawingml/2006/picture">
+                <pic:pic xmlns:pic="http://schemas.openxmlformats.org/drawingml/2006/picture">
+                  <pic:nvPicPr>
+                    <pic:cNvPr id="0" name="" descr=""/>
+                    <pic:cNvPicPr>
+                      <a:picLocks noChangeAspect="1" noChangeArrowheads="1"/>
+                    </pic:cNvPicPr>
+                  </pic:nvPicPr>
+                  <pic:blipFill>
+                    <a:blip r:embed="rId70" cstate="none"/>
+                    <a:srcRect/>
+                    <a:stretch>
+                      <a:fillRect/>
+                    </a:stretch>
+                  </pic:blipFill>
+                  <pic:spPr bwMode="auto">
+                    <a:xfrm>
+                      <a:off x="0" y="0"/>
+                      <a:ext cx="6115050" cy="2771775"/>
+                    </a:xfrm>
+                    <a:prstGeom prst="rect">
+                      <a:avLst/>
+                    </a:prstGeom>
+                  </pic:spPr>
+                </pic:pic>
+              </a:graphicData>
+            </a:graphic>
+          </wp:inline>
+        </w:drawing>
+      </w:r>
+    </w:p>
+    <w:p>
+      <w:pPr>
+        <w:spacing w:after="240"/>
+        <w:jc w:val="center"/>
+      </w:pPr>
+      <w:r>
+        <w:rPr>
+          <w:i/>
+          <w:iCs/>
+          <w:color w:val="6B6B6B"/>
+          <w:sz w:val="18"/>
+          <w:szCs w:val="18"/>
+        </w:rPr>
+        <w:t xml:space="preserve">The Kettie at Ver: the stones fall short and each shot is marked SHORT.</w:t>
+      </w:r>
+    </w:p>
+    <w:p>
+      <w:pPr>
         <w:pStyle w:val="Heading1"/>
         <w:pageBreakBefore/>
       </w:pPr>
@@ -11152,6 +11681,104 @@
                 <w:szCs w:val="19"/>
               </w:rPr>
               <w:t xml:space="preserve">The build board and the status doc, refreshed every 2–3 hours and after each merge; v1.3 merged overnight</w:t>
+            </w:r>
+          </w:p>
+        </w:tc>
+      </w:tr>
+      <w:tr>
+        <w:trPr>
+          <w:cantSplit/>
+        </w:trPr>
+        <w:tc>
+          <w:tcPr>
+            <w:tcW w:type="dxa" w:w="1542"/>
+            <w:tcBorders>
+              <w:top w:val="single" w:color="D8CBB0" w:sz="4"/>
+              <w:left w:val="single" w:color="D8CBB0" w:sz="4"/>
+              <w:bottom w:val="single" w:color="D8CBB0" w:sz="4"/>
+              <w:right w:val="single" w:color="D8CBB0" w:sz="4"/>
+            </w:tcBorders>
+            <w:tcMar>
+              <w:top w:type="dxa" w:w="60"/>
+              <w:left w:type="dxa" w:w="100"/>
+              <w:bottom w:type="dxa" w:w="60"/>
+              <w:right w:type="dxa" w:w="100"/>
+            </w:tcMar>
+          </w:tcPr>
+          <w:p>
+            <w:pPr>
+              <w:spacing w:line="252"/>
+            </w:pPr>
+            <w:r>
+              <w:rPr>
+                <w:b w:val="false"/>
+                <w:bCs w:val="false"/>
+                <w:sz w:val="19"/>
+                <w:szCs w:val="19"/>
+              </w:rPr>
+              <w:t xml:space="preserve">24 Oct, 05:45</w:t>
+            </w:r>
+          </w:p>
+        </w:tc>
+        <w:tc>
+          <w:tcPr>
+            <w:tcW w:type="dxa" w:w="4433"/>
+            <w:tcBorders>
+              <w:top w:val="single" w:color="D8CBB0" w:sz="4"/>
+              <w:left w:val="single" w:color="D8CBB0" w:sz="4"/>
+              <w:bottom w:val="single" w:color="D8CBB0" w:sz="4"/>
+              <w:right w:val="single" w:color="D8CBB0" w:sz="4"/>
+            </w:tcBorders>
+            <w:tcMar>
+              <w:top w:type="dxa" w:w="60"/>
+              <w:left w:type="dxa" w:w="100"/>
+              <w:bottom w:type="dxa" w:w="60"/>
+              <w:right w:type="dxa" w:w="100"/>
+            </w:tcMar>
+          </w:tcPr>
+          <w:p>
+            <w:pPr>
+              <w:spacing w:line="252"/>
+            </w:pPr>
+            <w:r>
+              <w:rPr>
+                <w:b w:val="false"/>
+                <w:bCs w:val="false"/>
+                <w:sz w:val="19"/>
+                <w:szCs w:val="19"/>
+              </w:rPr>
+              <w:t xml:space="preserve">More targets in the training ground: mixed targets at all distances, every distance for every gun, a sound or blink on every hit</w:t>
+            </w:r>
+          </w:p>
+        </w:tc>
+        <w:tc>
+          <w:tcPr>
+            <w:tcW w:type="dxa" w:w="3663"/>
+            <w:tcBorders>
+              <w:top w:val="single" w:color="D8CBB0" w:sz="4"/>
+              <w:left w:val="single" w:color="D8CBB0" w:sz="4"/>
+              <w:bottom w:val="single" w:color="D8CBB0" w:sz="4"/>
+              <w:right w:val="single" w:color="D8CBB0" w:sz="4"/>
+            </w:tcBorders>
+            <w:tcMar>
+              <w:top w:type="dxa" w:w="60"/>
+              <w:left w:type="dxa" w:w="100"/>
+              <w:bottom w:type="dxa" w:w="60"/>
+              <w:right w:type="dxa" w:w="100"/>
+            </w:tcMar>
+          </w:tcPr>
+          <w:p>
+            <w:pPr>
+              <w:spacing w:line="252"/>
+            </w:pPr>
+            <w:r>
+              <w:rPr>
+                <w:b w:val="false"/>
+                <w:bCs w:val="false"/>
+                <w:sz w:val="19"/>
+                <w:szCs w:val="19"/>
+              </w:rPr>
+              <w:t xml:space="preserve">Done (#61), with screenshots sent at the merge</w:t>
             </w:r>
           </w:p>
         </w:tc>

</xml_diff>